<commit_message>
feat(new cli command): localize. Wonder why I haven't added it before. Also minor updates when adaptive roi region of interest is off the the DPI scale is ignored completely to the state that even minor artifacts are localized as stamp
</commit_message>
<xml_diff>
--- a/Papers/Otchyot.docx
+++ b/Papers/Otchyot.docx
@@ -29,7 +29,7 @@
         <w:p>
           <w:pPr>
             <w:pStyle w:val="ad"/>
-            <w:spacing w:line="360" w:lineRule="auto"/>
+            <w:spacing w:before="0" w:line="360" w:lineRule="auto"/>
             <w:jc w:val="center"/>
             <w:rPr>
               <w:rFonts w:ascii="Times New Roman" w:hAnsi="Times New Roman" w:cs="Times New Roman"/>
@@ -55,12 +55,16 @@
         </w:p>
         <w:p>
           <w:pPr>
-            <w:spacing w:line="360" w:lineRule="auto"/>
+            <w:spacing w:after="0" w:line="360" w:lineRule="auto"/>
           </w:pPr>
         </w:p>
         <w:p>
           <w:pPr>
             <w:pStyle w:val="11"/>
+            <w:tabs>
+              <w:tab w:val="clear" w:pos="9350"/>
+              <w:tab w:val="right" w:leader="dot" w:pos="9923"/>
+            </w:tabs>
             <w:spacing w:after="0" w:line="360" w:lineRule="auto"/>
             <w:rPr>
               <w:kern w:val="2"/>
@@ -164,7 +168,7 @@
               <w:rPr>
                 <w:webHidden/>
               </w:rPr>
-              <w:t>2</w:t>
+              <w:t>7</w:t>
             </w:r>
             <w:r>
               <w:rPr>
@@ -177,6 +181,10 @@
         <w:p>
           <w:pPr>
             <w:pStyle w:val="11"/>
+            <w:tabs>
+              <w:tab w:val="clear" w:pos="9350"/>
+              <w:tab w:val="right" w:leader="dot" w:pos="9923"/>
+            </w:tabs>
             <w:spacing w:after="0" w:line="360" w:lineRule="auto"/>
             <w:rPr>
               <w:kern w:val="2"/>
@@ -223,7 +231,7 @@
               <w:rPr>
                 <w:webHidden/>
               </w:rPr>
-              <w:t>3</w:t>
+              <w:t>8</w:t>
             </w:r>
             <w:r>
               <w:rPr>
@@ -236,6 +244,10 @@
         <w:p>
           <w:pPr>
             <w:pStyle w:val="11"/>
+            <w:tabs>
+              <w:tab w:val="clear" w:pos="9350"/>
+              <w:tab w:val="right" w:leader="dot" w:pos="9923"/>
+            </w:tabs>
             <w:spacing w:after="0" w:line="360" w:lineRule="auto"/>
             <w:rPr>
               <w:kern w:val="2"/>
@@ -282,7 +294,7 @@
               <w:rPr>
                 <w:webHidden/>
               </w:rPr>
-              <w:t>5</w:t>
+              <w:t>10</w:t>
             </w:r>
             <w:r>
               <w:rPr>
@@ -296,7 +308,7 @@
           <w:pPr>
             <w:pStyle w:val="23"/>
             <w:tabs>
-              <w:tab w:val="right" w:leader="dot" w:pos="9350"/>
+              <w:tab w:val="right" w:leader="dot" w:pos="9923"/>
             </w:tabs>
             <w:spacing w:after="0" w:line="360" w:lineRule="auto"/>
             <w:rPr>
@@ -377,7 +389,7 @@
                 <w:sz w:val="28"/>
                 <w:szCs w:val="28"/>
               </w:rPr>
-              <w:t>5</w:t>
+              <w:t>10</w:t>
             </w:r>
             <w:r>
               <w:rPr>
@@ -395,7 +407,7 @@
           <w:pPr>
             <w:pStyle w:val="23"/>
             <w:tabs>
-              <w:tab w:val="right" w:leader="dot" w:pos="9350"/>
+              <w:tab w:val="right" w:leader="dot" w:pos="9923"/>
             </w:tabs>
             <w:spacing w:after="0" w:line="360" w:lineRule="auto"/>
             <w:rPr>
@@ -476,7 +488,7 @@
                 <w:sz w:val="28"/>
                 <w:szCs w:val="28"/>
               </w:rPr>
-              <w:t>5</w:t>
+              <w:t>10</w:t>
             </w:r>
             <w:r>
               <w:rPr>
@@ -493,6 +505,10 @@
         <w:p>
           <w:pPr>
             <w:pStyle w:val="11"/>
+            <w:tabs>
+              <w:tab w:val="clear" w:pos="9350"/>
+              <w:tab w:val="right" w:leader="dot" w:pos="9923"/>
+            </w:tabs>
             <w:spacing w:after="0" w:line="360" w:lineRule="auto"/>
             <w:rPr>
               <w:kern w:val="2"/>
@@ -539,7 +555,7 @@
               <w:rPr>
                 <w:webHidden/>
               </w:rPr>
-              <w:t>6</w:t>
+              <w:t>11</w:t>
             </w:r>
             <w:r>
               <w:rPr>
@@ -553,7 +569,7 @@
           <w:pPr>
             <w:pStyle w:val="23"/>
             <w:tabs>
-              <w:tab w:val="right" w:leader="dot" w:pos="9350"/>
+              <w:tab w:val="right" w:leader="dot" w:pos="9923"/>
             </w:tabs>
             <w:spacing w:after="0" w:line="360" w:lineRule="auto"/>
             <w:rPr>
@@ -634,7 +650,7 @@
                 <w:sz w:val="28"/>
                 <w:szCs w:val="28"/>
               </w:rPr>
-              <w:t>6</w:t>
+              <w:t>11</w:t>
             </w:r>
             <w:r>
               <w:rPr>
@@ -652,7 +668,7 @@
           <w:pPr>
             <w:pStyle w:val="23"/>
             <w:tabs>
-              <w:tab w:val="right" w:leader="dot" w:pos="9350"/>
+              <w:tab w:val="right" w:leader="dot" w:pos="9923"/>
             </w:tabs>
             <w:spacing w:after="0" w:line="360" w:lineRule="auto"/>
             <w:rPr>
@@ -733,7 +749,7 @@
                 <w:sz w:val="28"/>
                 <w:szCs w:val="28"/>
               </w:rPr>
-              <w:t>7</w:t>
+              <w:t>12</w:t>
             </w:r>
             <w:r>
               <w:rPr>
@@ -751,7 +767,7 @@
           <w:pPr>
             <w:pStyle w:val="23"/>
             <w:tabs>
-              <w:tab w:val="right" w:leader="dot" w:pos="9350"/>
+              <w:tab w:val="right" w:leader="dot" w:pos="9923"/>
             </w:tabs>
             <w:spacing w:after="0" w:line="360" w:lineRule="auto"/>
             <w:rPr>
@@ -832,7 +848,7 @@
                 <w:sz w:val="28"/>
                 <w:szCs w:val="28"/>
               </w:rPr>
-              <w:t>9</w:t>
+              <w:t>14</w:t>
             </w:r>
             <w:r>
               <w:rPr>
@@ -849,6 +865,10 @@
         <w:p>
           <w:pPr>
             <w:pStyle w:val="11"/>
+            <w:tabs>
+              <w:tab w:val="clear" w:pos="9350"/>
+              <w:tab w:val="right" w:leader="dot" w:pos="9923"/>
+            </w:tabs>
             <w:spacing w:after="0" w:line="360" w:lineRule="auto"/>
             <w:rPr>
               <w:kern w:val="2"/>
@@ -896,7 +916,7 @@
               <w:rPr>
                 <w:webHidden/>
               </w:rPr>
-              <w:t>14</w:t>
+              <w:t>19</w:t>
             </w:r>
             <w:r>
               <w:rPr>
@@ -909,6 +929,10 @@
         <w:p>
           <w:pPr>
             <w:pStyle w:val="11"/>
+            <w:tabs>
+              <w:tab w:val="clear" w:pos="9350"/>
+              <w:tab w:val="right" w:leader="dot" w:pos="9923"/>
+            </w:tabs>
             <w:spacing w:after="0" w:line="360" w:lineRule="auto"/>
             <w:rPr>
               <w:kern w:val="2"/>
@@ -956,7 +980,7 @@
               <w:rPr>
                 <w:webHidden/>
               </w:rPr>
-              <w:t>16</w:t>
+              <w:t>21</w:t>
             </w:r>
             <w:r>
               <w:rPr>
@@ -969,6 +993,10 @@
         <w:p>
           <w:pPr>
             <w:pStyle w:val="11"/>
+            <w:tabs>
+              <w:tab w:val="clear" w:pos="9350"/>
+              <w:tab w:val="right" w:leader="dot" w:pos="9923"/>
+            </w:tabs>
             <w:spacing w:after="0" w:line="360" w:lineRule="auto"/>
             <w:rPr>
               <w:kern w:val="2"/>
@@ -1015,7 +1043,7 @@
               <w:rPr>
                 <w:webHidden/>
               </w:rPr>
-              <w:t>16</w:t>
+              <w:t>21</w:t>
             </w:r>
             <w:r>
               <w:rPr>
@@ -1028,6 +1056,10 @@
         <w:p>
           <w:pPr>
             <w:pStyle w:val="11"/>
+            <w:tabs>
+              <w:tab w:val="clear" w:pos="9350"/>
+              <w:tab w:val="right" w:leader="dot" w:pos="9923"/>
+            </w:tabs>
             <w:spacing w:after="0" w:line="360" w:lineRule="auto"/>
             <w:rPr>
               <w:kern w:val="2"/>
@@ -1075,7 +1107,7 @@
               <w:rPr>
                 <w:webHidden/>
               </w:rPr>
-              <w:t>18</w:t>
+              <w:t>23</w:t>
             </w:r>
             <w:r>
               <w:rPr>
@@ -1088,6 +1120,10 @@
         <w:p>
           <w:pPr>
             <w:pStyle w:val="11"/>
+            <w:tabs>
+              <w:tab w:val="clear" w:pos="9350"/>
+              <w:tab w:val="right" w:leader="dot" w:pos="9923"/>
+            </w:tabs>
             <w:spacing w:after="0" w:line="360" w:lineRule="auto"/>
             <w:rPr>
               <w:kern w:val="2"/>
@@ -1135,7 +1171,7 @@
               <w:rPr>
                 <w:webHidden/>
               </w:rPr>
-              <w:t>23</w:t>
+              <w:t>27</w:t>
             </w:r>
             <w:r>
               <w:rPr>
@@ -1195,7 +1231,7 @@
     <w:p>
       <w:pPr>
         <w:pStyle w:val="12"/>
-        <w:spacing w:line="360" w:lineRule="auto"/>
+        <w:spacing w:before="0" w:after="0" w:line="360" w:lineRule="auto"/>
         <w:jc w:val="center"/>
         <w:rPr>
           <w:b/>
@@ -1220,8 +1256,8 @@
         <w:tblLook w:val="04A0" w:firstRow="1" w:lastRow="0" w:firstColumn="1" w:lastColumn="0" w:noHBand="0" w:noVBand="1"/>
       </w:tblPr>
       <w:tblGrid>
-        <w:gridCol w:w="2515"/>
-        <w:gridCol w:w="6835"/>
+        <w:gridCol w:w="2479"/>
+        <w:gridCol w:w="7150"/>
       </w:tblGrid>
       <w:tr>
         <w:trPr>
@@ -1260,7 +1296,7 @@
         </w:tc>
         <w:tc>
           <w:tcPr>
-            <w:tcW w:w="6835" w:type="dxa"/>
+            <w:tcW w:w="7403" w:type="dxa"/>
             <w:vAlign w:val="center"/>
           </w:tcPr>
           <w:p>
@@ -1322,7 +1358,7 @@
         </w:tc>
         <w:tc>
           <w:tcPr>
-            <w:tcW w:w="6835" w:type="dxa"/>
+            <w:tcW w:w="7403" w:type="dxa"/>
             <w:vAlign w:val="center"/>
           </w:tcPr>
           <w:p>
@@ -1404,7 +1440,7 @@
         </w:tc>
         <w:tc>
           <w:tcPr>
-            <w:tcW w:w="6835" w:type="dxa"/>
+            <w:tcW w:w="7403" w:type="dxa"/>
             <w:vAlign w:val="center"/>
           </w:tcPr>
           <w:p>
@@ -1543,7 +1579,7 @@
         </w:tc>
         <w:tc>
           <w:tcPr>
-            <w:tcW w:w="6835" w:type="dxa"/>
+            <w:tcW w:w="7403" w:type="dxa"/>
             <w:vAlign w:val="center"/>
           </w:tcPr>
           <w:p>
@@ -1687,7 +1723,7 @@
         </w:tc>
         <w:tc>
           <w:tcPr>
-            <w:tcW w:w="6835" w:type="dxa"/>
+            <w:tcW w:w="7403" w:type="dxa"/>
             <w:vAlign w:val="center"/>
           </w:tcPr>
           <w:p>
@@ -1853,7 +1889,7 @@
         </w:tc>
         <w:tc>
           <w:tcPr>
-            <w:tcW w:w="6835" w:type="dxa"/>
+            <w:tcW w:w="7403" w:type="dxa"/>
             <w:vAlign w:val="center"/>
           </w:tcPr>
           <w:p>
@@ -1953,7 +1989,7 @@
         </w:tc>
         <w:tc>
           <w:tcPr>
-            <w:tcW w:w="6835" w:type="dxa"/>
+            <w:tcW w:w="7403" w:type="dxa"/>
             <w:vAlign w:val="center"/>
           </w:tcPr>
           <w:p>
@@ -2047,7 +2083,7 @@
         </w:tc>
         <w:tc>
           <w:tcPr>
-            <w:tcW w:w="6835" w:type="dxa"/>
+            <w:tcW w:w="7403" w:type="dxa"/>
             <w:vAlign w:val="center"/>
           </w:tcPr>
           <w:p>
@@ -2106,7 +2142,7 @@
         </w:tc>
         <w:tc>
           <w:tcPr>
-            <w:tcW w:w="6835" w:type="dxa"/>
+            <w:tcW w:w="7403" w:type="dxa"/>
             <w:vAlign w:val="center"/>
           </w:tcPr>
           <w:p>
@@ -2165,7 +2201,7 @@
         </w:tc>
         <w:tc>
           <w:tcPr>
-            <w:tcW w:w="6835" w:type="dxa"/>
+            <w:tcW w:w="7403" w:type="dxa"/>
             <w:vAlign w:val="center"/>
           </w:tcPr>
           <w:p>
@@ -2241,7 +2277,7 @@
         </w:tc>
         <w:tc>
           <w:tcPr>
-            <w:tcW w:w="6835" w:type="dxa"/>
+            <w:tcW w:w="7403" w:type="dxa"/>
             <w:vAlign w:val="center"/>
           </w:tcPr>
           <w:p>
@@ -2317,7 +2353,7 @@
         </w:tc>
         <w:tc>
           <w:tcPr>
-            <w:tcW w:w="6835" w:type="dxa"/>
+            <w:tcW w:w="7403" w:type="dxa"/>
             <w:vAlign w:val="center"/>
           </w:tcPr>
           <w:p>
@@ -2376,7 +2412,7 @@
         </w:tc>
         <w:tc>
           <w:tcPr>
-            <w:tcW w:w="6835" w:type="dxa"/>
+            <w:tcW w:w="7403" w:type="dxa"/>
             <w:vAlign w:val="center"/>
           </w:tcPr>
           <w:p>
@@ -2435,7 +2471,7 @@
         </w:tc>
         <w:tc>
           <w:tcPr>
-            <w:tcW w:w="6835" w:type="dxa"/>
+            <w:tcW w:w="7403" w:type="dxa"/>
             <w:vAlign w:val="center"/>
           </w:tcPr>
           <w:p>
@@ -2461,7 +2497,78 @@
           </w:p>
         </w:tc>
       </w:tr>
+      <w:tr>
+        <w:trPr>
+          <w:trHeight w:val="720"/>
+        </w:trPr>
+        <w:tc>
+          <w:tcPr>
+            <w:tcW w:w="2515" w:type="dxa"/>
+            <w:vAlign w:val="center"/>
+          </w:tcPr>
+          <w:p>
+            <w:pPr>
+              <w:ind w:firstLine="25"/>
+              <w:jc w:val="center"/>
+              <w:rPr>
+                <w:rFonts w:ascii="Times New Roman" w:hAnsi="Times New Roman" w:cs="Times New Roman"/>
+                <w:sz w:val="28"/>
+                <w:szCs w:val="28"/>
+                <w:lang w:val="ru-RU"/>
+              </w:rPr>
+            </w:pPr>
+            <w:r>
+              <w:rPr>
+                <w:rFonts w:ascii="Times New Roman" w:hAnsi="Times New Roman" w:cs="Times New Roman"/>
+                <w:sz w:val="28"/>
+                <w:szCs w:val="28"/>
+                <w:lang w:val="ru-RU"/>
+              </w:rPr>
+              <w:t>СЭД</w:t>
+            </w:r>
+          </w:p>
+        </w:tc>
+        <w:tc>
+          <w:tcPr>
+            <w:tcW w:w="7403" w:type="dxa"/>
+            <w:vAlign w:val="center"/>
+          </w:tcPr>
+          <w:p>
+            <w:pPr>
+              <w:ind w:firstLine="25"/>
+              <w:jc w:val="center"/>
+              <w:rPr>
+                <w:rFonts w:ascii="Times New Roman" w:hAnsi="Times New Roman" w:cs="Times New Roman"/>
+                <w:sz w:val="28"/>
+                <w:szCs w:val="28"/>
+                <w:lang w:val="ru-RU"/>
+              </w:rPr>
+            </w:pPr>
+            <w:r>
+              <w:rPr>
+                <w:rFonts w:ascii="Times New Roman" w:hAnsi="Times New Roman" w:cs="Times New Roman"/>
+                <w:sz w:val="28"/>
+                <w:szCs w:val="28"/>
+                <w:lang w:val="ru-RU"/>
+              </w:rPr>
+              <w:t>Система электронного документооборота</w:t>
+            </w:r>
+          </w:p>
+        </w:tc>
+      </w:tr>
     </w:tbl>
+    <w:p>
+      <w:pPr>
+        <w:spacing w:after="0" w:line="360" w:lineRule="auto"/>
+        <w:ind w:firstLine="709"/>
+        <w:rPr>
+          <w:rFonts w:ascii="Times New Roman" w:hAnsi="Times New Roman" w:cs="Times New Roman"/>
+          <w:sz w:val="28"/>
+          <w:szCs w:val="28"/>
+          <w:lang w:val="ru-RU"/>
+        </w:rPr>
+      </w:pPr>
+    </w:p>
     <w:p>
       <w:pPr>
         <w:spacing w:line="360" w:lineRule="auto"/>
@@ -2473,18 +2580,6 @@
           <w:lang w:val="ru-RU"/>
         </w:rPr>
       </w:pPr>
-    </w:p>
-    <w:p>
-      <w:pPr>
-        <w:spacing w:line="360" w:lineRule="auto"/>
-        <w:ind w:firstLine="709"/>
-        <w:rPr>
-          <w:rFonts w:ascii="Times New Roman" w:hAnsi="Times New Roman" w:cs="Times New Roman"/>
-          <w:sz w:val="28"/>
-          <w:szCs w:val="28"/>
-          <w:lang w:val="ru-RU"/>
-        </w:rPr>
-      </w:pPr>
       <w:r>
         <w:rPr>
           <w:rFonts w:ascii="Times New Roman" w:hAnsi="Times New Roman" w:cs="Times New Roman"/>
@@ -2498,7 +2593,7 @@
     <w:p>
       <w:pPr>
         <w:pStyle w:val="12"/>
-        <w:spacing w:line="360" w:lineRule="auto"/>
+        <w:spacing w:before="0" w:after="0" w:line="360" w:lineRule="auto"/>
         <w:jc w:val="center"/>
         <w:rPr>
           <w:b/>
@@ -2518,7 +2613,7 @@
     </w:p>
     <w:p>
       <w:pPr>
-        <w:spacing w:line="360" w:lineRule="auto"/>
+        <w:spacing w:after="0" w:line="360" w:lineRule="auto"/>
         <w:ind w:firstLine="709"/>
         <w:jc w:val="both"/>
         <w:rPr>
@@ -2594,7 +2689,7 @@
     </w:p>
     <w:p>
       <w:pPr>
-        <w:spacing w:line="360" w:lineRule="auto"/>
+        <w:spacing w:after="0" w:line="360" w:lineRule="auto"/>
         <w:ind w:firstLine="709"/>
         <w:jc w:val="both"/>
         <w:rPr>
@@ -2634,7 +2729,7 @@
     </w:p>
     <w:p>
       <w:pPr>
-        <w:spacing w:line="360" w:lineRule="auto"/>
+        <w:spacing w:after="0" w:line="360" w:lineRule="auto"/>
         <w:ind w:firstLine="709"/>
         <w:jc w:val="both"/>
         <w:rPr>
@@ -2674,7 +2769,7 @@
     </w:p>
     <w:p>
       <w:pPr>
-        <w:spacing w:line="360" w:lineRule="auto"/>
+        <w:spacing w:after="0" w:line="360" w:lineRule="auto"/>
         <w:ind w:firstLine="709"/>
         <w:jc w:val="both"/>
         <w:rPr>
@@ -2735,7 +2830,7 @@
         <w:tabs>
           <w:tab w:val="left" w:pos="993"/>
         </w:tabs>
-        <w:spacing w:line="360" w:lineRule="auto"/>
+        <w:spacing w:after="0" w:line="360" w:lineRule="auto"/>
         <w:ind w:firstLine="709"/>
         <w:jc w:val="both"/>
         <w:rPr>
@@ -2786,6 +2881,7 @@
           <w:rFonts w:ascii="Times New Roman" w:hAnsi="Times New Roman" w:cs="Times New Roman"/>
           <w:sz w:val="28"/>
           <w:szCs w:val="28"/>
+          <w:lang w:val="ru-RU"/>
         </w:rPr>
         <w:br/>
       </w:r>
@@ -2906,7 +3002,7 @@
         <w:tabs>
           <w:tab w:val="left" w:pos="993"/>
         </w:tabs>
-        <w:spacing w:line="360" w:lineRule="auto"/>
+        <w:spacing w:after="0" w:line="360" w:lineRule="auto"/>
         <w:ind w:firstLine="709"/>
         <w:jc w:val="both"/>
         <w:rPr>
@@ -2923,7 +3019,6 @@
           <w:szCs w:val="28"/>
           <w:lang w:val="ru-RU"/>
         </w:rPr>
-        <w:lastRenderedPageBreak/>
         <w:t>2.</w:t>
       </w:r>
       <w:r>
@@ -2950,7 +3045,7 @@
         <w:tabs>
           <w:tab w:val="left" w:pos="993"/>
         </w:tabs>
-        <w:spacing w:line="360" w:lineRule="auto"/>
+        <w:spacing w:after="0" w:line="360" w:lineRule="auto"/>
         <w:ind w:firstLine="709"/>
         <w:jc w:val="both"/>
         <w:rPr>
@@ -2967,6 +3062,7 @@
           <w:szCs w:val="28"/>
           <w:lang w:val="ru-RU"/>
         </w:rPr>
+        <w:lastRenderedPageBreak/>
         <w:t>3.</w:t>
       </w:r>
       <w:r>
@@ -3046,7 +3142,7 @@
         <w:tabs>
           <w:tab w:val="left" w:pos="993"/>
         </w:tabs>
-        <w:spacing w:line="360" w:lineRule="auto"/>
+        <w:spacing w:after="0" w:line="360" w:lineRule="auto"/>
         <w:ind w:firstLine="709"/>
         <w:jc w:val="both"/>
         <w:rPr>
@@ -3098,7 +3194,7 @@
         <w:tabs>
           <w:tab w:val="left" w:pos="993"/>
         </w:tabs>
-        <w:spacing w:line="360" w:lineRule="auto"/>
+        <w:spacing w:after="0" w:line="360" w:lineRule="auto"/>
         <w:ind w:firstLine="709"/>
         <w:jc w:val="both"/>
         <w:rPr>
@@ -3147,7 +3243,7 @@
     </w:p>
     <w:p>
       <w:pPr>
-        <w:spacing w:line="360" w:lineRule="auto"/>
+        <w:spacing w:after="0" w:line="360" w:lineRule="auto"/>
         <w:ind w:firstLine="709"/>
         <w:jc w:val="both"/>
         <w:rPr>
@@ -3181,12 +3277,30 @@
           <w:szCs w:val="28"/>
           <w:lang w:val="ru-RU"/>
         </w:rPr>
-        <w:t>-библиотек, экспериментальное тестирование, анализ результатов.</w:t>
-      </w:r>
-    </w:p>
-    <w:p>
-      <w:pPr>
-        <w:spacing w:line="360" w:lineRule="auto"/>
+        <w:t>-библиотек, экспериментальное</w:t>
+      </w:r>
+      <w:r>
+        <w:rPr>
+          <w:rFonts w:ascii="Times New Roman" w:hAnsi="Times New Roman" w:cs="Times New Roman"/>
+          <w:sz w:val="28"/>
+          <w:szCs w:val="28"/>
+          <w:lang w:val="ru-RU"/>
+        </w:rPr>
+        <w:t xml:space="preserve"> </w:t>
+      </w:r>
+      <w:r>
+        <w:rPr>
+          <w:rFonts w:ascii="Times New Roman" w:hAnsi="Times New Roman" w:cs="Times New Roman"/>
+          <w:sz w:val="28"/>
+          <w:szCs w:val="28"/>
+          <w:lang w:val="ru-RU"/>
+        </w:rPr>
+        <w:t>тестирование, анализ результатов.</w:t>
+      </w:r>
+    </w:p>
+    <w:p>
+      <w:pPr>
+        <w:spacing w:after="0" w:line="360" w:lineRule="auto"/>
         <w:ind w:firstLine="709"/>
         <w:rPr>
           <w:rFonts w:ascii="Times New Roman" w:hAnsi="Times New Roman" w:cs="Times New Roman"/>
@@ -3198,7 +3312,7 @@
     </w:p>
     <w:p>
       <w:pPr>
-        <w:spacing w:line="360" w:lineRule="auto"/>
+        <w:spacing w:after="0" w:line="360" w:lineRule="auto"/>
         <w:ind w:firstLine="709"/>
         <w:rPr>
           <w:rFonts w:ascii="Times New Roman" w:eastAsiaTheme="majorEastAsia" w:hAnsi="Times New Roman" w:cs="Times New Roman"/>
@@ -3223,7 +3337,7 @@
     <w:p>
       <w:pPr>
         <w:pStyle w:val="12"/>
-        <w:spacing w:line="360" w:lineRule="auto"/>
+        <w:spacing w:before="0" w:after="0" w:line="348" w:lineRule="auto"/>
         <w:jc w:val="center"/>
         <w:rPr>
           <w:b/>
@@ -3243,7 +3357,7 @@
     <w:p>
       <w:pPr>
         <w:pStyle w:val="2"/>
-        <w:spacing w:line="360" w:lineRule="auto"/>
+        <w:spacing w:before="0" w:after="0" w:line="348" w:lineRule="auto"/>
         <w:ind w:firstLine="709"/>
         <w:rPr>
           <w:rFonts w:ascii="Times New Roman" w:hAnsi="Times New Roman" w:cs="Times New Roman"/>
@@ -3268,7 +3382,7 @@
     </w:p>
     <w:p>
       <w:pPr>
-        <w:spacing w:line="360" w:lineRule="auto"/>
+        <w:spacing w:after="0" w:line="348" w:lineRule="auto"/>
         <w:ind w:firstLine="709"/>
         <w:jc w:val="both"/>
         <w:rPr>
@@ -3290,7 +3404,7 @@
     </w:p>
     <w:p>
       <w:pPr>
-        <w:spacing w:line="360" w:lineRule="auto"/>
+        <w:spacing w:after="0" w:line="348" w:lineRule="auto"/>
         <w:ind w:firstLine="709"/>
         <w:jc w:val="both"/>
         <w:rPr>
@@ -3307,13 +3421,30 @@
           <w:szCs w:val="28"/>
           <w:lang w:val="ru-RU"/>
         </w:rPr>
-        <w:t>Проект направлен на решение данной производственной задачи по автоматизации извлечения атрибутивной информации. Целью проекта является создание программного инструмента, который бы взял на себя рутинные операции по поиску основной надписи на чертеже и распознаванию ее содержимого, оставляя за сотрудником только функцию финальной проверки (валидации) результатов.</w:t>
+        <w:t xml:space="preserve">Проект направлен на решение данной производственной задачи по автоматизации извлечения атрибутивной информации. Целью проекта является </w:t>
+      </w:r>
+      <w:r>
+        <w:rPr>
+          <w:rFonts w:ascii="Times New Roman" w:hAnsi="Times New Roman" w:cs="Times New Roman"/>
+          <w:sz w:val="28"/>
+          <w:szCs w:val="28"/>
+        </w:rPr>
+        <w:t>s</w:t>
+      </w:r>
+      <w:r>
+        <w:rPr>
+          <w:rFonts w:ascii="Times New Roman" w:hAnsi="Times New Roman" w:cs="Times New Roman"/>
+          <w:sz w:val="28"/>
+          <w:szCs w:val="28"/>
+          <w:lang w:val="ru-RU"/>
+        </w:rPr>
+        <w:t>операции по поиску основной надписи на чертеже и распознаванию ее содержимого, оставляя за сотрудником только функцию финальной проверки (валидации) результатов.</w:t>
       </w:r>
     </w:p>
     <w:p>
       <w:pPr>
         <w:pStyle w:val="2"/>
-        <w:spacing w:line="360" w:lineRule="auto"/>
+        <w:spacing w:before="0" w:after="0" w:line="348" w:lineRule="auto"/>
         <w:ind w:firstLine="709"/>
         <w:rPr>
           <w:rFonts w:ascii="Times New Roman" w:hAnsi="Times New Roman" w:cs="Times New Roman"/>
@@ -3338,7 +3469,7 @@
     </w:p>
     <w:p>
       <w:pPr>
-        <w:spacing w:line="360" w:lineRule="auto"/>
+        <w:spacing w:after="0" w:line="348" w:lineRule="auto"/>
         <w:ind w:firstLine="709"/>
         <w:jc w:val="both"/>
         <w:rPr>
@@ -3386,7 +3517,7 @@
         <w:tabs>
           <w:tab w:val="left" w:pos="1260"/>
         </w:tabs>
-        <w:spacing w:line="360" w:lineRule="auto"/>
+        <w:spacing w:after="0" w:line="348" w:lineRule="auto"/>
         <w:ind w:left="0" w:firstLine="709"/>
         <w:jc w:val="both"/>
         <w:rPr>
@@ -3425,7 +3556,7 @@
         <w:tabs>
           <w:tab w:val="left" w:pos="1260"/>
         </w:tabs>
-        <w:spacing w:line="360" w:lineRule="auto"/>
+        <w:spacing w:after="0" w:line="348" w:lineRule="auto"/>
         <w:ind w:left="0" w:firstLine="709"/>
         <w:jc w:val="both"/>
         <w:rPr>
@@ -3543,7 +3674,7 @@
         <w:tabs>
           <w:tab w:val="left" w:pos="1260"/>
         </w:tabs>
-        <w:spacing w:line="360" w:lineRule="auto"/>
+        <w:spacing w:after="0" w:line="348" w:lineRule="auto"/>
         <w:ind w:left="0" w:firstLine="709"/>
         <w:jc w:val="both"/>
         <w:rPr>
@@ -3582,7 +3713,7 @@
         <w:tabs>
           <w:tab w:val="left" w:pos="1260"/>
         </w:tabs>
-        <w:spacing w:line="360" w:lineRule="auto"/>
+        <w:spacing w:after="0" w:line="348" w:lineRule="auto"/>
         <w:ind w:left="0" w:firstLine="709"/>
         <w:jc w:val="both"/>
         <w:rPr>
@@ -3599,7 +3730,6 @@
           <w:szCs w:val="28"/>
           <w:lang w:val="ru-RU"/>
         </w:rPr>
-        <w:lastRenderedPageBreak/>
         <w:t>Тестирование: Проверка работоспособности прототипа на предоставленных примерах чертежей</w:t>
       </w:r>
       <w:r>
@@ -3622,42 +3752,54 @@
         <w:tabs>
           <w:tab w:val="left" w:pos="1260"/>
         </w:tabs>
-        <w:spacing w:line="360" w:lineRule="auto"/>
+        <w:spacing w:after="0" w:line="348" w:lineRule="auto"/>
         <w:ind w:left="0" w:firstLine="709"/>
         <w:jc w:val="both"/>
         <w:rPr>
-          <w:rFonts w:ascii="Times New Roman" w:hAnsi="Times New Roman" w:cs="Times New Roman"/>
-          <w:sz w:val="28"/>
-          <w:szCs w:val="28"/>
-          <w:lang w:val="ru-RU"/>
-        </w:rPr>
-      </w:pPr>
-      <w:r>
-        <w:rPr>
-          <w:rFonts w:ascii="Times New Roman" w:hAnsi="Times New Roman" w:cs="Times New Roman"/>
-          <w:sz w:val="28"/>
-          <w:szCs w:val="28"/>
-          <w:lang w:val="ru-RU"/>
-        </w:rPr>
-        <w:t>Документирование: Подготовка технической документации и отчета по практике.</w:t>
-      </w:r>
-    </w:p>
-    <w:p>
-      <w:pPr>
-        <w:pStyle w:val="12"/>
-        <w:spacing w:line="360" w:lineRule="auto"/>
-        <w:jc w:val="center"/>
-        <w:rPr>
+          <w:rFonts w:ascii="Times New Roman" w:eastAsiaTheme="majorEastAsia" w:hAnsi="Times New Roman" w:cs="Times New Roman"/>
           <w:b/>
           <w:bCs/>
-        </w:rPr>
-      </w:pPr>
+          <w:color w:val="000000" w:themeColor="text1"/>
+          <w:sz w:val="28"/>
+          <w:szCs w:val="28"/>
+          <w:lang w:val="ru-RU"/>
+        </w:rPr>
+      </w:pPr>
+      <w:r>
+        <w:rPr>
+          <w:rFonts w:ascii="Times New Roman" w:hAnsi="Times New Roman" w:cs="Times New Roman"/>
+          <w:sz w:val="28"/>
+          <w:szCs w:val="28"/>
+          <w:lang w:val="ru-RU"/>
+        </w:rPr>
+        <w:t>Документирование: Подготовка технической документации и отчета по практике.</w:t>
+      </w:r>
       <w:bookmarkStart w:id="5" w:name="_Toc222767889"/>
       <w:r>
         <w:rPr>
           <w:b/>
           <w:bCs/>
-        </w:rPr>
+          <w:lang w:val="ru-RU"/>
+        </w:rPr>
+        <w:br w:type="page"/>
+      </w:r>
+    </w:p>
+    <w:p>
+      <w:pPr>
+        <w:pStyle w:val="12"/>
+        <w:spacing w:before="0" w:after="0" w:line="360" w:lineRule="auto"/>
+        <w:jc w:val="center"/>
+        <w:rPr>
+          <w:b/>
+          <w:bCs/>
+        </w:rPr>
+      </w:pPr>
+      <w:r>
+        <w:rPr>
+          <w:b/>
+          <w:bCs/>
+        </w:rPr>
+        <w:lastRenderedPageBreak/>
         <w:t>Раздел 2. Практическая часть</w:t>
       </w:r>
       <w:bookmarkEnd w:id="5"/>
@@ -3665,7 +3807,7 @@
     <w:p>
       <w:pPr>
         <w:pStyle w:val="2"/>
-        <w:spacing w:line="360" w:lineRule="auto"/>
+        <w:spacing w:before="0" w:after="0" w:line="360" w:lineRule="auto"/>
         <w:ind w:firstLine="709"/>
         <w:jc w:val="both"/>
         <w:rPr>
@@ -3691,7 +3833,7 @@
     </w:p>
     <w:p>
       <w:pPr>
-        <w:spacing w:line="360" w:lineRule="auto"/>
+        <w:spacing w:after="0" w:line="360" w:lineRule="auto"/>
         <w:ind w:firstLine="709"/>
         <w:jc w:val="both"/>
         <w:rPr>
@@ -3895,7 +4037,7 @@
     </w:p>
     <w:p>
       <w:pPr>
-        <w:spacing w:line="360" w:lineRule="auto"/>
+        <w:spacing w:after="0" w:line="360" w:lineRule="auto"/>
         <w:ind w:firstLine="709"/>
         <w:jc w:val="both"/>
         <w:rPr>
@@ -3935,7 +4077,7 @@
     </w:p>
     <w:p>
       <w:pPr>
-        <w:spacing w:line="360" w:lineRule="auto"/>
+        <w:spacing w:after="0" w:line="360" w:lineRule="auto"/>
         <w:ind w:firstLine="709"/>
         <w:jc w:val="both"/>
         <w:rPr>
@@ -3975,7 +4117,7 @@
     </w:p>
     <w:p>
       <w:pPr>
-        <w:spacing w:line="360" w:lineRule="auto"/>
+        <w:spacing w:after="0" w:line="360" w:lineRule="auto"/>
         <w:ind w:firstLine="709"/>
         <w:jc w:val="both"/>
         <w:rPr>
@@ -4010,22 +4152,12 @@
           <w:szCs w:val="28"/>
           <w:lang w:val="ru-RU"/>
         </w:rPr>
-        <w:t xml:space="preserve">Юридическая значимость: Скан-образ чертежа признается юридически значимым только при наличии электронной подписи или соответствующего акта </w:t>
-      </w:r>
-      <w:r>
-        <w:rPr>
-          <w:rFonts w:ascii="Times New Roman" w:hAnsi="Times New Roman" w:cs="Times New Roman"/>
-          <w:sz w:val="28"/>
-          <w:szCs w:val="28"/>
-          <w:lang w:val="ru-RU"/>
-        </w:rPr>
-        <w:lastRenderedPageBreak/>
-        <w:t>оцифровки. Автоматически извлеченные метаданные служат лишь для поиска, но не подменяют собой содержание документа.</w:t>
-      </w:r>
-    </w:p>
-    <w:p>
-      <w:pPr>
-        <w:spacing w:line="360" w:lineRule="auto"/>
+        <w:t>Юридическая значимость: Скан-образ чертежа признается юридически значимым только при наличии электронной подписи или соответствующего акта оцифровки. Автоматически извлеченные метаданные служат лишь для поиска, но не подменяют собой содержание документа.</w:t>
+      </w:r>
+    </w:p>
+    <w:p>
+      <w:pPr>
+        <w:spacing w:after="0" w:line="360" w:lineRule="auto"/>
         <w:ind w:firstLine="709"/>
         <w:jc w:val="both"/>
         <w:rPr>
@@ -4066,7 +4198,7 @@
     <w:p>
       <w:pPr>
         <w:pStyle w:val="2"/>
-        <w:spacing w:line="360" w:lineRule="auto"/>
+        <w:spacing w:before="0" w:after="0" w:line="360" w:lineRule="auto"/>
         <w:ind w:firstLine="709"/>
         <w:jc w:val="both"/>
         <w:rPr>
@@ -4086,13 +4218,14 @@
           <w:szCs w:val="28"/>
           <w:lang w:val="ru-RU"/>
         </w:rPr>
+        <w:lastRenderedPageBreak/>
         <w:t>2.2. Проектирование информационной системы</w:t>
       </w:r>
       <w:bookmarkEnd w:id="7"/>
     </w:p>
     <w:p>
       <w:pPr>
-        <w:spacing w:line="360" w:lineRule="auto"/>
+        <w:spacing w:after="0" w:line="360" w:lineRule="auto"/>
         <w:ind w:firstLine="709"/>
         <w:jc w:val="both"/>
         <w:rPr>
@@ -4131,7 +4264,7 @@
     </w:p>
     <w:p>
       <w:pPr>
-        <w:spacing w:line="360" w:lineRule="auto"/>
+        <w:spacing w:after="0" w:line="360" w:lineRule="auto"/>
         <w:ind w:firstLine="709"/>
         <w:jc w:val="both"/>
         <w:rPr>
@@ -4195,13 +4328,22 @@
           <w:szCs w:val="28"/>
           <w:lang w:val="ru-RU"/>
         </w:rPr>
-        <w:t>Хафа.</w:t>
+        <w:t>Хафа</w:t>
       </w:r>
       <w:proofErr w:type="spellEnd"/>
-    </w:p>
-    <w:p>
-      <w:pPr>
-        <w:spacing w:line="360" w:lineRule="auto"/>
+      <w:r>
+        <w:rPr>
+          <w:rFonts w:ascii="Times New Roman" w:hAnsi="Times New Roman" w:cs="Times New Roman"/>
+          <w:sz w:val="28"/>
+          <w:szCs w:val="28"/>
+          <w:lang w:val="ru-RU"/>
+        </w:rPr>
+        <w:t>.</w:t>
+      </w:r>
+    </w:p>
+    <w:p>
+      <w:pPr>
+        <w:spacing w:after="0" w:line="360" w:lineRule="auto"/>
         <w:ind w:firstLine="709"/>
         <w:jc w:val="both"/>
         <w:rPr>
@@ -4211,25 +4353,14 @@
           <w:lang w:val="ru-RU"/>
         </w:rPr>
       </w:pPr>
-      <w:proofErr w:type="spellStart"/>
-      <w:r>
-        <w:rPr>
-          <w:rFonts w:ascii="Times New Roman" w:hAnsi="Times New Roman" w:cs="Times New Roman"/>
-          <w:sz w:val="28"/>
-          <w:szCs w:val="28"/>
-          <w:lang w:val="ru-RU"/>
-        </w:rPr>
-        <w:t>Для</w:t>
-      </w:r>
-      <w:proofErr w:type="spellEnd"/>
-      <w:r>
-        <w:rPr>
-          <w:rFonts w:ascii="Times New Roman" w:hAnsi="Times New Roman" w:cs="Times New Roman"/>
-          <w:sz w:val="28"/>
-          <w:szCs w:val="28"/>
-          <w:lang w:val="ru-RU"/>
-        </w:rPr>
-        <w:t xml:space="preserve"> выравнивания изображения используется вероятностное преобразование </w:t>
+      <w:r>
+        <w:rPr>
+          <w:rFonts w:ascii="Times New Roman" w:hAnsi="Times New Roman" w:cs="Times New Roman"/>
+          <w:sz w:val="28"/>
+          <w:szCs w:val="28"/>
+          <w:lang w:val="ru-RU"/>
+        </w:rPr>
+        <w:t xml:space="preserve">Для выравнивания изображения используется вероятностное преобразование </w:t>
       </w:r>
       <w:proofErr w:type="spellStart"/>
       <w:r>
@@ -4362,31 +4493,176 @@
     </w:p>
     <w:p>
       <w:pPr>
-        <w:spacing w:line="360" w:lineRule="auto"/>
+        <w:spacing w:after="0" w:line="360" w:lineRule="auto"/>
         <w:ind w:firstLine="709"/>
         <w:jc w:val="both"/>
         <w:rPr>
           <w:rFonts w:ascii="Times New Roman" w:hAnsi="Times New Roman" w:cs="Times New Roman"/>
           <w:sz w:val="28"/>
           <w:szCs w:val="28"/>
-        </w:rPr>
-      </w:pPr>
-      <m:oMathPara>
-        <m:oMath>
-          <m:r>
-            <w:rPr>
-              <w:rFonts w:ascii="Cambria Math" w:hAnsi="Cambria Math" w:cs="Times New Roman"/>
-              <w:sz w:val="28"/>
-              <w:szCs w:val="28"/>
-            </w:rPr>
-            <m:t>ρ = x ∙ cos(θ) + y ∙ sin(θ)</m:t>
-          </m:r>
-        </m:oMath>
-      </m:oMathPara>
-    </w:p>
-    <w:p>
-      <w:pPr>
-        <w:spacing w:line="360" w:lineRule="auto"/>
+          <w:lang w:val="ru-RU"/>
+        </w:rPr>
+      </w:pPr>
+    </w:p>
+    <w:p>
+      <w:pPr>
+        <w:spacing w:after="0" w:line="360" w:lineRule="auto"/>
+        <w:ind w:firstLine="709"/>
+        <w:jc w:val="center"/>
+        <w:rPr>
+          <w:rFonts w:ascii="Times New Roman" w:eastAsiaTheme="minorEastAsia" w:hAnsi="Times New Roman" w:cs="Times New Roman"/>
+          <w:sz w:val="28"/>
+          <w:szCs w:val="28"/>
+          <w:lang w:val="ru-RU"/>
+        </w:rPr>
+      </w:pPr>
+      <m:oMath>
+        <m:r>
+          <w:rPr>
+            <w:rFonts w:ascii="Cambria Math" w:hAnsi="Cambria Math" w:cs="Times New Roman"/>
+            <w:sz w:val="28"/>
+            <w:szCs w:val="28"/>
+          </w:rPr>
+          <m:t>ρ</m:t>
+        </m:r>
+        <m:r>
+          <w:rPr>
+            <w:rFonts w:ascii="Cambria Math" w:hAnsi="Cambria Math" w:cs="Times New Roman"/>
+            <w:sz w:val="28"/>
+            <w:szCs w:val="28"/>
+            <w:lang w:val="ru-RU"/>
+          </w:rPr>
+          <m:t xml:space="preserve"> = </m:t>
+        </m:r>
+        <m:r>
+          <w:rPr>
+            <w:rFonts w:ascii="Cambria Math" w:hAnsi="Cambria Math" w:cs="Times New Roman"/>
+            <w:sz w:val="28"/>
+            <w:szCs w:val="28"/>
+          </w:rPr>
+          <m:t>x</m:t>
+        </m:r>
+        <m:r>
+          <w:rPr>
+            <w:rFonts w:ascii="Cambria Math" w:hAnsi="Cambria Math" w:cs="Times New Roman"/>
+            <w:sz w:val="28"/>
+            <w:szCs w:val="28"/>
+            <w:lang w:val="ru-RU"/>
+          </w:rPr>
+          <m:t xml:space="preserve"> ∙ </m:t>
+        </m:r>
+        <m:r>
+          <w:rPr>
+            <w:rFonts w:ascii="Cambria Math" w:hAnsi="Cambria Math" w:cs="Times New Roman"/>
+            <w:sz w:val="28"/>
+            <w:szCs w:val="28"/>
+          </w:rPr>
+          <m:t>cos</m:t>
+        </m:r>
+        <m:r>
+          <w:rPr>
+            <w:rFonts w:ascii="Cambria Math" w:hAnsi="Cambria Math" w:cs="Times New Roman"/>
+            <w:sz w:val="28"/>
+            <w:szCs w:val="28"/>
+            <w:lang w:val="ru-RU"/>
+          </w:rPr>
+          <m:t>(</m:t>
+        </m:r>
+        <m:r>
+          <w:rPr>
+            <w:rFonts w:ascii="Cambria Math" w:hAnsi="Cambria Math" w:cs="Times New Roman"/>
+            <w:sz w:val="28"/>
+            <w:szCs w:val="28"/>
+          </w:rPr>
+          <m:t>θ</m:t>
+        </m:r>
+        <m:r>
+          <w:rPr>
+            <w:rFonts w:ascii="Cambria Math" w:hAnsi="Cambria Math" w:cs="Times New Roman"/>
+            <w:sz w:val="28"/>
+            <w:szCs w:val="28"/>
+            <w:lang w:val="ru-RU"/>
+          </w:rPr>
+          <m:t xml:space="preserve">) + </m:t>
+        </m:r>
+        <m:r>
+          <w:rPr>
+            <w:rFonts w:ascii="Cambria Math" w:hAnsi="Cambria Math" w:cs="Times New Roman"/>
+            <w:sz w:val="28"/>
+            <w:szCs w:val="28"/>
+          </w:rPr>
+          <m:t>y</m:t>
+        </m:r>
+        <m:r>
+          <w:rPr>
+            <w:rFonts w:ascii="Cambria Math" w:hAnsi="Cambria Math" w:cs="Times New Roman"/>
+            <w:sz w:val="28"/>
+            <w:szCs w:val="28"/>
+            <w:lang w:val="ru-RU"/>
+          </w:rPr>
+          <m:t xml:space="preserve"> ∙ </m:t>
+        </m:r>
+        <m:r>
+          <w:rPr>
+            <w:rFonts w:ascii="Cambria Math" w:hAnsi="Cambria Math" w:cs="Times New Roman"/>
+            <w:sz w:val="28"/>
+            <w:szCs w:val="28"/>
+          </w:rPr>
+          <m:t>sin</m:t>
+        </m:r>
+        <m:r>
+          <w:rPr>
+            <w:rFonts w:ascii="Cambria Math" w:hAnsi="Cambria Math" w:cs="Times New Roman"/>
+            <w:sz w:val="28"/>
+            <w:szCs w:val="28"/>
+            <w:lang w:val="ru-RU"/>
+          </w:rPr>
+          <m:t>(</m:t>
+        </m:r>
+        <m:r>
+          <w:rPr>
+            <w:rFonts w:ascii="Cambria Math" w:hAnsi="Cambria Math" w:cs="Times New Roman"/>
+            <w:sz w:val="28"/>
+            <w:szCs w:val="28"/>
+          </w:rPr>
+          <m:t>θ</m:t>
+        </m:r>
+        <m:r>
+          <w:rPr>
+            <w:rFonts w:ascii="Cambria Math" w:hAnsi="Cambria Math" w:cs="Times New Roman"/>
+            <w:sz w:val="28"/>
+            <w:szCs w:val="28"/>
+            <w:lang w:val="ru-RU"/>
+          </w:rPr>
+          <m:t>)</m:t>
+        </m:r>
+      </m:oMath>
+      <w:r>
+        <w:rPr>
+          <w:rFonts w:ascii="Times New Roman" w:eastAsiaTheme="minorEastAsia" w:hAnsi="Times New Roman" w:cs="Times New Roman"/>
+          <w:sz w:val="28"/>
+          <w:szCs w:val="28"/>
+          <w:lang w:val="ru-RU"/>
+        </w:rPr>
+        <w:t>,</w:t>
+      </w:r>
+    </w:p>
+    <w:p>
+      <w:pPr>
+        <w:spacing w:after="0" w:line="360" w:lineRule="auto"/>
+        <w:ind w:firstLine="709"/>
+        <w:jc w:val="both"/>
+        <w:rPr>
+          <w:rFonts w:ascii="Times New Roman" w:hAnsi="Times New Roman" w:cs="Times New Roman"/>
+          <w:sz w:val="28"/>
+          <w:szCs w:val="28"/>
+          <w:lang w:val="ru-RU"/>
+        </w:rPr>
+      </w:pPr>
+    </w:p>
+    <w:p>
+      <w:pPr>
+        <w:spacing w:after="0" w:line="360" w:lineRule="auto"/>
         <w:ind w:firstLine="709"/>
         <w:jc w:val="both"/>
         <w:rPr>
@@ -4493,7 +4769,7 @@
     </w:p>
     <w:p>
       <w:pPr>
-        <w:spacing w:line="360" w:lineRule="auto"/>
+        <w:spacing w:after="0" w:line="360" w:lineRule="auto"/>
         <w:ind w:firstLine="709"/>
         <w:jc w:val="both"/>
         <w:rPr>
@@ -4533,7 +4809,7 @@
     </w:p>
     <w:p>
       <w:pPr>
-        <w:spacing w:line="360" w:lineRule="auto"/>
+        <w:spacing w:after="0" w:line="360" w:lineRule="auto"/>
         <w:ind w:firstLine="709"/>
         <w:jc w:val="both"/>
         <w:rPr>
@@ -4555,7 +4831,7 @@
     </w:p>
     <w:p>
       <w:pPr>
-        <w:spacing w:line="360" w:lineRule="auto"/>
+        <w:spacing w:after="0" w:line="360" w:lineRule="auto"/>
         <w:ind w:firstLine="709"/>
         <w:jc w:val="both"/>
         <w:rPr>
@@ -4572,7 +4848,6 @@
           <w:szCs w:val="28"/>
           <w:lang w:val="ru-RU"/>
         </w:rPr>
-        <w:lastRenderedPageBreak/>
         <w:t>-</w:t>
       </w:r>
       <w:r>
@@ -4645,7 +4920,7 @@
     </w:p>
     <w:p>
       <w:pPr>
-        <w:spacing w:line="360" w:lineRule="auto"/>
+        <w:spacing w:after="0" w:line="360" w:lineRule="auto"/>
         <w:ind w:firstLine="709"/>
         <w:jc w:val="both"/>
         <w:rPr>
@@ -4883,7 +5158,7 @@
     </w:p>
     <w:p>
       <w:pPr>
-        <w:spacing w:line="360" w:lineRule="auto"/>
+        <w:spacing w:after="0" w:line="360" w:lineRule="auto"/>
         <w:ind w:firstLine="709"/>
         <w:jc w:val="both"/>
         <w:rPr>
@@ -5071,7 +5346,7 @@
     </w:p>
     <w:p>
       <w:pPr>
-        <w:spacing w:line="360" w:lineRule="auto"/>
+        <w:spacing w:after="0" w:line="360" w:lineRule="auto"/>
         <w:ind w:firstLine="709"/>
         <w:jc w:val="both"/>
         <w:rPr>
@@ -5088,6 +5363,7 @@
           <w:szCs w:val="28"/>
           <w:lang w:val="ru-RU"/>
         </w:rPr>
+        <w:lastRenderedPageBreak/>
         <w:t xml:space="preserve">Полученное значение </w:t>
       </w:r>
       <m:oMath>
@@ -5244,7 +5520,7 @@
     </w:p>
     <w:p>
       <w:pPr>
-        <w:spacing w:line="360" w:lineRule="auto"/>
+        <w:spacing w:after="0" w:line="360" w:lineRule="auto"/>
         <w:ind w:firstLine="709"/>
         <w:jc w:val="both"/>
         <w:rPr>
@@ -5284,7 +5560,7 @@
     </w:p>
     <w:p>
       <w:pPr>
-        <w:spacing w:line="360" w:lineRule="auto"/>
+        <w:spacing w:after="0" w:line="360" w:lineRule="auto"/>
         <w:ind w:firstLine="709"/>
         <w:jc w:val="both"/>
         <w:rPr>
@@ -5381,7 +5657,7 @@
     </w:p>
     <w:p>
       <w:pPr>
-        <w:spacing w:line="360" w:lineRule="auto"/>
+        <w:spacing w:after="0" w:line="360" w:lineRule="auto"/>
         <w:ind w:firstLine="709"/>
         <w:jc w:val="both"/>
         <w:rPr>
@@ -5519,7 +5795,7 @@
     </w:p>
     <w:p>
       <w:pPr>
-        <w:spacing w:line="360" w:lineRule="auto"/>
+        <w:spacing w:after="0" w:line="360" w:lineRule="auto"/>
         <w:ind w:firstLine="709"/>
         <w:jc w:val="both"/>
         <w:rPr>
@@ -5588,7 +5864,25 @@
           <w:szCs w:val="28"/>
           <w:lang w:val="ru-RU"/>
         </w:rPr>
-        <w:t>), способными улавливать контекстуальные зависимости в последовательности</w:t>
+        <w:t>),</w:t>
+      </w:r>
+      <w:r>
+        <w:rPr>
+          <w:rFonts w:ascii="Times New Roman" w:hAnsi="Times New Roman" w:cs="Times New Roman"/>
+          <w:sz w:val="28"/>
+          <w:szCs w:val="28"/>
+          <w:lang w:val="ru-RU"/>
+        </w:rPr>
+        <w:t xml:space="preserve"> </w:t>
+      </w:r>
+      <w:r>
+        <w:rPr>
+          <w:rFonts w:ascii="Times New Roman" w:hAnsi="Times New Roman" w:cs="Times New Roman"/>
+          <w:sz w:val="28"/>
+          <w:szCs w:val="28"/>
+          <w:lang w:val="ru-RU"/>
+        </w:rPr>
+        <w:t>способными улавливать контекстуальные зависимости в последовательности</w:t>
       </w:r>
       <w:r>
         <w:rPr>
@@ -5602,7 +5896,7 @@
     </w:p>
     <w:p>
       <w:pPr>
-        <w:spacing w:line="360" w:lineRule="auto"/>
+        <w:spacing w:after="0" w:line="360" w:lineRule="auto"/>
         <w:ind w:firstLine="709"/>
         <w:jc w:val="both"/>
         <w:rPr>
@@ -5734,7 +6028,8 @@
     <w:p>
       <w:pPr>
         <w:keepNext/>
-        <w:spacing w:line="360" w:lineRule="auto"/>
+        <w:spacing w:after="0" w:line="360" w:lineRule="auto"/>
+        <w:ind w:firstLine="142"/>
         <w:jc w:val="both"/>
       </w:pPr>
       <w:r>
@@ -5749,16 +6044,16 @@
         <mc:AlternateContent>
           <mc:Choice Requires="wps">
             <w:drawing>
-              <wp:anchor distT="0" distB="0" distL="114300" distR="114300" simplePos="0" relativeHeight="251659264" behindDoc="0" locked="0" layoutInCell="1" allowOverlap="1" wp14:anchorId="72374233" wp14:editId="4DC4F4F4">
+              <wp:anchor distT="0" distB="0" distL="114300" distR="114300" simplePos="0" relativeHeight="251659264" behindDoc="0" locked="0" layoutInCell="1" allowOverlap="1" wp14:anchorId="72374233" wp14:editId="59578919">
                 <wp:simplePos x="0" y="0"/>
                 <wp:positionH relativeFrom="margin">
-                  <wp:posOffset>-10795</wp:posOffset>
+                  <wp:align>right</wp:align>
                 </wp:positionH>
                 <wp:positionV relativeFrom="paragraph">
-                  <wp:posOffset>-20482</wp:posOffset>
+                  <wp:posOffset>-18341</wp:posOffset>
                 </wp:positionV>
-                <wp:extent cx="6012976" cy="3289111"/>
-                <wp:effectExtent l="0" t="0" r="26035" b="26035"/>
+                <wp:extent cx="6326372" cy="3289111"/>
+                <wp:effectExtent l="0" t="0" r="17780" b="26035"/>
                 <wp:wrapNone/>
                 <wp:docPr id="12" name="Прямоугольник 12"/>
                 <wp:cNvGraphicFramePr/>
@@ -5769,7 +6064,7 @@
                       <wps:spPr>
                         <a:xfrm>
                           <a:off x="0" y="0"/>
-                          <a:ext cx="6012976" cy="3289111"/>
+                          <a:ext cx="6326372" cy="3289111"/>
                         </a:xfrm>
                         <a:prstGeom prst="rect">
                           <a:avLst/>
@@ -5814,7 +6109,7 @@
           </mc:Choice>
           <mc:Fallback>
             <w:pict>
-              <v:rect w14:anchorId="5E54F036" id="Прямоугольник 12" o:spid="_x0000_s1026" style="position:absolute;margin-left:-.85pt;margin-top:-1.6pt;width:473.45pt;height:259pt;z-index:251659264;visibility:visible;mso-wrap-style:square;mso-width-percent:0;mso-wrap-distance-left:9pt;mso-wrap-distance-top:0;mso-wrap-distance-right:9pt;mso-wrap-distance-bottom:0;mso-position-horizontal:absolute;mso-position-horizontal-relative:margin;mso-position-vertical:absolute;mso-position-vertical-relative:text;mso-width-percent:0;mso-width-relative:margin;v-text-anchor:middle" o:gfxdata="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" filled="f" strokecolor="black [3213]" strokeweight="1pt">
+              <v:rect w14:anchorId="1BB58001" id="Прямоугольник 12" o:spid="_x0000_s1026" style="position:absolute;margin-left:446.95pt;margin-top:-1.45pt;width:498.15pt;height:259pt;z-index:251659264;visibility:visible;mso-wrap-style:square;mso-width-percent:0;mso-wrap-distance-left:9pt;mso-wrap-distance-top:0;mso-wrap-distance-right:9pt;mso-wrap-distance-bottom:0;mso-position-horizontal:right;mso-position-horizontal-relative:margin;mso-position-vertical:absolute;mso-position-vertical-relative:text;mso-width-percent:0;mso-width-relative:margin;v-text-anchor:middle" o:gfxdata="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" filled="f" strokecolor="black [3213]" strokeweight="1pt">
                 <w10:wrap anchorx="margin"/>
               </v:rect>
             </w:pict>
@@ -5830,8 +6125,8 @@
           <w:lang w:val="ru-RU"/>
         </w:rPr>
         <w:drawing>
-          <wp:inline distT="0" distB="0" distL="0" distR="0" wp14:anchorId="77D2F63B" wp14:editId="070FF703">
-            <wp:extent cx="6020410" cy="3284212"/>
+          <wp:inline distT="0" distB="0" distL="0" distR="0" wp14:anchorId="77D2F63B" wp14:editId="13BD5B7A">
+            <wp:extent cx="6039293" cy="3283485"/>
             <wp:effectExtent l="0" t="0" r="0" b="0"/>
             <wp:docPr id="1" name="Рисунок 1"/>
             <wp:cNvGraphicFramePr>
@@ -5859,7 +6154,7 @@
                   <pic:spPr>
                     <a:xfrm>
                       <a:off x="0" y="0"/>
-                      <a:ext cx="6073733" cy="3313301"/>
+                      <a:ext cx="6048778" cy="3288642"/>
                     </a:xfrm>
                     <a:prstGeom prst="rect">
                       <a:avLst/>
@@ -5875,7 +6170,7 @@
     <w:p>
       <w:pPr>
         <w:pStyle w:val="af3"/>
-        <w:spacing w:line="360" w:lineRule="auto"/>
+        <w:spacing w:after="0" w:line="360" w:lineRule="auto"/>
         <w:jc w:val="center"/>
         <w:rPr>
           <w:rFonts w:ascii="Times New Roman" w:hAnsi="Times New Roman" w:cs="Times New Roman"/>
@@ -5988,6 +6283,7 @@
           <w:color w:val="auto"/>
           <w:sz w:val="28"/>
           <w:szCs w:val="28"/>
+          <w:lang w:val="ru-RU"/>
         </w:rPr>
         <w:t>1</w:t>
       </w:r>
@@ -6026,50 +6322,167 @@
         </w:rPr>
         <w:t>– Блок-схема алгоритма локализации области основной надписи</w:t>
       </w:r>
-    </w:p>
-    <w:p>
-      <w:pPr>
-        <w:spacing w:line="360" w:lineRule="auto"/>
+      <w:r>
+        <w:rPr>
+          <w:rFonts w:ascii="Times New Roman" w:hAnsi="Times New Roman" w:cs="Times New Roman"/>
+          <w:i w:val="0"/>
+          <w:iCs w:val="0"/>
+          <w:color w:val="auto"/>
+          <w:sz w:val="28"/>
+          <w:szCs w:val="28"/>
+          <w:lang w:val="ru-RU"/>
+        </w:rPr>
+        <w:t>.</w:t>
+      </w:r>
+    </w:p>
+    <w:p>
+      <w:pPr>
+        <w:rPr>
+          <w:lang w:val="ru-RU"/>
+        </w:rPr>
+      </w:pPr>
+    </w:p>
+    <w:p>
+      <w:pPr>
+        <w:pStyle w:val="2"/>
+        <w:spacing w:before="0" w:after="0" w:line="360" w:lineRule="auto"/>
         <w:ind w:firstLine="709"/>
         <w:jc w:val="both"/>
         <w:rPr>
           <w:rFonts w:ascii="Times New Roman" w:hAnsi="Times New Roman" w:cs="Times New Roman"/>
-          <w:sz w:val="28"/>
-          <w:szCs w:val="28"/>
-          <w:lang w:val="ru-RU"/>
-        </w:rPr>
-      </w:pPr>
-    </w:p>
-    <w:p>
-      <w:pPr>
-        <w:pStyle w:val="2"/>
-        <w:spacing w:line="360" w:lineRule="auto"/>
+          <w:color w:val="auto"/>
+          <w:sz w:val="28"/>
+          <w:szCs w:val="28"/>
+          <w:lang w:val="ru-RU"/>
+        </w:rPr>
+      </w:pPr>
+      <w:bookmarkStart w:id="8" w:name="_Toc222767892"/>
+      <w:r>
+        <w:rPr>
+          <w:rFonts w:ascii="Times New Roman" w:hAnsi="Times New Roman" w:cs="Times New Roman"/>
+          <w:color w:val="auto"/>
+          <w:sz w:val="28"/>
+          <w:szCs w:val="28"/>
+          <w:lang w:val="ru-RU"/>
+        </w:rPr>
+        <w:t>2.3. Разработка и тестирование</w:t>
+      </w:r>
+      <w:bookmarkEnd w:id="8"/>
+    </w:p>
+    <w:p>
+      <w:pPr>
+        <w:spacing w:after="0" w:line="360" w:lineRule="auto"/>
         <w:ind w:firstLine="709"/>
         <w:jc w:val="both"/>
         <w:rPr>
           <w:rFonts w:ascii="Times New Roman" w:hAnsi="Times New Roman" w:cs="Times New Roman"/>
-          <w:color w:val="auto"/>
-          <w:sz w:val="28"/>
-          <w:szCs w:val="28"/>
-          <w:lang w:val="ru-RU"/>
-        </w:rPr>
-      </w:pPr>
-      <w:bookmarkStart w:id="8" w:name="_Toc222767892"/>
-      <w:r>
-        <w:rPr>
-          <w:rFonts w:ascii="Times New Roman" w:hAnsi="Times New Roman" w:cs="Times New Roman"/>
-          <w:color w:val="auto"/>
-          <w:sz w:val="28"/>
-          <w:szCs w:val="28"/>
-          <w:lang w:val="ru-RU"/>
-        </w:rPr>
-        <w:t>2.3. Разработка и тестирование</w:t>
-      </w:r>
-      <w:bookmarkEnd w:id="8"/>
-    </w:p>
-    <w:p>
-      <w:pPr>
-        <w:spacing w:line="360" w:lineRule="auto"/>
+          <w:sz w:val="28"/>
+          <w:szCs w:val="28"/>
+          <w:lang w:val="ru-RU"/>
+        </w:rPr>
+      </w:pPr>
+      <w:r>
+        <w:rPr>
+          <w:rFonts w:ascii="Times New Roman" w:hAnsi="Times New Roman" w:cs="Times New Roman"/>
+          <w:sz w:val="28"/>
+          <w:szCs w:val="28"/>
+          <w:lang w:val="ru-RU"/>
+        </w:rPr>
+        <w:t xml:space="preserve">Для реализации прототипа был выбран язык программирования </w:t>
+      </w:r>
+      <w:r>
+        <w:rPr>
+          <w:rFonts w:ascii="Times New Roman" w:hAnsi="Times New Roman" w:cs="Times New Roman"/>
+          <w:sz w:val="28"/>
+          <w:szCs w:val="28"/>
+        </w:rPr>
+        <w:t>Python</w:t>
+      </w:r>
+      <w:r>
+        <w:rPr>
+          <w:rFonts w:ascii="Times New Roman" w:hAnsi="Times New Roman" w:cs="Times New Roman"/>
+          <w:sz w:val="28"/>
+          <w:szCs w:val="28"/>
+          <w:lang w:val="ru-RU"/>
+        </w:rPr>
+        <w:t xml:space="preserve"> и набор библиотек: </w:t>
+      </w:r>
+      <w:r>
+        <w:rPr>
+          <w:rFonts w:ascii="Times New Roman" w:hAnsi="Times New Roman" w:cs="Times New Roman"/>
+          <w:sz w:val="28"/>
+          <w:szCs w:val="28"/>
+        </w:rPr>
+        <w:t>OpenCV</w:t>
+      </w:r>
+      <w:r>
+        <w:rPr>
+          <w:rFonts w:ascii="Times New Roman" w:hAnsi="Times New Roman" w:cs="Times New Roman"/>
+          <w:sz w:val="28"/>
+          <w:szCs w:val="28"/>
+          <w:lang w:val="ru-RU"/>
+        </w:rPr>
+        <w:t xml:space="preserve"> для задач классической обработки изображений и </w:t>
+      </w:r>
+      <w:proofErr w:type="spellStart"/>
+      <w:r>
+        <w:rPr>
+          <w:rFonts w:ascii="Times New Roman" w:hAnsi="Times New Roman" w:cs="Times New Roman"/>
+          <w:sz w:val="28"/>
+          <w:szCs w:val="28"/>
+        </w:rPr>
+        <w:t>EasyOCR</w:t>
+      </w:r>
+      <w:proofErr w:type="spellEnd"/>
+      <w:r>
+        <w:rPr>
+          <w:rFonts w:ascii="Times New Roman" w:hAnsi="Times New Roman" w:cs="Times New Roman"/>
+          <w:sz w:val="28"/>
+          <w:szCs w:val="28"/>
+          <w:lang w:val="ru-RU"/>
+        </w:rPr>
+        <w:t xml:space="preserve"> для применения обученных моделей распознавания текста.</w:t>
+      </w:r>
+      <w:r>
+        <w:rPr>
+          <w:rFonts w:ascii="Times New Roman" w:hAnsi="Times New Roman" w:cs="Times New Roman"/>
+          <w:sz w:val="28"/>
+          <w:szCs w:val="28"/>
+          <w:lang w:val="ru-RU"/>
+        </w:rPr>
+        <w:t xml:space="preserve"> </w:t>
+      </w:r>
+      <w:r>
+        <w:rPr>
+          <w:rFonts w:ascii="Times New Roman" w:hAnsi="Times New Roman" w:cs="Times New Roman"/>
+          <w:sz w:val="28"/>
+          <w:szCs w:val="28"/>
+          <w:lang w:val="ru-RU"/>
+        </w:rPr>
+        <w:t>В ходе разработки особое внимание уделялось модульности кода, чтобы обеспечить возможность дальнейшего расширения и модификации.</w:t>
+      </w:r>
+      <w:r>
+        <w:rPr>
+          <w:rFonts w:ascii="Times New Roman" w:hAnsi="Times New Roman" w:cs="Times New Roman"/>
+          <w:sz w:val="28"/>
+          <w:szCs w:val="28"/>
+          <w:lang w:val="ru-RU"/>
+        </w:rPr>
+        <w:t xml:space="preserve"> </w:t>
+      </w:r>
+      <w:r>
+        <w:rPr>
+          <w:rFonts w:ascii="Times New Roman" w:hAnsi="Times New Roman" w:cs="Times New Roman"/>
+          <w:sz w:val="28"/>
+          <w:szCs w:val="28"/>
+          <w:lang w:val="ru-RU"/>
+        </w:rPr>
+        <w:t>Для удобства использования был реализован интерфейс командной строки (ИКС).</w:t>
+      </w:r>
+    </w:p>
+    <w:p>
+      <w:pPr>
+        <w:spacing w:after="0" w:line="360" w:lineRule="auto"/>
         <w:ind w:firstLine="709"/>
         <w:jc w:val="both"/>
         <w:rPr>
@@ -6086,117 +6499,6 @@
           <w:szCs w:val="28"/>
           <w:lang w:val="ru-RU"/>
         </w:rPr>
-        <w:t xml:space="preserve">Для реализации прототипа был выбран язык программирования </w:t>
-      </w:r>
-      <w:r>
-        <w:rPr>
-          <w:rFonts w:ascii="Times New Roman" w:hAnsi="Times New Roman" w:cs="Times New Roman"/>
-          <w:sz w:val="28"/>
-          <w:szCs w:val="28"/>
-        </w:rPr>
-        <w:t>Python</w:t>
-      </w:r>
-      <w:r>
-        <w:rPr>
-          <w:rFonts w:ascii="Times New Roman" w:hAnsi="Times New Roman" w:cs="Times New Roman"/>
-          <w:sz w:val="28"/>
-          <w:szCs w:val="28"/>
-          <w:lang w:val="ru-RU"/>
-        </w:rPr>
-        <w:t xml:space="preserve"> и набор библиотек: </w:t>
-      </w:r>
-      <w:r>
-        <w:rPr>
-          <w:rFonts w:ascii="Times New Roman" w:hAnsi="Times New Roman" w:cs="Times New Roman"/>
-          <w:sz w:val="28"/>
-          <w:szCs w:val="28"/>
-        </w:rPr>
-        <w:t>OpenCV</w:t>
-      </w:r>
-      <w:r>
-        <w:rPr>
-          <w:rFonts w:ascii="Times New Roman" w:hAnsi="Times New Roman" w:cs="Times New Roman"/>
-          <w:sz w:val="28"/>
-          <w:szCs w:val="28"/>
-          <w:lang w:val="ru-RU"/>
-        </w:rPr>
-        <w:t xml:space="preserve"> для задач классической обработки изображений и </w:t>
-      </w:r>
-      <w:proofErr w:type="spellStart"/>
-      <w:r>
-        <w:rPr>
-          <w:rFonts w:ascii="Times New Roman" w:hAnsi="Times New Roman" w:cs="Times New Roman"/>
-          <w:sz w:val="28"/>
-          <w:szCs w:val="28"/>
-        </w:rPr>
-        <w:t>EasyOCR</w:t>
-      </w:r>
-      <w:proofErr w:type="spellEnd"/>
-      <w:r>
-        <w:rPr>
-          <w:rFonts w:ascii="Times New Roman" w:hAnsi="Times New Roman" w:cs="Times New Roman"/>
-          <w:sz w:val="28"/>
-          <w:szCs w:val="28"/>
-          <w:lang w:val="ru-RU"/>
-        </w:rPr>
-        <w:t xml:space="preserve"> для применения обученных моделей распознавания текста.</w:t>
-      </w:r>
-      <w:r>
-        <w:rPr>
-          <w:rFonts w:ascii="Times New Roman" w:hAnsi="Times New Roman" w:cs="Times New Roman"/>
-          <w:sz w:val="28"/>
-          <w:szCs w:val="28"/>
-          <w:lang w:val="ru-RU"/>
-        </w:rPr>
-        <w:t xml:space="preserve"> </w:t>
-      </w:r>
-      <w:r>
-        <w:rPr>
-          <w:rFonts w:ascii="Times New Roman" w:hAnsi="Times New Roman" w:cs="Times New Roman"/>
-          <w:sz w:val="28"/>
-          <w:szCs w:val="28"/>
-          <w:lang w:val="ru-RU"/>
-        </w:rPr>
-        <w:t>В ходе разработки особое внимание уделялось модульности кода, чтобы обеспечить возможность дальнейшего расширения и модификации.</w:t>
-      </w:r>
-      <w:r>
-        <w:rPr>
-          <w:rFonts w:ascii="Times New Roman" w:hAnsi="Times New Roman" w:cs="Times New Roman"/>
-          <w:sz w:val="28"/>
-          <w:szCs w:val="28"/>
-          <w:lang w:val="ru-RU"/>
-        </w:rPr>
-        <w:t xml:space="preserve"> </w:t>
-      </w:r>
-      <w:r>
-        <w:rPr>
-          <w:rFonts w:ascii="Times New Roman" w:hAnsi="Times New Roman" w:cs="Times New Roman"/>
-          <w:sz w:val="28"/>
-          <w:szCs w:val="28"/>
-          <w:lang w:val="ru-RU"/>
-        </w:rPr>
-        <w:t>Для удобства использования был реализован интерфейс командной строки (ИКС).</w:t>
-      </w:r>
-    </w:p>
-    <w:p>
-      <w:pPr>
-        <w:spacing w:line="360" w:lineRule="auto"/>
-        <w:ind w:firstLine="709"/>
-        <w:jc w:val="both"/>
-        <w:rPr>
-          <w:rFonts w:ascii="Times New Roman" w:hAnsi="Times New Roman" w:cs="Times New Roman"/>
-          <w:sz w:val="28"/>
-          <w:szCs w:val="28"/>
-          <w:lang w:val="ru-RU"/>
-        </w:rPr>
-      </w:pPr>
-      <w:r>
-        <w:rPr>
-          <w:rFonts w:ascii="Times New Roman" w:hAnsi="Times New Roman" w:cs="Times New Roman"/>
-          <w:sz w:val="28"/>
-          <w:szCs w:val="28"/>
-          <w:lang w:val="ru-RU"/>
-        </w:rPr>
         <w:t xml:space="preserve">На рисунке 2 </w:t>
       </w:r>
       <w:r>
@@ -6211,7 +6513,7 @@
     </w:p>
     <w:p>
       <w:pPr>
-        <w:spacing w:line="360" w:lineRule="auto"/>
+        <w:spacing w:after="0" w:line="360" w:lineRule="auto"/>
         <w:ind w:firstLine="709"/>
         <w:jc w:val="both"/>
         <w:rPr>
@@ -6354,7 +6656,7 @@
     </w:p>
     <w:p>
       <w:pPr>
-        <w:spacing w:line="360" w:lineRule="auto"/>
+        <w:spacing w:after="0" w:line="360" w:lineRule="auto"/>
         <w:ind w:left="142" w:firstLine="567"/>
         <w:jc w:val="both"/>
         <w:rPr>
@@ -6417,12 +6719,23 @@
     </w:p>
     <w:p>
       <w:pPr>
-        <w:spacing w:line="360" w:lineRule="auto"/>
+        <w:spacing w:after="0" w:line="360" w:lineRule="auto"/>
         <w:jc w:val="center"/>
         <w:rPr>
           <w:rFonts w:ascii="Times New Roman" w:hAnsi="Times New Roman" w:cs="Times New Roman"/>
           <w:sz w:val="28"/>
           <w:szCs w:val="28"/>
+        </w:rPr>
+      </w:pPr>
+    </w:p>
+    <w:p>
+      <w:pPr>
+        <w:spacing w:after="0" w:line="360" w:lineRule="auto"/>
+        <w:jc w:val="center"/>
+        <w:rPr>
+          <w:rFonts w:ascii="Times New Roman" w:hAnsi="Times New Roman" w:cs="Times New Roman"/>
+          <w:sz w:val="28"/>
+          <w:szCs w:val="28"/>
           <w:lang w:val="ru-RU"/>
         </w:rPr>
       </w:pPr>
@@ -6500,7 +6813,19 @@
     </w:p>
     <w:p>
       <w:pPr>
-        <w:spacing w:line="360" w:lineRule="auto"/>
+        <w:spacing w:after="0" w:line="360" w:lineRule="auto"/>
+        <w:jc w:val="center"/>
+        <w:rPr>
+          <w:rFonts w:ascii="Times New Roman" w:hAnsi="Times New Roman" w:cs="Times New Roman"/>
+          <w:sz w:val="28"/>
+          <w:szCs w:val="28"/>
+          <w:lang w:val="ru-RU"/>
+        </w:rPr>
+      </w:pPr>
+    </w:p>
+    <w:p>
+      <w:pPr>
+        <w:spacing w:after="0" w:line="360" w:lineRule="auto"/>
         <w:ind w:firstLine="709"/>
         <w:jc w:val="both"/>
         <w:rPr>
@@ -6517,7 +6842,6 @@
           <w:szCs w:val="28"/>
           <w:lang w:val="ru-RU"/>
         </w:rPr>
-        <w:lastRenderedPageBreak/>
         <w:t xml:space="preserve">Код проекта был организован в виде пакета </w:t>
       </w:r>
       <w:proofErr w:type="spellStart"/>
@@ -6569,7 +6893,7 @@
           <w:tab w:val="clear" w:pos="720"/>
           <w:tab w:val="left" w:pos="1134"/>
         </w:tabs>
-        <w:spacing w:line="360" w:lineRule="auto"/>
+        <w:spacing w:after="0" w:line="360" w:lineRule="auto"/>
         <w:ind w:left="0" w:firstLine="709"/>
         <w:jc w:val="both"/>
         <w:rPr>
@@ -6585,6 +6909,7 @@
           <w:sz w:val="28"/>
           <w:szCs w:val="28"/>
         </w:rPr>
+        <w:lastRenderedPageBreak/>
         <w:t>cli</w:t>
       </w:r>
       <w:r>
@@ -6626,7 +6951,7 @@
           <w:tab w:val="clear" w:pos="720"/>
           <w:tab w:val="left" w:pos="1134"/>
         </w:tabs>
-        <w:spacing w:line="360" w:lineRule="auto"/>
+        <w:spacing w:after="0" w:line="360" w:lineRule="auto"/>
         <w:ind w:left="0" w:firstLine="709"/>
         <w:jc w:val="both"/>
         <w:rPr>
@@ -6683,7 +7008,7 @@
           <w:tab w:val="clear" w:pos="720"/>
           <w:tab w:val="left" w:pos="1134"/>
         </w:tabs>
-        <w:spacing w:line="360" w:lineRule="auto"/>
+        <w:spacing w:after="0" w:line="360" w:lineRule="auto"/>
         <w:ind w:left="0" w:firstLine="709"/>
         <w:jc w:val="both"/>
         <w:rPr>
@@ -6738,7 +7063,7 @@
           <w:tab w:val="clear" w:pos="720"/>
           <w:tab w:val="left" w:pos="1134"/>
         </w:tabs>
-        <w:spacing w:line="360" w:lineRule="auto"/>
+        <w:spacing w:after="0" w:line="360" w:lineRule="auto"/>
         <w:ind w:left="0" w:firstLine="709"/>
         <w:jc w:val="both"/>
         <w:rPr>
@@ -6813,7 +7138,7 @@
           <w:tab w:val="clear" w:pos="720"/>
           <w:tab w:val="left" w:pos="1134"/>
         </w:tabs>
-        <w:spacing w:line="360" w:lineRule="auto"/>
+        <w:spacing w:after="0" w:line="360" w:lineRule="auto"/>
         <w:ind w:left="0" w:firstLine="709"/>
         <w:jc w:val="both"/>
         <w:rPr>
@@ -6880,7 +7205,7 @@
     </w:p>
     <w:p>
       <w:pPr>
-        <w:spacing w:line="360" w:lineRule="auto"/>
+        <w:spacing w:after="0" w:line="360" w:lineRule="auto"/>
         <w:ind w:firstLine="709"/>
         <w:jc w:val="both"/>
         <w:rPr>
@@ -6902,7 +7227,7 @@
     </w:p>
     <w:p>
       <w:pPr>
-        <w:spacing w:line="360" w:lineRule="auto"/>
+        <w:spacing w:after="0" w:line="360" w:lineRule="auto"/>
         <w:ind w:firstLine="709"/>
         <w:jc w:val="both"/>
         <w:rPr>
@@ -7025,7 +7350,7 @@
           <w:tab w:val="clear" w:pos="720"/>
           <w:tab w:val="num" w:pos="1134"/>
         </w:tabs>
-        <w:spacing w:line="360" w:lineRule="auto"/>
+        <w:spacing w:after="0" w:line="360" w:lineRule="auto"/>
         <w:ind w:left="0" w:firstLine="709"/>
         <w:jc w:val="both"/>
         <w:rPr>
@@ -7085,7 +7410,7 @@
           <w:tab w:val="clear" w:pos="720"/>
           <w:tab w:val="num" w:pos="1134"/>
         </w:tabs>
-        <w:spacing w:line="360" w:lineRule="auto"/>
+        <w:spacing w:after="0" w:line="360" w:lineRule="auto"/>
         <w:ind w:left="0" w:firstLine="709"/>
         <w:jc w:val="both"/>
         <w:rPr>
@@ -7127,7 +7452,7 @@
           <w:tab w:val="clear" w:pos="720"/>
           <w:tab w:val="num" w:pos="1134"/>
         </w:tabs>
-        <w:spacing w:line="360" w:lineRule="auto"/>
+        <w:spacing w:after="0" w:line="360" w:lineRule="auto"/>
         <w:ind w:left="0" w:firstLine="709"/>
         <w:jc w:val="both"/>
         <w:rPr>
@@ -7256,7 +7581,7 @@
           <w:tab w:val="clear" w:pos="720"/>
           <w:tab w:val="num" w:pos="1134"/>
         </w:tabs>
-        <w:spacing w:line="360" w:lineRule="auto"/>
+        <w:spacing w:after="0" w:line="360" w:lineRule="auto"/>
         <w:ind w:left="0" w:firstLine="709"/>
         <w:jc w:val="both"/>
         <w:rPr>
@@ -7307,7 +7632,7 @@
     </w:p>
     <w:p>
       <w:pPr>
-        <w:spacing w:line="360" w:lineRule="auto"/>
+        <w:spacing w:after="0" w:line="360" w:lineRule="auto"/>
         <w:ind w:firstLine="709"/>
         <w:jc w:val="both"/>
         <w:rPr>
@@ -7374,18 +7699,32 @@
     </w:p>
     <w:p>
       <w:pPr>
-        <w:spacing w:line="360" w:lineRule="auto"/>
+        <w:spacing w:after="0" w:line="360" w:lineRule="auto"/>
         <w:ind w:firstLine="709"/>
-        <w:rPr>
-          <w:rFonts w:ascii="Times New Roman" w:hAnsi="Times New Roman" w:cs="Times New Roman"/>
-          <w:sz w:val="28"/>
-          <w:szCs w:val="28"/>
-        </w:rPr>
-      </w:pPr>
-    </w:p>
-    <w:p>
-      <w:pPr>
-        <w:spacing w:line="360" w:lineRule="auto"/>
+        <w:jc w:val="both"/>
+        <w:rPr>
+          <w:rFonts w:ascii="Times New Roman" w:hAnsi="Times New Roman" w:cs="Times New Roman"/>
+          <w:sz w:val="28"/>
+          <w:szCs w:val="28"/>
+          <w:lang w:val="ru-RU"/>
+        </w:rPr>
+      </w:pPr>
+    </w:p>
+    <w:p>
+      <w:pPr>
+        <w:spacing w:after="0" w:line="360" w:lineRule="auto"/>
+        <w:ind w:firstLine="709"/>
+        <w:rPr>
+          <w:rFonts w:ascii="Times New Roman" w:hAnsi="Times New Roman" w:cs="Times New Roman"/>
+          <w:sz w:val="28"/>
+          <w:szCs w:val="28"/>
+          <w:lang w:val="ru-RU"/>
+        </w:rPr>
+      </w:pPr>
+    </w:p>
+    <w:p>
+      <w:pPr>
+        <w:spacing w:after="0" w:line="360" w:lineRule="auto"/>
         <w:ind w:firstLine="142"/>
         <w:rPr>
           <w:rFonts w:ascii="Times New Roman" w:hAnsi="Times New Roman" w:cs="Times New Roman"/>
@@ -7406,16 +7745,16 @@
         <mc:AlternateContent>
           <mc:Choice Requires="wps">
             <w:drawing>
-              <wp:anchor distT="0" distB="0" distL="114300" distR="114300" simplePos="0" relativeHeight="251661312" behindDoc="0" locked="0" layoutInCell="1" allowOverlap="1" wp14:anchorId="7D669322" wp14:editId="1A736A03">
+              <wp:anchor distT="0" distB="0" distL="114300" distR="114300" simplePos="0" relativeHeight="251661312" behindDoc="0" locked="0" layoutInCell="1" allowOverlap="1" wp14:anchorId="7D669322" wp14:editId="7C56DB22">
                 <wp:simplePos x="0" y="0"/>
                 <wp:positionH relativeFrom="margin">
-                  <wp:posOffset>0</wp:posOffset>
+                  <wp:align>right</wp:align>
                 </wp:positionH>
                 <wp:positionV relativeFrom="paragraph">
-                  <wp:posOffset>-14132</wp:posOffset>
+                  <wp:posOffset>-18341</wp:posOffset>
                 </wp:positionV>
-                <wp:extent cx="6068060" cy="4618990"/>
-                <wp:effectExtent l="0" t="0" r="27940" b="10160"/>
+                <wp:extent cx="6103088" cy="4618990"/>
+                <wp:effectExtent l="0" t="0" r="12065" b="10160"/>
                 <wp:wrapNone/>
                 <wp:docPr id="14" name="Прямоугольник 14"/>
                 <wp:cNvGraphicFramePr/>
@@ -7426,7 +7765,7 @@
                       <wps:spPr>
                         <a:xfrm>
                           <a:off x="0" y="0"/>
-                          <a:ext cx="6068060" cy="4618990"/>
+                          <a:ext cx="6103088" cy="4618990"/>
                         </a:xfrm>
                         <a:prstGeom prst="rect">
                           <a:avLst/>
@@ -7463,12 +7802,15 @@
                     </wps:wsp>
                   </a:graphicData>
                 </a:graphic>
+                <wp14:sizeRelH relativeFrom="margin">
+                  <wp14:pctWidth>0</wp14:pctWidth>
+                </wp14:sizeRelH>
               </wp:anchor>
             </w:drawing>
           </mc:Choice>
           <mc:Fallback>
             <w:pict>
-              <v:rect w14:anchorId="0245B7B0" id="Прямоугольник 14" o:spid="_x0000_s1026" style="position:absolute;margin-left:0;margin-top:-1.1pt;width:477.8pt;height:363.7pt;z-index:251661312;visibility:visible;mso-wrap-style:square;mso-wrap-distance-left:9pt;mso-wrap-distance-top:0;mso-wrap-distance-right:9pt;mso-wrap-distance-bottom:0;mso-position-horizontal:absolute;mso-position-horizontal-relative:margin;mso-position-vertical:absolute;mso-position-vertical-relative:text;v-text-anchor:middle" o:gfxdata="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" filled="f" strokecolor="black [3213]" strokeweight="1pt">
+              <v:rect w14:anchorId="5C05514E" id="Прямоугольник 14" o:spid="_x0000_s1026" style="position:absolute;margin-left:429.35pt;margin-top:-1.45pt;width:480.55pt;height:363.7pt;z-index:251661312;visibility:visible;mso-wrap-style:square;mso-width-percent:0;mso-wrap-distance-left:9pt;mso-wrap-distance-top:0;mso-wrap-distance-right:9pt;mso-wrap-distance-bottom:0;mso-position-horizontal:right;mso-position-horizontal-relative:margin;mso-position-vertical:absolute;mso-position-vertical-relative:text;mso-width-percent:0;mso-width-relative:margin;v-text-anchor:middle" o:gfxdata="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" filled="f" strokecolor="black [3213]" strokeweight="1pt">
                 <w10:wrap anchorx="margin"/>
               </v:rect>
             </w:pict>
@@ -7484,7 +7826,7 @@
           <w:lang w:val="ru-RU"/>
         </w:rPr>
         <w:drawing>
-          <wp:inline distT="0" distB="0" distL="0" distR="0" wp14:anchorId="24852756" wp14:editId="53B36FBA">
+          <wp:inline distT="0" distB="0" distL="0" distR="0" wp14:anchorId="24852756" wp14:editId="3CA0195A">
             <wp:extent cx="5741581" cy="2127044"/>
             <wp:effectExtent l="0" t="0" r="0" b="6985"/>
             <wp:docPr id="11" name="Рисунок 11" descr="Изображение выглядит как текст, снимок экрана, Шрифт, число&#10;&#10;Контент, сгенерированный ИИ, может содержать ошибки."/>
@@ -7528,7 +7870,7 @@
     </w:p>
     <w:p>
       <w:pPr>
-        <w:spacing w:line="360" w:lineRule="auto"/>
+        <w:spacing w:after="0" w:line="360" w:lineRule="auto"/>
         <w:ind w:firstLine="284"/>
         <w:jc w:val="both"/>
         <w:rPr>
@@ -7591,13 +7933,25 @@
     </w:p>
     <w:p>
       <w:pPr>
-        <w:spacing w:line="360" w:lineRule="auto"/>
+        <w:spacing w:after="0" w:line="360" w:lineRule="auto"/>
         <w:ind w:firstLine="709"/>
         <w:jc w:val="center"/>
         <w:rPr>
           <w:rFonts w:ascii="Times New Roman" w:hAnsi="Times New Roman" w:cs="Times New Roman"/>
           <w:sz w:val="28"/>
           <w:szCs w:val="28"/>
+        </w:rPr>
+      </w:pPr>
+    </w:p>
+    <w:p>
+      <w:pPr>
+        <w:spacing w:after="0" w:line="360" w:lineRule="auto"/>
+        <w:ind w:firstLine="709"/>
+        <w:jc w:val="center"/>
+        <w:rPr>
+          <w:rFonts w:ascii="Times New Roman" w:hAnsi="Times New Roman" w:cs="Times New Roman"/>
+          <w:sz w:val="28"/>
+          <w:szCs w:val="28"/>
           <w:lang w:val="ru-RU"/>
         </w:rPr>
       </w:pPr>
@@ -7639,7 +7993,20 @@
     </w:p>
     <w:p>
       <w:pPr>
-        <w:spacing w:line="360" w:lineRule="auto"/>
+        <w:spacing w:after="0" w:line="360" w:lineRule="auto"/>
+        <w:ind w:firstLine="709"/>
+        <w:jc w:val="center"/>
+        <w:rPr>
+          <w:rFonts w:ascii="Times New Roman" w:hAnsi="Times New Roman" w:cs="Times New Roman"/>
+          <w:sz w:val="28"/>
+          <w:szCs w:val="28"/>
+          <w:lang w:val="ru-RU"/>
+        </w:rPr>
+      </w:pPr>
+    </w:p>
+    <w:p>
+      <w:pPr>
+        <w:spacing w:after="0" w:line="360" w:lineRule="auto"/>
         <w:ind w:firstLine="709"/>
         <w:jc w:val="both"/>
         <w:rPr>
@@ -7929,7 +8296,7 @@
     </w:p>
     <w:p>
       <w:pPr>
-        <w:spacing w:line="360" w:lineRule="auto"/>
+        <w:spacing w:after="0" w:line="360" w:lineRule="auto"/>
         <w:ind w:firstLine="709"/>
         <w:jc w:val="both"/>
         <w:rPr>
@@ -7946,8 +8313,17 @@
           <w:szCs w:val="28"/>
           <w:lang w:val="ru-RU"/>
         </w:rPr>
+        <w:t xml:space="preserve">Качественная оценка показала, что алгоритм успешно справляется с поиском штампа на документах хорошего и среднего качества. Точность </w:t>
+      </w:r>
+      <w:r>
+        <w:rPr>
+          <w:rFonts w:ascii="Times New Roman" w:hAnsi="Times New Roman" w:cs="Times New Roman"/>
+          <w:sz w:val="28"/>
+          <w:szCs w:val="28"/>
+          <w:lang w:val="ru-RU"/>
+        </w:rPr>
         <w:lastRenderedPageBreak/>
-        <w:t xml:space="preserve">Качественная оценка показала, что алгоритм успешно справляется с поиском штампа на документах хорошего и среднего качества. Точность распознавания текста напрямую зависит от качества исходного скана и возможностей используемой </w:t>
+        <w:t xml:space="preserve">распознавания текста напрямую зависит от качества исходного скана и возможностей используемой </w:t>
       </w:r>
       <w:r>
         <w:rPr>
@@ -7987,7 +8363,7 @@
     </w:p>
     <w:p>
       <w:pPr>
-        <w:spacing w:line="360" w:lineRule="auto"/>
+        <w:spacing w:after="0" w:line="360" w:lineRule="auto"/>
         <w:ind w:firstLine="709"/>
         <w:jc w:val="both"/>
         <w:rPr>
@@ -8049,6 +8425,7 @@
     </w:p>
     <w:p>
       <w:pPr>
+        <w:spacing w:after="0" w:line="360" w:lineRule="auto"/>
         <w:ind w:firstLine="709"/>
         <w:rPr>
           <w:rFonts w:ascii="Times New Roman" w:eastAsiaTheme="majorEastAsia" w:hAnsi="Times New Roman" w:cs="Times New Roman"/>
@@ -8075,7 +8452,7 @@
     <w:p>
       <w:pPr>
         <w:pStyle w:val="1"/>
-        <w:spacing w:line="360" w:lineRule="auto"/>
+        <w:spacing w:before="0" w:after="0" w:line="360" w:lineRule="auto"/>
         <w:jc w:val="center"/>
         <w:rPr>
           <w:rFonts w:ascii="Times New Roman" w:hAnsi="Times New Roman" w:cs="Times New Roman"/>
@@ -8104,7 +8481,7 @@
     </w:p>
     <w:p>
       <w:pPr>
-        <w:spacing w:after="120" w:line="360" w:lineRule="auto"/>
+        <w:spacing w:after="0" w:line="360" w:lineRule="auto"/>
         <w:ind w:firstLine="709"/>
         <w:jc w:val="both"/>
         <w:rPr>
@@ -8164,7 +8541,7 @@
     </w:p>
     <w:p>
       <w:pPr>
-        <w:spacing w:after="120" w:line="360" w:lineRule="auto"/>
+        <w:spacing w:after="0" w:line="360" w:lineRule="auto"/>
         <w:ind w:firstLine="709"/>
         <w:jc w:val="both"/>
         <w:rPr>
@@ -8186,7 +8563,7 @@
     </w:p>
     <w:p>
       <w:pPr>
-        <w:spacing w:after="120" w:line="360" w:lineRule="auto"/>
+        <w:spacing w:after="0" w:line="360" w:lineRule="auto"/>
         <w:ind w:firstLine="709"/>
         <w:jc w:val="both"/>
         <w:rPr>
@@ -8208,7 +8585,7 @@
     </w:p>
     <w:p>
       <w:pPr>
-        <w:spacing w:after="120" w:line="360" w:lineRule="auto"/>
+        <w:spacing w:after="0" w:line="360" w:lineRule="auto"/>
         <w:ind w:firstLine="709"/>
         <w:jc w:val="both"/>
         <w:rPr>
@@ -8230,7 +8607,7 @@
     </w:p>
     <w:p>
       <w:pPr>
-        <w:spacing w:after="120" w:line="360" w:lineRule="auto"/>
+        <w:spacing w:after="0" w:line="360" w:lineRule="auto"/>
         <w:ind w:firstLine="709"/>
         <w:jc w:val="both"/>
         <w:rPr>
@@ -8252,7 +8629,7 @@
     </w:p>
     <w:p>
       <w:pPr>
-        <w:spacing w:after="120" w:line="360" w:lineRule="auto"/>
+        <w:spacing w:after="0" w:line="360" w:lineRule="auto"/>
         <w:ind w:firstLine="709"/>
         <w:jc w:val="both"/>
         <w:rPr>
@@ -8274,7 +8651,7 @@
     </w:p>
     <w:p>
       <w:pPr>
-        <w:spacing w:after="120" w:line="360" w:lineRule="auto"/>
+        <w:spacing w:after="0" w:line="360" w:lineRule="auto"/>
         <w:ind w:firstLine="709"/>
         <w:jc w:val="both"/>
         <w:rPr>
@@ -8296,7 +8673,7 @@
     </w:p>
     <w:p>
       <w:pPr>
-        <w:spacing w:after="120" w:line="360" w:lineRule="auto"/>
+        <w:spacing w:after="0" w:line="360" w:lineRule="auto"/>
         <w:ind w:firstLine="709"/>
         <w:jc w:val="both"/>
         <w:rPr>
@@ -8318,7 +8695,7 @@
     </w:p>
     <w:p>
       <w:pPr>
-        <w:spacing w:after="120" w:line="360" w:lineRule="auto"/>
+        <w:spacing w:after="0" w:line="360" w:lineRule="auto"/>
         <w:ind w:firstLine="709"/>
         <w:jc w:val="both"/>
         <w:rPr>
@@ -8326,6 +8703,18 @@
           <w:sz w:val="28"/>
           <w:szCs w:val="28"/>
           <w:lang w:val="ru-RU"/>
+        </w:rPr>
+      </w:pPr>
+    </w:p>
+    <w:p>
+      <w:pPr>
+        <w:spacing w:after="0" w:line="360" w:lineRule="auto"/>
+        <w:ind w:firstLine="709"/>
+        <w:jc w:val="both"/>
+        <w:rPr>
+          <w:rFonts w:ascii="Times New Roman" w:eastAsiaTheme="minorEastAsia" w:hAnsi="Times New Roman" w:cs="Times New Roman"/>
+          <w:sz w:val="28"/>
+          <w:szCs w:val="28"/>
         </w:rPr>
       </w:pPr>
       <m:oMathPara>
@@ -8376,29 +8765,19 @@
     </w:p>
     <w:p>
       <w:pPr>
-        <w:spacing w:after="120" w:line="360" w:lineRule="auto"/>
+        <w:spacing w:after="0" w:line="360" w:lineRule="auto"/>
         <w:ind w:firstLine="709"/>
         <w:jc w:val="both"/>
         <w:rPr>
           <w:rFonts w:ascii="Times New Roman" w:hAnsi="Times New Roman" w:cs="Times New Roman"/>
           <w:sz w:val="28"/>
           <w:szCs w:val="28"/>
-          <w:lang w:val="ru-RU"/>
-        </w:rPr>
-      </w:pPr>
-      <w:r>
-        <w:rPr>
-          <w:rFonts w:ascii="Times New Roman" w:hAnsi="Times New Roman" w:cs="Times New Roman"/>
-          <w:sz w:val="28"/>
-          <w:szCs w:val="28"/>
-          <w:lang w:val="ru-RU"/>
-        </w:rPr>
-        <w:t>2. Расчет трудозатрат на автоматизированную обработку</w:t>
-      </w:r>
-    </w:p>
-    <w:p>
-      <w:pPr>
-        <w:spacing w:after="120" w:line="360" w:lineRule="auto"/>
+        </w:rPr>
+      </w:pPr>
+    </w:p>
+    <w:p>
+      <w:pPr>
+        <w:spacing w:after="0" w:line="360" w:lineRule="auto"/>
         <w:ind w:firstLine="709"/>
         <w:jc w:val="both"/>
         <w:rPr>
@@ -8415,12 +8794,12 @@
           <w:szCs w:val="28"/>
           <w:lang w:val="ru-RU"/>
         </w:rPr>
-        <w:t>Исходные данные:</w:t>
-      </w:r>
-    </w:p>
-    <w:p>
-      <w:pPr>
-        <w:spacing w:after="120" w:line="360" w:lineRule="auto"/>
+        <w:t>2. Расчет трудозатрат на автоматизированную обработку</w:t>
+      </w:r>
+    </w:p>
+    <w:p>
+      <w:pPr>
+        <w:spacing w:after="0" w:line="360" w:lineRule="auto"/>
         <w:ind w:firstLine="709"/>
         <w:jc w:val="both"/>
         <w:rPr>
@@ -8437,12 +8816,12 @@
           <w:szCs w:val="28"/>
           <w:lang w:val="ru-RU"/>
         </w:rPr>
-        <w:t>- Время машинной обработки одного чертежа: ~10 секунд.</w:t>
-      </w:r>
-    </w:p>
-    <w:p>
-      <w:pPr>
-        <w:spacing w:after="120" w:line="360" w:lineRule="auto"/>
+        <w:t>Исходные данные:</w:t>
+      </w:r>
+    </w:p>
+    <w:p>
+      <w:pPr>
+        <w:spacing w:after="0" w:line="360" w:lineRule="auto"/>
         <w:ind w:firstLine="709"/>
         <w:jc w:val="both"/>
         <w:rPr>
@@ -8459,12 +8838,12 @@
           <w:szCs w:val="28"/>
           <w:lang w:val="ru-RU"/>
         </w:rPr>
-        <w:t>- Время на верификацию результата оператором: ~20 секунд.</w:t>
-      </w:r>
-    </w:p>
-    <w:p>
-      <w:pPr>
-        <w:spacing w:after="120" w:line="360" w:lineRule="auto"/>
+        <w:t>- Время машинной обработки одного чертежа: ~10 секунд.</w:t>
+      </w:r>
+    </w:p>
+    <w:p>
+      <w:pPr>
+        <w:spacing w:after="0" w:line="360" w:lineRule="auto"/>
         <w:ind w:firstLine="709"/>
         <w:jc w:val="both"/>
         <w:rPr>
@@ -8481,12 +8860,12 @@
           <w:szCs w:val="28"/>
           <w:lang w:val="ru-RU"/>
         </w:rPr>
-        <w:t>- Общее время: 30 секунд (0.0083 часа).</w:t>
-      </w:r>
-    </w:p>
-    <w:p>
-      <w:pPr>
-        <w:spacing w:after="120" w:line="360" w:lineRule="auto"/>
+        <w:t>- Время на верификацию результата оператором: ~20 секунд.</w:t>
+      </w:r>
+    </w:p>
+    <w:p>
+      <w:pPr>
+        <w:spacing w:after="0" w:line="360" w:lineRule="auto"/>
         <w:ind w:firstLine="709"/>
         <w:jc w:val="both"/>
         <w:rPr>
@@ -8503,12 +8882,34 @@
           <w:szCs w:val="28"/>
           <w:lang w:val="ru-RU"/>
         </w:rPr>
+        <w:t>- Общее время: 30 секунд (0.0083 часа).</w:t>
+      </w:r>
+    </w:p>
+    <w:p>
+      <w:pPr>
+        <w:spacing w:after="0" w:line="360" w:lineRule="auto"/>
+        <w:ind w:firstLine="709"/>
+        <w:jc w:val="both"/>
+        <w:rPr>
+          <w:rFonts w:ascii="Times New Roman" w:hAnsi="Times New Roman" w:cs="Times New Roman"/>
+          <w:sz w:val="28"/>
+          <w:szCs w:val="28"/>
+          <w:lang w:val="ru-RU"/>
+        </w:rPr>
+      </w:pPr>
+      <w:r>
+        <w:rPr>
+          <w:rFonts w:ascii="Times New Roman" w:hAnsi="Times New Roman" w:cs="Times New Roman"/>
+          <w:sz w:val="28"/>
+          <w:szCs w:val="28"/>
+          <w:lang w:val="ru-RU"/>
+        </w:rPr>
         <w:t>Стоимость автоматизированной обработки одного листа:</w:t>
       </w:r>
     </w:p>
     <w:p>
       <w:pPr>
-        <w:spacing w:after="120" w:line="360" w:lineRule="auto"/>
+        <w:spacing w:after="0" w:line="360" w:lineRule="auto"/>
         <w:ind w:firstLine="709"/>
         <w:jc w:val="both"/>
         <w:rPr>
@@ -8573,7 +8974,7 @@
     </w:p>
     <w:p>
       <w:pPr>
-        <w:spacing w:after="120" w:line="360" w:lineRule="auto"/>
+        <w:spacing w:after="0" w:line="360" w:lineRule="auto"/>
         <w:ind w:firstLine="709"/>
         <w:jc w:val="both"/>
         <w:rPr>
@@ -8595,7 +8996,7 @@
     </w:p>
     <w:p>
       <w:pPr>
-        <w:spacing w:after="120" w:line="360" w:lineRule="auto"/>
+        <w:spacing w:after="0" w:line="360" w:lineRule="auto"/>
         <w:ind w:firstLine="709"/>
         <w:jc w:val="both"/>
         <w:rPr>
@@ -8617,7 +9018,20 @@
     </w:p>
     <w:p>
       <w:pPr>
-        <w:spacing w:after="120" w:line="360" w:lineRule="auto"/>
+        <w:spacing w:after="0" w:line="360" w:lineRule="auto"/>
+        <w:ind w:firstLine="709"/>
+        <w:jc w:val="both"/>
+        <w:rPr>
+          <w:rFonts w:ascii="Times New Roman" w:hAnsi="Times New Roman" w:cs="Times New Roman"/>
+          <w:sz w:val="28"/>
+          <w:szCs w:val="28"/>
+          <w:lang w:val="ru-RU"/>
+        </w:rPr>
+      </w:pPr>
+    </w:p>
+    <w:p>
+      <w:pPr>
+        <w:spacing w:after="0" w:line="360" w:lineRule="auto"/>
         <w:ind w:firstLine="709"/>
         <w:jc w:val="both"/>
         <w:rPr>
@@ -8753,7 +9167,7 @@
     </w:p>
     <w:p>
       <w:pPr>
-        <w:spacing w:after="120" w:line="360" w:lineRule="auto"/>
+        <w:spacing w:after="0" w:line="360" w:lineRule="auto"/>
         <w:ind w:firstLine="709"/>
         <w:jc w:val="both"/>
         <w:rPr>
@@ -8765,7 +9179,7 @@
     </w:p>
     <w:p>
       <w:pPr>
-        <w:spacing w:after="120" w:line="360" w:lineRule="auto"/>
+        <w:spacing w:after="0" w:line="360" w:lineRule="auto"/>
         <w:ind w:firstLine="709"/>
         <w:jc w:val="both"/>
         <w:rPr>
@@ -8787,7 +9201,7 @@
     </w:p>
     <w:p>
       <w:pPr>
-        <w:spacing w:after="120" w:line="360" w:lineRule="auto"/>
+        <w:spacing w:after="0" w:line="360" w:lineRule="auto"/>
         <w:ind w:firstLine="709"/>
         <w:jc w:val="both"/>
         <w:rPr>
@@ -8804,7 +9218,6 @@
           <w:szCs w:val="28"/>
           <w:lang w:val="ru-RU"/>
         </w:rPr>
-        <w:lastRenderedPageBreak/>
         <w:t xml:space="preserve">- Затраты при ручной обработке: </w:t>
       </w:r>
       <m:oMath>
@@ -8821,7 +9234,7 @@
     </w:p>
     <w:p>
       <w:pPr>
-        <w:spacing w:after="120" w:line="360" w:lineRule="auto"/>
+        <w:spacing w:after="0" w:line="360" w:lineRule="auto"/>
         <w:ind w:firstLine="709"/>
         <w:jc w:val="both"/>
         <w:rPr>
@@ -8854,7 +9267,7 @@
     </w:p>
     <w:p>
       <w:pPr>
-        <w:spacing w:after="120" w:line="360" w:lineRule="auto"/>
+        <w:spacing w:after="0" w:line="360" w:lineRule="auto"/>
         <w:ind w:firstLine="709"/>
         <w:jc w:val="both"/>
         <w:rPr>
@@ -8871,16 +9284,30 @@
           <w:szCs w:val="28"/>
           <w:lang w:val="ru-RU"/>
         </w:rPr>
+        <w:lastRenderedPageBreak/>
         <w:t>Годовой экономический эффект от внедрения системы (при обработке 24 000 листов в год) составит:</w:t>
       </w:r>
     </w:p>
     <w:p>
       <w:pPr>
-        <w:spacing w:after="120" w:line="360" w:lineRule="auto"/>
+        <w:spacing w:after="0" w:line="360" w:lineRule="auto"/>
         <w:ind w:firstLine="709"/>
         <w:jc w:val="both"/>
         <w:rPr>
           <w:rFonts w:ascii="Times New Roman" w:hAnsi="Times New Roman" w:cs="Times New Roman"/>
+          <w:sz w:val="28"/>
+          <w:szCs w:val="28"/>
+          <w:lang w:val="ru-RU"/>
+        </w:rPr>
+      </w:pPr>
+    </w:p>
+    <w:p>
+      <w:pPr>
+        <w:spacing w:after="0" w:line="360" w:lineRule="auto"/>
+        <w:ind w:firstLine="709"/>
+        <w:jc w:val="both"/>
+        <w:rPr>
+          <w:rFonts w:ascii="Times New Roman" w:eastAsiaTheme="minorEastAsia" w:hAnsi="Times New Roman" w:cs="Times New Roman"/>
           <w:sz w:val="28"/>
           <w:szCs w:val="28"/>
         </w:rPr>
@@ -8933,13 +9360,25 @@
     </w:p>
     <w:p>
       <w:pPr>
-        <w:spacing w:after="120" w:line="360" w:lineRule="auto"/>
+        <w:spacing w:after="0" w:line="360" w:lineRule="auto"/>
         <w:ind w:firstLine="709"/>
         <w:jc w:val="both"/>
         <w:rPr>
           <w:rFonts w:ascii="Times New Roman" w:hAnsi="Times New Roman" w:cs="Times New Roman"/>
           <w:sz w:val="28"/>
           <w:szCs w:val="28"/>
+        </w:rPr>
+      </w:pPr>
+    </w:p>
+    <w:p>
+      <w:pPr>
+        <w:spacing w:after="0" w:line="360" w:lineRule="auto"/>
+        <w:ind w:firstLine="709"/>
+        <w:jc w:val="both"/>
+        <w:rPr>
+          <w:rFonts w:ascii="Times New Roman" w:hAnsi="Times New Roman" w:cs="Times New Roman"/>
+          <w:sz w:val="28"/>
+          <w:szCs w:val="28"/>
           <w:lang w:val="ru-RU"/>
         </w:rPr>
       </w:pPr>
@@ -8955,6 +9394,7 @@
     </w:p>
     <w:p>
       <w:pPr>
+        <w:spacing w:after="0" w:line="360" w:lineRule="auto"/>
         <w:ind w:firstLine="709"/>
         <w:rPr>
           <w:rFonts w:ascii="Times New Roman" w:eastAsiaTheme="majorEastAsia" w:hAnsi="Times New Roman" w:cs="Times New Roman"/>
@@ -8981,7 +9421,7 @@
     <w:p>
       <w:pPr>
         <w:pStyle w:val="1"/>
-        <w:spacing w:line="360" w:lineRule="auto"/>
+        <w:spacing w:before="0" w:after="0" w:line="360" w:lineRule="auto"/>
         <w:jc w:val="center"/>
         <w:rPr>
           <w:rFonts w:ascii="Times New Roman" w:hAnsi="Times New Roman" w:cs="Times New Roman"/>
@@ -9010,7 +9450,7 @@
     </w:p>
     <w:p>
       <w:pPr>
-        <w:spacing w:line="360" w:lineRule="auto"/>
+        <w:spacing w:after="0" w:line="360" w:lineRule="auto"/>
         <w:ind w:firstLine="709"/>
         <w:jc w:val="both"/>
         <w:rPr>
@@ -9032,7 +9472,7 @@
     </w:p>
     <w:p>
       <w:pPr>
-        <w:spacing w:line="360" w:lineRule="auto"/>
+        <w:spacing w:after="0" w:line="360" w:lineRule="auto"/>
         <w:ind w:firstLine="709"/>
         <w:jc w:val="both"/>
         <w:rPr>
@@ -9057,7 +9497,7 @@
         <w:tabs>
           <w:tab w:val="left" w:pos="1260"/>
         </w:tabs>
-        <w:spacing w:line="360" w:lineRule="auto"/>
+        <w:spacing w:after="0" w:line="360" w:lineRule="auto"/>
         <w:ind w:firstLine="709"/>
         <w:jc w:val="both"/>
         <w:rPr>
@@ -9144,7 +9584,7 @@
         <w:tabs>
           <w:tab w:val="left" w:pos="1260"/>
         </w:tabs>
-        <w:spacing w:line="360" w:lineRule="auto"/>
+        <w:spacing w:after="0" w:line="360" w:lineRule="auto"/>
         <w:ind w:firstLine="709"/>
         <w:jc w:val="both"/>
         <w:rPr>
@@ -9196,7 +9636,7 @@
         <w:tabs>
           <w:tab w:val="left" w:pos="1260"/>
         </w:tabs>
-        <w:spacing w:line="360" w:lineRule="auto"/>
+        <w:spacing w:after="0" w:line="360" w:lineRule="auto"/>
         <w:ind w:firstLine="709"/>
         <w:jc w:val="both"/>
         <w:rPr>
@@ -9248,7 +9688,7 @@
         <w:tabs>
           <w:tab w:val="left" w:pos="1260"/>
         </w:tabs>
-        <w:spacing w:line="360" w:lineRule="auto"/>
+        <w:spacing w:after="0" w:line="360" w:lineRule="auto"/>
         <w:ind w:firstLine="709"/>
         <w:jc w:val="both"/>
         <w:rPr>
@@ -9389,7 +9829,10 @@
     </w:p>
     <w:p>
       <w:pPr>
-        <w:spacing w:before="120" w:after="240" w:line="276" w:lineRule="auto"/>
+        <w:tabs>
+          <w:tab w:val="left" w:pos="1276"/>
+        </w:tabs>
+        <w:spacing w:after="0" w:line="360" w:lineRule="auto"/>
         <w:ind w:firstLine="709"/>
         <w:jc w:val="both"/>
         <w:rPr>
@@ -9424,6 +9867,15 @@
           <w:szCs w:val="28"/>
           <w:lang w:val="ru-RU"/>
         </w:rPr>
+        <w:tab/>
+      </w:r>
+      <w:r>
+        <w:rPr>
+          <w:rFonts w:ascii="Times New Roman" w:hAnsi="Times New Roman" w:cs="Times New Roman"/>
+          <w:sz w:val="28"/>
+          <w:szCs w:val="28"/>
+          <w:lang w:val="ru-RU"/>
+        </w:rPr>
         <w:t>ГОСТ 2.104</w:t>
       </w:r>
       <w:r>
@@ -9604,7 +10056,10 @@
     </w:p>
     <w:p>
       <w:pPr>
-        <w:spacing w:before="120" w:after="240" w:line="276" w:lineRule="auto"/>
+        <w:tabs>
+          <w:tab w:val="left" w:pos="1276"/>
+        </w:tabs>
+        <w:spacing w:after="0" w:line="360" w:lineRule="auto"/>
         <w:ind w:firstLine="709"/>
         <w:jc w:val="both"/>
         <w:rPr>
@@ -9621,7 +10076,7 @@
           <w:szCs w:val="28"/>
           <w:lang w:val="ru-RU"/>
         </w:rPr>
-        <w:t xml:space="preserve">2. </w:t>
+        <w:t>2.</w:t>
       </w:r>
       <w:r>
         <w:rPr>
@@ -9639,6 +10094,15 @@
           <w:szCs w:val="28"/>
           <w:lang w:val="ru-RU"/>
         </w:rPr>
+        <w:tab/>
+      </w:r>
+      <w:r>
+        <w:rPr>
+          <w:rFonts w:ascii="Times New Roman" w:hAnsi="Times New Roman" w:cs="Times New Roman"/>
+          <w:sz w:val="28"/>
+          <w:szCs w:val="28"/>
+          <w:lang w:val="ru-RU"/>
+        </w:rPr>
         <w:t>ГОСТ Р 21.101</w:t>
       </w:r>
       <w:r>
@@ -9792,7 +10256,10 @@
     </w:p>
     <w:p>
       <w:pPr>
-        <w:spacing w:before="120" w:after="240" w:line="276" w:lineRule="auto"/>
+        <w:tabs>
+          <w:tab w:val="left" w:pos="1276"/>
+        </w:tabs>
+        <w:spacing w:after="0" w:line="360" w:lineRule="auto"/>
         <w:ind w:firstLine="709"/>
         <w:jc w:val="both"/>
         <w:rPr>
@@ -9809,7 +10276,25 @@
           <w:szCs w:val="28"/>
           <w:lang w:val="ru-RU"/>
         </w:rPr>
-        <w:t>3.  ГОСТ 19.701</w:t>
+        <w:t>3.</w:t>
+      </w:r>
+      <w:r>
+        <w:rPr>
+          <w:rFonts w:ascii="Times New Roman" w:hAnsi="Times New Roman" w:cs="Times New Roman"/>
+          <w:sz w:val="28"/>
+          <w:szCs w:val="28"/>
+          <w:lang w:val="ru-RU"/>
+        </w:rPr>
+        <w:tab/>
+      </w:r>
+      <w:r>
+        <w:rPr>
+          <w:rFonts w:ascii="Times New Roman" w:hAnsi="Times New Roman" w:cs="Times New Roman"/>
+          <w:sz w:val="28"/>
+          <w:szCs w:val="28"/>
+          <w:lang w:val="ru-RU"/>
+        </w:rPr>
+        <w:t>ГОСТ 19.701</w:t>
       </w:r>
       <w:r>
         <w:rPr>
@@ -9942,7 +10427,10 @@
     </w:p>
     <w:p>
       <w:pPr>
-        <w:spacing w:before="120" w:after="240" w:line="276" w:lineRule="auto"/>
+        <w:tabs>
+          <w:tab w:val="left" w:pos="1276"/>
+        </w:tabs>
+        <w:spacing w:after="0" w:line="360" w:lineRule="auto"/>
         <w:ind w:firstLine="709"/>
         <w:jc w:val="both"/>
         <w:rPr>
@@ -9959,7 +10447,25 @@
           <w:szCs w:val="28"/>
           <w:lang w:val="ru-RU"/>
         </w:rPr>
-        <w:t xml:space="preserve">4.  ГОСТ 19.401-78. </w:t>
+        <w:t>4.</w:t>
+      </w:r>
+      <w:r>
+        <w:rPr>
+          <w:rFonts w:ascii="Times New Roman" w:hAnsi="Times New Roman" w:cs="Times New Roman"/>
+          <w:sz w:val="28"/>
+          <w:szCs w:val="28"/>
+          <w:lang w:val="ru-RU"/>
+        </w:rPr>
+        <w:tab/>
+      </w:r>
+      <w:r>
+        <w:rPr>
+          <w:rFonts w:ascii="Times New Roman" w:hAnsi="Times New Roman" w:cs="Times New Roman"/>
+          <w:sz w:val="28"/>
+          <w:szCs w:val="28"/>
+          <w:lang w:val="ru-RU"/>
+        </w:rPr>
+        <w:t xml:space="preserve">ГОСТ 19.401-78. </w:t>
       </w:r>
       <w:r>
         <w:rPr>
@@ -10038,7 +10544,10 @@
     </w:p>
     <w:p>
       <w:pPr>
-        <w:spacing w:before="120" w:after="240" w:line="276" w:lineRule="auto"/>
+        <w:tabs>
+          <w:tab w:val="left" w:pos="1276"/>
+        </w:tabs>
+        <w:spacing w:after="0" w:line="360" w:lineRule="auto"/>
         <w:ind w:firstLine="709"/>
         <w:jc w:val="both"/>
         <w:rPr>
@@ -10053,7 +10562,23 @@
           <w:sz w:val="28"/>
           <w:szCs w:val="28"/>
         </w:rPr>
-        <w:t xml:space="preserve">5.  Yadav, A. OCR using CRNN: A Deep Learning Approach for Text Recognition / A. Yadav, S. Singh, A. </w:t>
+        <w:t>5.</w:t>
+      </w:r>
+      <w:r>
+        <w:rPr>
+          <w:rFonts w:ascii="Times New Roman" w:hAnsi="Times New Roman" w:cs="Times New Roman"/>
+          <w:sz w:val="28"/>
+          <w:szCs w:val="28"/>
+        </w:rPr>
+        <w:tab/>
+      </w:r>
+      <w:r>
+        <w:rPr>
+          <w:rFonts w:ascii="Times New Roman" w:hAnsi="Times New Roman" w:cs="Times New Roman"/>
+          <w:sz w:val="28"/>
+          <w:szCs w:val="28"/>
+        </w:rPr>
+        <w:t xml:space="preserve">Yadav, A. OCR using CRNN: A Deep Learning Approach for Text Recognition / A. Yadav, S. Singh, A. </w:t>
       </w:r>
       <w:proofErr w:type="spellStart"/>
       <w:r>
@@ -10117,7 +10642,10 @@
     </w:p>
     <w:p>
       <w:pPr>
-        <w:spacing w:before="120" w:after="240" w:line="276" w:lineRule="auto"/>
+        <w:tabs>
+          <w:tab w:val="left" w:pos="1276"/>
+        </w:tabs>
+        <w:spacing w:after="0" w:line="360" w:lineRule="auto"/>
         <w:ind w:firstLine="709"/>
         <w:jc w:val="both"/>
         <w:rPr>
@@ -10132,7 +10660,23 @@
           <w:sz w:val="28"/>
           <w:szCs w:val="28"/>
         </w:rPr>
-        <w:t xml:space="preserve">6.  Prakash, P. CRNN model for text detection and classification from natural scenes / P. Prakash, S. </w:t>
+        <w:t>6.</w:t>
+      </w:r>
+      <w:r>
+        <w:rPr>
+          <w:rFonts w:ascii="Times New Roman" w:hAnsi="Times New Roman" w:cs="Times New Roman"/>
+          <w:sz w:val="28"/>
+          <w:szCs w:val="28"/>
+        </w:rPr>
+        <w:tab/>
+      </w:r>
+      <w:r>
+        <w:rPr>
+          <w:rFonts w:ascii="Times New Roman" w:hAnsi="Times New Roman" w:cs="Times New Roman"/>
+          <w:sz w:val="28"/>
+          <w:szCs w:val="28"/>
+        </w:rPr>
+        <w:t xml:space="preserve">Prakash, P. CRNN model for text detection and classification from natural scenes / P. Prakash, S. </w:t>
       </w:r>
       <w:proofErr w:type="spellStart"/>
       <w:r>
@@ -10230,7 +10774,10 @@
     </w:p>
     <w:p>
       <w:pPr>
-        <w:spacing w:before="120" w:after="240" w:line="276" w:lineRule="auto"/>
+        <w:tabs>
+          <w:tab w:val="left" w:pos="1276"/>
+        </w:tabs>
+        <w:spacing w:after="0" w:line="360" w:lineRule="auto"/>
         <w:ind w:firstLine="709"/>
         <w:jc w:val="both"/>
         <w:rPr>
@@ -10245,7 +10792,23 @@
           <w:sz w:val="28"/>
           <w:szCs w:val="28"/>
         </w:rPr>
-        <w:t xml:space="preserve">7.  A Text Recognition Model Based on Multi-Scale Fusion CRNN / J. </w:t>
+        <w:t xml:space="preserve">7. </w:t>
+      </w:r>
+      <w:r>
+        <w:rPr>
+          <w:rFonts w:ascii="Times New Roman" w:hAnsi="Times New Roman" w:cs="Times New Roman"/>
+          <w:sz w:val="28"/>
+          <w:szCs w:val="28"/>
+        </w:rPr>
+        <w:tab/>
+      </w:r>
+      <w:r>
+        <w:rPr>
+          <w:rFonts w:ascii="Times New Roman" w:hAnsi="Times New Roman" w:cs="Times New Roman"/>
+          <w:sz w:val="28"/>
+          <w:szCs w:val="28"/>
+        </w:rPr>
+        <w:t xml:space="preserve">A Text Recognition Model Based on Multi-Scale Fusion CRNN / J. </w:t>
       </w:r>
       <w:proofErr w:type="spellStart"/>
       <w:r>
@@ -10316,7 +10879,10 @@
     </w:p>
     <w:p>
       <w:pPr>
-        <w:spacing w:before="120" w:after="240" w:line="276" w:lineRule="auto"/>
+        <w:tabs>
+          <w:tab w:val="left" w:pos="1276"/>
+        </w:tabs>
+        <w:spacing w:after="0" w:line="360" w:lineRule="auto"/>
         <w:ind w:firstLine="709"/>
         <w:jc w:val="both"/>
         <w:rPr>
@@ -10331,7 +10897,15 @@
           <w:sz w:val="28"/>
           <w:szCs w:val="28"/>
         </w:rPr>
-        <w:t xml:space="preserve">8.  </w:t>
+        <w:t>8.</w:t>
+      </w:r>
+      <w:r>
+        <w:rPr>
+          <w:rFonts w:ascii="Times New Roman" w:hAnsi="Times New Roman" w:cs="Times New Roman"/>
+          <w:sz w:val="28"/>
+          <w:szCs w:val="28"/>
+        </w:rPr>
+        <w:tab/>
       </w:r>
       <w:proofErr w:type="spellStart"/>
       <w:r>
@@ -10544,7 +11118,10 @@
     </w:p>
     <w:p>
       <w:pPr>
-        <w:spacing w:before="120" w:after="240" w:line="276" w:lineRule="auto"/>
+        <w:tabs>
+          <w:tab w:val="left" w:pos="1276"/>
+        </w:tabs>
+        <w:spacing w:after="0" w:line="360" w:lineRule="auto"/>
         <w:ind w:firstLine="709"/>
         <w:jc w:val="both"/>
         <w:rPr>
@@ -10561,7 +11138,25 @@
           <w:szCs w:val="28"/>
           <w:lang w:val="ru-RU"/>
         </w:rPr>
-        <w:t xml:space="preserve">9.  Документация </w:t>
+        <w:t xml:space="preserve">9. </w:t>
+      </w:r>
+      <w:r>
+        <w:rPr>
+          <w:rFonts w:ascii="Times New Roman" w:hAnsi="Times New Roman" w:cs="Times New Roman"/>
+          <w:sz w:val="28"/>
+          <w:szCs w:val="28"/>
+          <w:lang w:val="ru-RU"/>
+        </w:rPr>
+        <w:tab/>
+      </w:r>
+      <w:r>
+        <w:rPr>
+          <w:rFonts w:ascii="Times New Roman" w:hAnsi="Times New Roman" w:cs="Times New Roman"/>
+          <w:sz w:val="28"/>
+          <w:szCs w:val="28"/>
+          <w:lang w:val="ru-RU"/>
+        </w:rPr>
+        <w:t xml:space="preserve">Документация </w:t>
       </w:r>
       <w:proofErr w:type="spellStart"/>
       <w:r>
@@ -10746,7 +11341,10 @@
     </w:p>
     <w:p>
       <w:pPr>
-        <w:spacing w:before="120" w:after="240" w:line="276" w:lineRule="auto"/>
+        <w:tabs>
+          <w:tab w:val="left" w:pos="1276"/>
+        </w:tabs>
+        <w:spacing w:after="0" w:line="360" w:lineRule="auto"/>
         <w:ind w:firstLine="709"/>
         <w:jc w:val="both"/>
         <w:rPr>
@@ -10763,7 +11361,25 @@
           <w:szCs w:val="28"/>
           <w:lang w:val="ru-RU"/>
         </w:rPr>
-        <w:t xml:space="preserve">10. Документация библиотеки </w:t>
+        <w:t>10.</w:t>
+      </w:r>
+      <w:r>
+        <w:rPr>
+          <w:rFonts w:ascii="Times New Roman" w:hAnsi="Times New Roman" w:cs="Times New Roman"/>
+          <w:sz w:val="28"/>
+          <w:szCs w:val="28"/>
+          <w:lang w:val="ru-RU"/>
+        </w:rPr>
+        <w:tab/>
+      </w:r>
+      <w:r>
+        <w:rPr>
+          <w:rFonts w:ascii="Times New Roman" w:hAnsi="Times New Roman" w:cs="Times New Roman"/>
+          <w:sz w:val="28"/>
+          <w:szCs w:val="28"/>
+          <w:lang w:val="ru-RU"/>
+        </w:rPr>
+        <w:t xml:space="preserve">Документация библиотеки </w:t>
       </w:r>
       <w:r>
         <w:rPr>
@@ -10924,32 +11540,7 @@
         </w:rPr>
         <w:t>).</w:t>
       </w:r>
-    </w:p>
-    <w:p>
-      <w:pPr>
-        <w:spacing w:after="120" w:line="360" w:lineRule="auto"/>
-        <w:ind w:firstLine="709"/>
-        <w:rPr>
-          <w:rFonts w:ascii="Times New Roman" w:eastAsiaTheme="majorEastAsia" w:hAnsi="Times New Roman" w:cs="Times New Roman"/>
-          <w:b/>
-          <w:bCs/>
-          <w:sz w:val="28"/>
-          <w:szCs w:val="28"/>
-          <w:lang w:val="ru-RU"/>
-        </w:rPr>
-      </w:pPr>
       <w:bookmarkStart w:id="13" w:name="_Toc222767896"/>
-      <w:r>
-        <w:rPr>
-          <w:rFonts w:ascii="Times New Roman" w:hAnsi="Times New Roman" w:cs="Times New Roman"/>
-          <w:b/>
-          <w:bCs/>
-          <w:sz w:val="28"/>
-          <w:szCs w:val="28"/>
-          <w:lang w:val="ru-RU"/>
-        </w:rPr>
-        <w:br w:type="page"/>
-      </w:r>
     </w:p>
     <w:p>
       <w:pPr>
@@ -10966,7 +11557,12 @@
           <w:lang w:val="ru-RU"/>
         </w:rPr>
       </w:pPr>
-      <w:r>
+    </w:p>
+    <w:p>
+      <w:pPr>
+        <w:pStyle w:val="1"/>
+        <w:spacing w:line="276" w:lineRule="auto"/>
+        <w:jc w:val="center"/>
         <w:rPr>
           <w:rFonts w:ascii="Times New Roman" w:hAnsi="Times New Roman" w:cs="Times New Roman"/>
           <w:b/>
@@ -10976,7 +11572,17 @@
           <w:szCs w:val="28"/>
           <w:lang w:val="ru-RU"/>
         </w:rPr>
-        <w:lastRenderedPageBreak/>
+      </w:pPr>
+      <w:r>
+        <w:rPr>
+          <w:rFonts w:ascii="Times New Roman" w:hAnsi="Times New Roman" w:cs="Times New Roman"/>
+          <w:b/>
+          <w:bCs/>
+          <w:color w:val="auto"/>
+          <w:sz w:val="28"/>
+          <w:szCs w:val="28"/>
+          <w:lang w:val="ru-RU"/>
+        </w:rPr>
         <w:t xml:space="preserve">Приложение А. </w:t>
       </w:r>
       <w:hyperlink r:id="rId13" w:history="1">
@@ -11190,6 +11796,7 @@
         <w:t xml:space="preserve">def </w:t>
       </w:r>
       <w:proofErr w:type="spellStart"/>
+      <w:proofErr w:type="gramStart"/>
       <w:r>
         <w:rPr>
           <w:rFonts w:ascii="Times New Roman" w:hAnsi="Times New Roman" w:cs="Times New Roman"/>
@@ -11205,7 +11812,16 @@
           <w:sz w:val="28"/>
           <w:szCs w:val="28"/>
         </w:rPr>
-        <w:t xml:space="preserve">(image: </w:t>
+        <w:t>(</w:t>
+      </w:r>
+      <w:proofErr w:type="gramEnd"/>
+      <w:r>
+        <w:rPr>
+          <w:rFonts w:ascii="Times New Roman" w:hAnsi="Times New Roman" w:cs="Times New Roman"/>
+          <w:sz w:val="28"/>
+          <w:szCs w:val="28"/>
+        </w:rPr>
+        <w:t xml:space="preserve">image: </w:t>
       </w:r>
       <w:proofErr w:type="spellStart"/>
       <w:r>
@@ -11493,7 +12109,25 @@
           <w:sz w:val="28"/>
           <w:szCs w:val="28"/>
         </w:rPr>
-        <w:t xml:space="preserve">    if lines is None:</w:t>
+        <w:t xml:space="preserve">    if lines </w:t>
+      </w:r>
+      <w:proofErr w:type="gramStart"/>
+      <w:r>
+        <w:rPr>
+          <w:rFonts w:ascii="Times New Roman" w:hAnsi="Times New Roman" w:cs="Times New Roman"/>
+          <w:sz w:val="28"/>
+          <w:szCs w:val="28"/>
+        </w:rPr>
+        <w:t>is</w:t>
+      </w:r>
+      <w:proofErr w:type="gramEnd"/>
+      <w:r>
+        <w:rPr>
+          <w:rFonts w:ascii="Times New Roman" w:hAnsi="Times New Roman" w:cs="Times New Roman"/>
+          <w:sz w:val="28"/>
+          <w:szCs w:val="28"/>
+        </w:rPr>
+        <w:t xml:space="preserve"> None:</w:t>
       </w:r>
     </w:p>
     <w:p>
@@ -11575,7 +12209,25 @@
           <w:sz w:val="28"/>
           <w:szCs w:val="28"/>
         </w:rPr>
-        <w:t xml:space="preserve">        x1, y1, x2, y2 = line[0]</w:t>
+        <w:t xml:space="preserve">        x1, y1, x2, y2 = </w:t>
+      </w:r>
+      <w:proofErr w:type="gramStart"/>
+      <w:r>
+        <w:rPr>
+          <w:rFonts w:ascii="Times New Roman" w:hAnsi="Times New Roman" w:cs="Times New Roman"/>
+          <w:sz w:val="28"/>
+          <w:szCs w:val="28"/>
+        </w:rPr>
+        <w:t>line[</w:t>
+      </w:r>
+      <w:proofErr w:type="gramEnd"/>
+      <w:r>
+        <w:rPr>
+          <w:rFonts w:ascii="Times New Roman" w:hAnsi="Times New Roman" w:cs="Times New Roman"/>
+          <w:sz w:val="28"/>
+          <w:szCs w:val="28"/>
+        </w:rPr>
+        <w:t>0]</w:t>
       </w:r>
     </w:p>
     <w:p>
@@ -11593,7 +12245,25 @@
           <w:sz w:val="28"/>
           <w:szCs w:val="28"/>
         </w:rPr>
-        <w:t xml:space="preserve">        angle = np.rad2deg(np.arctan2(y2 - y1, x2 - x1))</w:t>
+        <w:t xml:space="preserve">        angle = </w:t>
+      </w:r>
+      <w:proofErr w:type="gramStart"/>
+      <w:r>
+        <w:rPr>
+          <w:rFonts w:ascii="Times New Roman" w:hAnsi="Times New Roman" w:cs="Times New Roman"/>
+          <w:sz w:val="28"/>
+          <w:szCs w:val="28"/>
+        </w:rPr>
+        <w:t>np.rad</w:t>
+      </w:r>
+      <w:proofErr w:type="gramEnd"/>
+      <w:r>
+        <w:rPr>
+          <w:rFonts w:ascii="Times New Roman" w:hAnsi="Times New Roman" w:cs="Times New Roman"/>
+          <w:sz w:val="28"/>
+          <w:szCs w:val="28"/>
+        </w:rPr>
+        <w:t>2deg(np.arctan2(y2 - y1, x2 - x1))</w:t>
       </w:r>
     </w:p>
     <w:p>
@@ -11612,7 +12282,16 @@
           <w:sz w:val="28"/>
           <w:szCs w:val="28"/>
         </w:rPr>
-        <w:t xml:space="preserve">        angles</w:t>
+        <w:t xml:space="preserve">        </w:t>
+      </w:r>
+      <w:proofErr w:type="gramStart"/>
+      <w:r>
+        <w:rPr>
+          <w:rFonts w:ascii="Times New Roman" w:hAnsi="Times New Roman" w:cs="Times New Roman"/>
+          <w:sz w:val="28"/>
+          <w:szCs w:val="28"/>
+        </w:rPr>
+        <w:t>angles</w:t>
       </w:r>
       <w:r>
         <w:rPr>
@@ -11631,6 +12310,7 @@
         </w:rPr>
         <w:t>append</w:t>
       </w:r>
+      <w:proofErr w:type="gramEnd"/>
       <w:r>
         <w:rPr>
           <w:rFonts w:ascii="Times New Roman" w:hAnsi="Times New Roman" w:cs="Times New Roman"/>
@@ -11726,6 +12406,7 @@
         <w:t xml:space="preserve"> = </w:t>
       </w:r>
       <w:proofErr w:type="spellStart"/>
+      <w:proofErr w:type="gramStart"/>
       <w:r>
         <w:rPr>
           <w:rFonts w:ascii="Times New Roman" w:hAnsi="Times New Roman" w:cs="Times New Roman"/>
@@ -11735,6 +12416,7 @@
         <w:t>np.median</w:t>
       </w:r>
       <w:proofErr w:type="spellEnd"/>
+      <w:proofErr w:type="gramEnd"/>
       <w:r>
         <w:rPr>
           <w:rFonts w:ascii="Times New Roman" w:hAnsi="Times New Roman" w:cs="Times New Roman"/>
@@ -11762,6 +12444,7 @@
         <w:t xml:space="preserve">    (h, w) = </w:t>
       </w:r>
       <w:proofErr w:type="spellStart"/>
+      <w:proofErr w:type="gramStart"/>
       <w:r>
         <w:rPr>
           <w:rFonts w:ascii="Times New Roman" w:hAnsi="Times New Roman" w:cs="Times New Roman"/>
@@ -11771,6 +12454,7 @@
         <w:t>image.shape</w:t>
       </w:r>
       <w:proofErr w:type="spellEnd"/>
+      <w:proofErr w:type="gramEnd"/>
       <w:r>
         <w:rPr>
           <w:rFonts w:ascii="Times New Roman" w:hAnsi="Times New Roman" w:cs="Times New Roman"/>
@@ -11831,7 +12515,25 @@
           <w:sz w:val="28"/>
           <w:szCs w:val="28"/>
         </w:rPr>
-        <w:t xml:space="preserve"> = cv2.getRotationMatrix2D(center, </w:t>
+        <w:t xml:space="preserve"> = cv2.getRotationMatrix2</w:t>
+      </w:r>
+      <w:proofErr w:type="gramStart"/>
+      <w:r>
+        <w:rPr>
+          <w:rFonts w:ascii="Times New Roman" w:hAnsi="Times New Roman" w:cs="Times New Roman"/>
+          <w:sz w:val="28"/>
+          <w:szCs w:val="28"/>
+        </w:rPr>
+        <w:t>D(</w:t>
+      </w:r>
+      <w:proofErr w:type="gramEnd"/>
+      <w:r>
+        <w:rPr>
+          <w:rFonts w:ascii="Times New Roman" w:hAnsi="Times New Roman" w:cs="Times New Roman"/>
+          <w:sz w:val="28"/>
+          <w:szCs w:val="28"/>
+        </w:rPr>
+        <w:t xml:space="preserve">center, </w:t>
       </w:r>
       <w:proofErr w:type="spellStart"/>
       <w:r>
@@ -12353,7 +13055,16 @@
           <w:sz w:val="28"/>
           <w:szCs w:val="28"/>
         </w:rPr>
-        <w:t>find_stamp_contour</w:t>
+        <w:t>find_stamp_</w:t>
+      </w:r>
+      <w:proofErr w:type="gramStart"/>
+      <w:r>
+        <w:rPr>
+          <w:rFonts w:ascii="Times New Roman" w:hAnsi="Times New Roman" w:cs="Times New Roman"/>
+          <w:sz w:val="28"/>
+          <w:szCs w:val="28"/>
+        </w:rPr>
+        <w:t>contour</w:t>
       </w:r>
       <w:proofErr w:type="spellEnd"/>
       <w:r>
@@ -12365,6 +13076,7 @@
         <w:t>(</w:t>
       </w:r>
       <w:proofErr w:type="spellStart"/>
+      <w:proofErr w:type="gramEnd"/>
       <w:r>
         <w:rPr>
           <w:rFonts w:ascii="Times New Roman" w:hAnsi="Times New Roman" w:cs="Times New Roman"/>
@@ -13071,9 +13783,19 @@
           <w:sz w:val="28"/>
           <w:szCs w:val="28"/>
         </w:rPr>
-        <w:t xml:space="preserve">                        if abs(</w:t>
+        <w:t xml:space="preserve">                        if </w:t>
+      </w:r>
+      <w:proofErr w:type="gramStart"/>
+      <w:r>
+        <w:rPr>
+          <w:rFonts w:ascii="Times New Roman" w:hAnsi="Times New Roman" w:cs="Times New Roman"/>
+          <w:sz w:val="28"/>
+          <w:szCs w:val="28"/>
+        </w:rPr>
+        <w:t>abs(</w:t>
       </w:r>
       <w:proofErr w:type="spellStart"/>
+      <w:proofErr w:type="gramEnd"/>
       <w:r>
         <w:rPr>
           <w:rFonts w:ascii="Times New Roman" w:hAnsi="Times New Roman" w:cs="Times New Roman"/>
@@ -13156,7 +13878,6 @@
           <w:bCs/>
           <w:sz w:val="28"/>
           <w:szCs w:val="28"/>
-          <w:lang w:val="ru-RU"/>
         </w:rPr>
       </w:pPr>
       <w:r>
@@ -13166,7 +13887,6 @@
           <w:bCs/>
           <w:sz w:val="28"/>
           <w:szCs w:val="28"/>
-          <w:lang w:val="ru-RU"/>
         </w:rPr>
         <w:br w:type="page"/>
       </w:r>
@@ -13181,7 +13901,6 @@
           <w:bCs/>
           <w:sz w:val="28"/>
           <w:szCs w:val="28"/>
-          <w:lang w:val="ru-RU"/>
         </w:rPr>
       </w:pPr>
       <w:r>
@@ -13203,7 +13922,6 @@
           <w:bCs/>
           <w:sz w:val="28"/>
           <w:szCs w:val="28"/>
-          <w:lang w:val="ru-RU"/>
         </w:rPr>
         <w:t xml:space="preserve"> </w:t>
       </w:r>
@@ -13225,7 +13943,6 @@
           <w:bCs/>
           <w:sz w:val="28"/>
           <w:szCs w:val="28"/>
-          <w:lang w:val="ru-RU"/>
         </w:rPr>
         <w:t xml:space="preserve"> </w:t>
       </w:r>
@@ -13247,7 +13964,6 @@
           <w:bCs/>
           <w:sz w:val="28"/>
           <w:szCs w:val="28"/>
-          <w:lang w:val="ru-RU"/>
         </w:rPr>
         <w:t xml:space="preserve"> (`</w:t>
       </w:r>
@@ -13270,7 +13986,6 @@
           <w:bCs/>
           <w:sz w:val="28"/>
           <w:szCs w:val="28"/>
-          <w:lang w:val="ru-RU"/>
         </w:rPr>
         <w:t>/</w:t>
       </w:r>
@@ -13285,7 +14000,6 @@
         </w:rPr>
         <w:t>gost</w:t>
       </w:r>
-      <w:proofErr w:type="spellEnd"/>
       <w:r>
         <w:rPr>
           <w:rFonts w:ascii="Times New Roman" w:hAnsi="Times New Roman" w:cs="Times New Roman"/>
@@ -13293,11 +14007,9 @@
           <w:bCs/>
           <w:sz w:val="28"/>
           <w:szCs w:val="28"/>
-          <w:lang w:val="ru-RU"/>
         </w:rPr>
         <w:t>-</w:t>
       </w:r>
-      <w:proofErr w:type="spellStart"/>
       <w:r>
         <w:rPr>
           <w:rFonts w:ascii="Times New Roman" w:hAnsi="Times New Roman" w:cs="Times New Roman"/>
@@ -13316,14 +14028,10 @@
           <w:bCs/>
           <w:sz w:val="28"/>
           <w:szCs w:val="28"/>
-          <w:lang w:val="ru-RU"/>
         </w:rPr>
         <w:t>/</w:t>
       </w:r>
       <w:r>
-        <w:rPr>
-          <w:lang w:val="ru-RU"/>
-        </w:rPr>
         <w:t xml:space="preserve"> </w:t>
       </w:r>
       <w:r>
@@ -13343,11 +14051,9 @@
           <w:bCs/>
           <w:sz w:val="28"/>
           <w:szCs w:val="28"/>
-          <w:lang w:val="ru-RU"/>
         </w:rPr>
         <w:t>.</w:t>
       </w:r>
-      <w:proofErr w:type="spellStart"/>
       <w:r>
         <w:rPr>
           <w:rFonts w:ascii="Times New Roman" w:hAnsi="Times New Roman" w:cs="Times New Roman"/>
@@ -13358,7 +14064,6 @@
         </w:rPr>
         <w:t>py</w:t>
       </w:r>
-      <w:proofErr w:type="spellEnd"/>
       <w:r>
         <w:rPr>
           <w:rFonts w:ascii="Times New Roman" w:hAnsi="Times New Roman" w:cs="Times New Roman"/>
@@ -13366,7 +14071,6 @@
           <w:bCs/>
           <w:sz w:val="28"/>
           <w:szCs w:val="28"/>
-          <w:lang w:val="ru-RU"/>
         </w:rPr>
         <w:t>`)</w:t>
       </w:r>
@@ -13378,7 +14082,6 @@
           <w:rFonts w:ascii="Times New Roman" w:hAnsi="Times New Roman" w:cs="Times New Roman"/>
           <w:sz w:val="28"/>
           <w:szCs w:val="28"/>
-          <w:lang w:val="ru-RU"/>
         </w:rPr>
       </w:pPr>
     </w:p>
@@ -13637,13 +14340,23 @@
           <w:szCs w:val="28"/>
         </w:rPr>
       </w:pPr>
-      <w:r>
-        <w:rPr>
-          <w:rFonts w:ascii="Times New Roman" w:hAnsi="Times New Roman" w:cs="Times New Roman"/>
-          <w:sz w:val="28"/>
-          <w:szCs w:val="28"/>
-        </w:rPr>
-        <w:t xml:space="preserve">from .localization import </w:t>
+      <w:proofErr w:type="gramStart"/>
+      <w:r>
+        <w:rPr>
+          <w:rFonts w:ascii="Times New Roman" w:hAnsi="Times New Roman" w:cs="Times New Roman"/>
+          <w:sz w:val="28"/>
+          <w:szCs w:val="28"/>
+        </w:rPr>
+        <w:t>from .localization</w:t>
+      </w:r>
+      <w:proofErr w:type="gramEnd"/>
+      <w:r>
+        <w:rPr>
+          <w:rFonts w:ascii="Times New Roman" w:hAnsi="Times New Roman" w:cs="Times New Roman"/>
+          <w:sz w:val="28"/>
+          <w:szCs w:val="28"/>
+        </w:rPr>
+        <w:t xml:space="preserve"> import </w:t>
       </w:r>
       <w:proofErr w:type="spellStart"/>
       <w:r>
@@ -13736,7 +14449,16 @@
           <w:sz w:val="28"/>
           <w:szCs w:val="28"/>
         </w:rPr>
-        <w:t>get_ocr_instance</w:t>
+        <w:t>get_ocr_</w:t>
+      </w:r>
+      <w:proofErr w:type="gramStart"/>
+      <w:r>
+        <w:rPr>
+          <w:rFonts w:ascii="Times New Roman" w:hAnsi="Times New Roman" w:cs="Times New Roman"/>
+          <w:sz w:val="28"/>
+          <w:szCs w:val="28"/>
+        </w:rPr>
+        <w:t>instance</w:t>
       </w:r>
       <w:proofErr w:type="spellEnd"/>
       <w:r>
@@ -13745,7 +14467,16 @@
           <w:sz w:val="28"/>
           <w:szCs w:val="28"/>
         </w:rPr>
-        <w:t xml:space="preserve">() -&gt; </w:t>
+        <w:t>(</w:t>
+      </w:r>
+      <w:proofErr w:type="gramEnd"/>
+      <w:r>
+        <w:rPr>
+          <w:rFonts w:ascii="Times New Roman" w:hAnsi="Times New Roman" w:cs="Times New Roman"/>
+          <w:sz w:val="28"/>
+          <w:szCs w:val="28"/>
+        </w:rPr>
+        <w:t xml:space="preserve">) -&gt; </w:t>
       </w:r>
       <w:proofErr w:type="spellStart"/>
       <w:r>
@@ -13801,6 +14532,7 @@
         <w:t xml:space="preserve"> </w:t>
       </w:r>
       <w:proofErr w:type="spellStart"/>
+      <w:proofErr w:type="gramStart"/>
       <w:r>
         <w:rPr>
           <w:rFonts w:ascii="Times New Roman" w:hAnsi="Times New Roman" w:cs="Times New Roman"/>
@@ -13810,6 +14542,7 @@
         <w:t>easyocr.Reader</w:t>
       </w:r>
       <w:proofErr w:type="spellEnd"/>
+      <w:proofErr w:type="gramEnd"/>
       <w:r>
         <w:rPr>
           <w:rFonts w:ascii="Times New Roman" w:hAnsi="Times New Roman" w:cs="Times New Roman"/>
@@ -13898,7 +14631,25 @@
           <w:sz w:val="28"/>
           <w:szCs w:val="28"/>
         </w:rPr>
-        <w:t xml:space="preserve">        print("Initializing </w:t>
+        <w:t xml:space="preserve">        </w:t>
+      </w:r>
+      <w:proofErr w:type="gramStart"/>
+      <w:r>
+        <w:rPr>
+          <w:rFonts w:ascii="Times New Roman" w:hAnsi="Times New Roman" w:cs="Times New Roman"/>
+          <w:sz w:val="28"/>
+          <w:szCs w:val="28"/>
+        </w:rPr>
+        <w:t>print(</w:t>
+      </w:r>
+      <w:proofErr w:type="gramEnd"/>
+      <w:r>
+        <w:rPr>
+          <w:rFonts w:ascii="Times New Roman" w:hAnsi="Times New Roman" w:cs="Times New Roman"/>
+          <w:sz w:val="28"/>
+          <w:szCs w:val="28"/>
+        </w:rPr>
+        <w:t xml:space="preserve">"Initializing </w:t>
       </w:r>
       <w:proofErr w:type="spellStart"/>
       <w:r>
@@ -13973,6 +14724,7 @@
         <w:t xml:space="preserve"> = </w:t>
       </w:r>
       <w:proofErr w:type="spellStart"/>
+      <w:proofErr w:type="gramStart"/>
       <w:r>
         <w:rPr>
           <w:rFonts w:ascii="Times New Roman" w:hAnsi="Times New Roman" w:cs="Times New Roman"/>
@@ -13982,6 +14734,7 @@
         <w:t>easyocr.Reader</w:t>
       </w:r>
       <w:proofErr w:type="spellEnd"/>
+      <w:proofErr w:type="gramEnd"/>
       <w:r>
         <w:rPr>
           <w:rFonts w:ascii="Times New Roman" w:hAnsi="Times New Roman" w:cs="Times New Roman"/>
@@ -14042,7 +14795,25 @@
           <w:sz w:val="28"/>
           <w:szCs w:val="28"/>
         </w:rPr>
-        <w:t xml:space="preserve">        print("</w:t>
+        <w:t xml:space="preserve">        </w:t>
+      </w:r>
+      <w:proofErr w:type="gramStart"/>
+      <w:r>
+        <w:rPr>
+          <w:rFonts w:ascii="Times New Roman" w:hAnsi="Times New Roman" w:cs="Times New Roman"/>
+          <w:sz w:val="28"/>
+          <w:szCs w:val="28"/>
+        </w:rPr>
+        <w:t>print(</w:t>
+      </w:r>
+      <w:proofErr w:type="gramEnd"/>
+      <w:r>
+        <w:rPr>
+          <w:rFonts w:ascii="Times New Roman" w:hAnsi="Times New Roman" w:cs="Times New Roman"/>
+          <w:sz w:val="28"/>
+          <w:szCs w:val="28"/>
+        </w:rPr>
+        <w:t>"</w:t>
       </w:r>
       <w:proofErr w:type="spellStart"/>
       <w:r>
@@ -14342,7 +15113,25 @@
           <w:sz w:val="28"/>
           <w:szCs w:val="28"/>
         </w:rPr>
-        <w:t>: tuple[int, int, int, int]</w:t>
+        <w:t xml:space="preserve">: </w:t>
+      </w:r>
+      <w:proofErr w:type="gramStart"/>
+      <w:r>
+        <w:rPr>
+          <w:rFonts w:ascii="Times New Roman" w:hAnsi="Times New Roman" w:cs="Times New Roman"/>
+          <w:sz w:val="28"/>
+          <w:szCs w:val="28"/>
+        </w:rPr>
+        <w:t>tuple[</w:t>
+      </w:r>
+      <w:proofErr w:type="gramEnd"/>
+      <w:r>
+        <w:rPr>
+          <w:rFonts w:ascii="Times New Roman" w:hAnsi="Times New Roman" w:cs="Times New Roman"/>
+          <w:sz w:val="28"/>
+          <w:szCs w:val="28"/>
+        </w:rPr>
+        <w:t>int, int, int, int]</w:t>
       </w:r>
     </w:p>
     <w:p>
@@ -14378,9 +15167,19 @@
           <w:sz w:val="28"/>
           <w:szCs w:val="28"/>
         </w:rPr>
-        <w:t>: list[</w:t>
+        <w:t xml:space="preserve">: </w:t>
+      </w:r>
+      <w:proofErr w:type="gramStart"/>
+      <w:r>
+        <w:rPr>
+          <w:rFonts w:ascii="Times New Roman" w:hAnsi="Times New Roman" w:cs="Times New Roman"/>
+          <w:sz w:val="28"/>
+          <w:szCs w:val="28"/>
+        </w:rPr>
+        <w:t>list[</w:t>
       </w:r>
       <w:proofErr w:type="spellStart"/>
+      <w:proofErr w:type="gramEnd"/>
       <w:r>
         <w:rPr>
           <w:rFonts w:ascii="Times New Roman" w:hAnsi="Times New Roman" w:cs="Times New Roman"/>
@@ -14487,7 +15286,16 @@
           <w:sz w:val="28"/>
           <w:szCs w:val="28"/>
         </w:rPr>
-        <w:t>extract_text</w:t>
+        <w:t>extract_</w:t>
+      </w:r>
+      <w:proofErr w:type="gramStart"/>
+      <w:r>
+        <w:rPr>
+          <w:rFonts w:ascii="Times New Roman" w:hAnsi="Times New Roman" w:cs="Times New Roman"/>
+          <w:sz w:val="28"/>
+          <w:szCs w:val="28"/>
+        </w:rPr>
+        <w:t>text</w:t>
       </w:r>
       <w:proofErr w:type="spellEnd"/>
       <w:r>
@@ -14498,6 +15306,7 @@
         </w:rPr>
         <w:t>(</w:t>
       </w:r>
+      <w:proofErr w:type="gramEnd"/>
     </w:p>
     <w:p>
       <w:pPr>
@@ -14514,6 +15323,7 @@
           <w:sz w:val="28"/>
           <w:szCs w:val="28"/>
         </w:rPr>
+        <w:lastRenderedPageBreak/>
         <w:t xml:space="preserve">    </w:t>
       </w:r>
       <w:proofErr w:type="spellStart"/>
@@ -14613,9 +15423,19 @@
           <w:sz w:val="28"/>
           <w:szCs w:val="28"/>
         </w:rPr>
-        <w:t>localization_result.stamp</w:t>
+        <w:t>localization_</w:t>
+      </w:r>
+      <w:proofErr w:type="gramStart"/>
+      <w:r>
+        <w:rPr>
+          <w:rFonts w:ascii="Times New Roman" w:hAnsi="Times New Roman" w:cs="Times New Roman"/>
+          <w:sz w:val="28"/>
+          <w:szCs w:val="28"/>
+        </w:rPr>
+        <w:t>result.stamp</w:t>
       </w:r>
       <w:proofErr w:type="spellEnd"/>
+      <w:proofErr w:type="gramEnd"/>
       <w:r>
         <w:rPr>
           <w:rFonts w:ascii="Times New Roman" w:hAnsi="Times New Roman" w:cs="Times New Roman"/>
@@ -14695,7 +15515,25 @@
           <w:sz w:val="28"/>
           <w:szCs w:val="28"/>
         </w:rPr>
-        <w:t>localization_result.stamp.bbox</w:t>
+        <w:t>localization_</w:t>
+      </w:r>
+      <w:proofErr w:type="gramStart"/>
+      <w:r>
+        <w:rPr>
+          <w:rFonts w:ascii="Times New Roman" w:hAnsi="Times New Roman" w:cs="Times New Roman"/>
+          <w:sz w:val="28"/>
+          <w:szCs w:val="28"/>
+        </w:rPr>
+        <w:t>result.stamp</w:t>
+      </w:r>
+      <w:proofErr w:type="gramEnd"/>
+      <w:r>
+        <w:rPr>
+          <w:rFonts w:ascii="Times New Roman" w:hAnsi="Times New Roman" w:cs="Times New Roman"/>
+          <w:sz w:val="28"/>
+          <w:szCs w:val="28"/>
+        </w:rPr>
+        <w:t>.bbox</w:t>
       </w:r>
       <w:proofErr w:type="spellEnd"/>
     </w:p>
@@ -14741,7 +15579,25 @@
           <w:sz w:val="28"/>
           <w:szCs w:val="28"/>
         </w:rPr>
-        <w:t>localization_result.preprocessed.image</w:t>
+        <w:t>localization_</w:t>
+      </w:r>
+      <w:proofErr w:type="gramStart"/>
+      <w:r>
+        <w:rPr>
+          <w:rFonts w:ascii="Times New Roman" w:hAnsi="Times New Roman" w:cs="Times New Roman"/>
+          <w:sz w:val="28"/>
+          <w:szCs w:val="28"/>
+        </w:rPr>
+        <w:t>result.preprocessed</w:t>
+      </w:r>
+      <w:proofErr w:type="gramEnd"/>
+      <w:r>
+        <w:rPr>
+          <w:rFonts w:ascii="Times New Roman" w:hAnsi="Times New Roman" w:cs="Times New Roman"/>
+          <w:sz w:val="28"/>
+          <w:szCs w:val="28"/>
+        </w:rPr>
+        <w:t>.image</w:t>
       </w:r>
       <w:proofErr w:type="spellEnd"/>
     </w:p>
@@ -14798,7 +15654,25 @@
           <w:sz w:val="28"/>
           <w:szCs w:val="28"/>
         </w:rPr>
-        <w:t xml:space="preserve">    x, y, w, h = max(0, x), max(0, y), max(0, w), max(0, h)</w:t>
+        <w:t xml:space="preserve">    x, y, w, h = </w:t>
+      </w:r>
+      <w:proofErr w:type="gramStart"/>
+      <w:r>
+        <w:rPr>
+          <w:rFonts w:ascii="Times New Roman" w:hAnsi="Times New Roman" w:cs="Times New Roman"/>
+          <w:sz w:val="28"/>
+          <w:szCs w:val="28"/>
+        </w:rPr>
+        <w:t>max(</w:t>
+      </w:r>
+      <w:proofErr w:type="gramEnd"/>
+      <w:r>
+        <w:rPr>
+          <w:rFonts w:ascii="Times New Roman" w:hAnsi="Times New Roman" w:cs="Times New Roman"/>
+          <w:sz w:val="28"/>
+          <w:szCs w:val="28"/>
+        </w:rPr>
+        <w:t>0, x), max(0, y), max(0, w), max(0, h)</w:t>
       </w:r>
     </w:p>
     <w:p>
@@ -14899,7 +15773,16 @@
           <w:sz w:val="28"/>
           <w:szCs w:val="28"/>
         </w:rPr>
-        <w:t>original_image</w:t>
+        <w:t>original_</w:t>
+      </w:r>
+      <w:proofErr w:type="gramStart"/>
+      <w:r>
+        <w:rPr>
+          <w:rFonts w:ascii="Times New Roman" w:hAnsi="Times New Roman" w:cs="Times New Roman"/>
+          <w:sz w:val="28"/>
+          <w:szCs w:val="28"/>
+        </w:rPr>
+        <w:t>image</w:t>
       </w:r>
       <w:proofErr w:type="spellEnd"/>
       <w:r>
@@ -14908,7 +15791,16 @@
           <w:sz w:val="28"/>
           <w:szCs w:val="28"/>
         </w:rPr>
-        <w:t>[y : y + h, x : x + w]</w:t>
+        <w:t>[</w:t>
+      </w:r>
+      <w:proofErr w:type="gramEnd"/>
+      <w:r>
+        <w:rPr>
+          <w:rFonts w:ascii="Times New Roman" w:hAnsi="Times New Roman" w:cs="Times New Roman"/>
+          <w:sz w:val="28"/>
+          <w:szCs w:val="28"/>
+        </w:rPr>
+        <w:t>y : y + h, x : x + w]</w:t>
       </w:r>
     </w:p>
     <w:p>
@@ -14945,9 +15837,19 @@
           <w:sz w:val="28"/>
           <w:szCs w:val="28"/>
         </w:rPr>
-        <w:t>stamp_image.size</w:t>
+        <w:t>stamp_</w:t>
+      </w:r>
+      <w:proofErr w:type="gramStart"/>
+      <w:r>
+        <w:rPr>
+          <w:rFonts w:ascii="Times New Roman" w:hAnsi="Times New Roman" w:cs="Times New Roman"/>
+          <w:sz w:val="28"/>
+          <w:szCs w:val="28"/>
+        </w:rPr>
+        <w:t>image.size</w:t>
       </w:r>
       <w:proofErr w:type="spellEnd"/>
+      <w:proofErr w:type="gramEnd"/>
       <w:r>
         <w:rPr>
           <w:rFonts w:ascii="Times New Roman" w:hAnsi="Times New Roman" w:cs="Times New Roman"/>
@@ -15027,7 +15929,16 @@
           <w:sz w:val="28"/>
           <w:szCs w:val="28"/>
         </w:rPr>
-        <w:t>get_ocr_instance</w:t>
+        <w:t>get_ocr_</w:t>
+      </w:r>
+      <w:proofErr w:type="gramStart"/>
+      <w:r>
+        <w:rPr>
+          <w:rFonts w:ascii="Times New Roman" w:hAnsi="Times New Roman" w:cs="Times New Roman"/>
+          <w:sz w:val="28"/>
+          <w:szCs w:val="28"/>
+        </w:rPr>
+        <w:t>instance</w:t>
       </w:r>
       <w:proofErr w:type="spellEnd"/>
       <w:r>
@@ -15036,7 +15947,16 @@
           <w:sz w:val="28"/>
           <w:szCs w:val="28"/>
         </w:rPr>
-        <w:t>()</w:t>
+        <w:t>(</w:t>
+      </w:r>
+      <w:proofErr w:type="gramEnd"/>
+      <w:r>
+        <w:rPr>
+          <w:rFonts w:ascii="Times New Roman" w:hAnsi="Times New Roman" w:cs="Times New Roman"/>
+          <w:sz w:val="28"/>
+          <w:szCs w:val="28"/>
+        </w:rPr>
+        <w:t>)</w:t>
       </w:r>
     </w:p>
     <w:p>
@@ -15075,6 +15995,7 @@
         <w:t xml:space="preserve"> = </w:t>
       </w:r>
       <w:proofErr w:type="spellStart"/>
+      <w:proofErr w:type="gramStart"/>
       <w:r>
         <w:rPr>
           <w:rFonts w:ascii="Times New Roman" w:hAnsi="Times New Roman" w:cs="Times New Roman"/>
@@ -15084,6 +16005,7 @@
         <w:t>ocr.readtext</w:t>
       </w:r>
       <w:proofErr w:type="spellEnd"/>
+      <w:proofErr w:type="gramEnd"/>
       <w:r>
         <w:rPr>
           <w:rFonts w:ascii="Times New Roman" w:hAnsi="Times New Roman" w:cs="Times New Roman"/>
@@ -15298,7 +16220,25 @@
           <w:sz w:val="28"/>
           <w:szCs w:val="28"/>
         </w:rPr>
-        <w:t xml:space="preserve"> = [[int(p[0]), int(p[1])] for p in box]</w:t>
+        <w:t xml:space="preserve"> = [[int(</w:t>
+      </w:r>
+      <w:proofErr w:type="gramStart"/>
+      <w:r>
+        <w:rPr>
+          <w:rFonts w:ascii="Times New Roman" w:hAnsi="Times New Roman" w:cs="Times New Roman"/>
+          <w:sz w:val="28"/>
+          <w:szCs w:val="28"/>
+        </w:rPr>
+        <w:t>p[</w:t>
+      </w:r>
+      <w:proofErr w:type="gramEnd"/>
+      <w:r>
+        <w:rPr>
+          <w:rFonts w:ascii="Times New Roman" w:hAnsi="Times New Roman" w:cs="Times New Roman"/>
+          <w:sz w:val="28"/>
+          <w:szCs w:val="28"/>
+        </w:rPr>
+        <w:t>0]), int(p[1])] for p in box]</w:t>
       </w:r>
     </w:p>
     <w:p>
@@ -15325,9 +16265,19 @@
           <w:sz w:val="28"/>
           <w:szCs w:val="28"/>
         </w:rPr>
-        <w:t>text_blocks.append</w:t>
+        <w:t>text_</w:t>
+      </w:r>
+      <w:proofErr w:type="gramStart"/>
+      <w:r>
+        <w:rPr>
+          <w:rFonts w:ascii="Times New Roman" w:hAnsi="Times New Roman" w:cs="Times New Roman"/>
+          <w:sz w:val="28"/>
+          <w:szCs w:val="28"/>
+        </w:rPr>
+        <w:t>blocks.append</w:t>
       </w:r>
       <w:proofErr w:type="spellEnd"/>
+      <w:proofErr w:type="gramEnd"/>
       <w:r>
         <w:rPr>
           <w:rFonts w:ascii="Times New Roman" w:hAnsi="Times New Roman" w:cs="Times New Roman"/>
@@ -15355,6 +16305,7 @@
         <w:t xml:space="preserve">                </w:t>
       </w:r>
       <w:proofErr w:type="spellStart"/>
+      <w:proofErr w:type="gramStart"/>
       <w:r>
         <w:rPr>
           <w:rFonts w:ascii="Times New Roman" w:hAnsi="Times New Roman" w:cs="Times New Roman"/>
@@ -15370,7 +16321,16 @@
           <w:sz w:val="28"/>
           <w:szCs w:val="28"/>
         </w:rPr>
-        <w:t>(text=text, confidence=float(confidence), box=</w:t>
+        <w:t>(</w:t>
+      </w:r>
+      <w:proofErr w:type="gramEnd"/>
+      <w:r>
+        <w:rPr>
+          <w:rFonts w:ascii="Times New Roman" w:hAnsi="Times New Roman" w:cs="Times New Roman"/>
+          <w:sz w:val="28"/>
+          <w:szCs w:val="28"/>
+        </w:rPr>
+        <w:t>text=text, confidence=float(confidence), box=</w:t>
       </w:r>
       <w:proofErr w:type="spellStart"/>
       <w:r>
@@ -15433,9 +16393,19 @@
           <w:sz w:val="28"/>
           <w:szCs w:val="28"/>
         </w:rPr>
-        <w:t>full_text_lines.append</w:t>
+        <w:t>full_text_</w:t>
+      </w:r>
+      <w:proofErr w:type="gramStart"/>
+      <w:r>
+        <w:rPr>
+          <w:rFonts w:ascii="Times New Roman" w:hAnsi="Times New Roman" w:cs="Times New Roman"/>
+          <w:sz w:val="28"/>
+          <w:szCs w:val="28"/>
+        </w:rPr>
+        <w:t>lines.append</w:t>
       </w:r>
       <w:proofErr w:type="spellEnd"/>
+      <w:proofErr w:type="gramEnd"/>
       <w:r>
         <w:rPr>
           <w:rFonts w:ascii="Times New Roman" w:hAnsi="Times New Roman" w:cs="Times New Roman"/>
@@ -15470,25 +16440,28 @@
           <w:sz w:val="28"/>
           <w:szCs w:val="28"/>
         </w:rPr>
-        <w:t xml:space="preserve">  </w:t>
-      </w:r>
-    </w:p>
-    <w:p>
-      <w:pPr>
-        <w:rPr>
-          <w:rFonts w:ascii="Times New Roman" w:hAnsi="Times New Roman" w:cs="Times New Roman"/>
-          <w:sz w:val="28"/>
-          <w:szCs w:val="28"/>
-        </w:rPr>
-      </w:pPr>
-      <w:r>
-        <w:rPr>
-          <w:rFonts w:ascii="Times New Roman" w:hAnsi="Times New Roman" w:cs="Times New Roman"/>
-          <w:sz w:val="28"/>
-          <w:szCs w:val="28"/>
-        </w:rPr>
-        <w:br w:type="page"/>
-      </w:r>
+        <w:t xml:space="preserve">  return </w:t>
+      </w:r>
+      <w:proofErr w:type="spellStart"/>
+      <w:proofErr w:type="gramStart"/>
+      <w:r>
+        <w:rPr>
+          <w:rFonts w:ascii="Times New Roman" w:hAnsi="Times New Roman" w:cs="Times New Roman"/>
+          <w:sz w:val="28"/>
+          <w:szCs w:val="28"/>
+        </w:rPr>
+        <w:t>ExtractionResult</w:t>
+      </w:r>
+      <w:proofErr w:type="spellEnd"/>
+      <w:r>
+        <w:rPr>
+          <w:rFonts w:ascii="Times New Roman" w:hAnsi="Times New Roman" w:cs="Times New Roman"/>
+          <w:sz w:val="28"/>
+          <w:szCs w:val="28"/>
+        </w:rPr>
+        <w:t>(</w:t>
+      </w:r>
+      <w:proofErr w:type="gramEnd"/>
     </w:p>
     <w:p>
       <w:pPr>
@@ -15505,8 +16478,43 @@
           <w:sz w:val="28"/>
           <w:szCs w:val="28"/>
         </w:rPr>
-        <w:lastRenderedPageBreak/>
-        <w:t xml:space="preserve">  return </w:t>
+        <w:t xml:space="preserve">        source_image_path=str(localization_</w:t>
+      </w:r>
+      <w:proofErr w:type="gramStart"/>
+      <w:r>
+        <w:rPr>
+          <w:rFonts w:ascii="Times New Roman" w:hAnsi="Times New Roman" w:cs="Times New Roman"/>
+          <w:sz w:val="28"/>
+          <w:szCs w:val="28"/>
+        </w:rPr>
+        <w:t>result.preprocessed</w:t>
+      </w:r>
+      <w:proofErr w:type="gramEnd"/>
+      <w:r>
+        <w:rPr>
+          <w:rFonts w:ascii="Times New Roman" w:hAnsi="Times New Roman" w:cs="Times New Roman"/>
+          <w:sz w:val="28"/>
+          <w:szCs w:val="28"/>
+        </w:rPr>
+        <w:t>.original_path),</w:t>
+      </w:r>
+    </w:p>
+    <w:p>
+      <w:pPr>
+        <w:spacing w:after="0" w:line="276" w:lineRule="auto"/>
+        <w:rPr>
+          <w:rFonts w:ascii="Times New Roman" w:hAnsi="Times New Roman" w:cs="Times New Roman"/>
+          <w:sz w:val="28"/>
+          <w:szCs w:val="28"/>
+        </w:rPr>
+      </w:pPr>
+      <w:r>
+        <w:rPr>
+          <w:rFonts w:ascii="Times New Roman" w:hAnsi="Times New Roman" w:cs="Times New Roman"/>
+          <w:sz w:val="28"/>
+          <w:szCs w:val="28"/>
+        </w:rPr>
+        <w:t xml:space="preserve">        </w:t>
       </w:r>
       <w:proofErr w:type="spellStart"/>
       <w:r>
@@ -15515,7 +16523,7 @@
           <w:sz w:val="28"/>
           <w:szCs w:val="28"/>
         </w:rPr>
-        <w:t>ExtractionResult</w:t>
+        <w:t>stamp_bbox</w:t>
       </w:r>
       <w:proofErr w:type="spellEnd"/>
       <w:r>
@@ -15524,7 +16532,25 @@
           <w:sz w:val="28"/>
           <w:szCs w:val="28"/>
         </w:rPr>
-        <w:t>(</w:t>
+        <w:t>=</w:t>
+      </w:r>
+      <w:proofErr w:type="spellStart"/>
+      <w:r>
+        <w:rPr>
+          <w:rFonts w:ascii="Times New Roman" w:hAnsi="Times New Roman" w:cs="Times New Roman"/>
+          <w:sz w:val="28"/>
+          <w:szCs w:val="28"/>
+        </w:rPr>
+        <w:t>stamp_bbox</w:t>
+      </w:r>
+      <w:proofErr w:type="spellEnd"/>
+      <w:r>
+        <w:rPr>
+          <w:rFonts w:ascii="Times New Roman" w:hAnsi="Times New Roman" w:cs="Times New Roman"/>
+          <w:sz w:val="28"/>
+          <w:szCs w:val="28"/>
+        </w:rPr>
+        <w:t>,</w:t>
       </w:r>
     </w:p>
     <w:p>
@@ -15542,7 +16568,43 @@
           <w:sz w:val="28"/>
           <w:szCs w:val="28"/>
         </w:rPr>
-        <w:t xml:space="preserve">        source_image_path=str(localization_result.preprocessed.original_path),</w:t>
+        <w:t xml:space="preserve">        </w:t>
+      </w:r>
+      <w:proofErr w:type="spellStart"/>
+      <w:r>
+        <w:rPr>
+          <w:rFonts w:ascii="Times New Roman" w:hAnsi="Times New Roman" w:cs="Times New Roman"/>
+          <w:sz w:val="28"/>
+          <w:szCs w:val="28"/>
+        </w:rPr>
+        <w:t>text_blocks</w:t>
+      </w:r>
+      <w:proofErr w:type="spellEnd"/>
+      <w:r>
+        <w:rPr>
+          <w:rFonts w:ascii="Times New Roman" w:hAnsi="Times New Roman" w:cs="Times New Roman"/>
+          <w:sz w:val="28"/>
+          <w:szCs w:val="28"/>
+        </w:rPr>
+        <w:t>=</w:t>
+      </w:r>
+      <w:proofErr w:type="spellStart"/>
+      <w:r>
+        <w:rPr>
+          <w:rFonts w:ascii="Times New Roman" w:hAnsi="Times New Roman" w:cs="Times New Roman"/>
+          <w:sz w:val="28"/>
+          <w:szCs w:val="28"/>
+        </w:rPr>
+        <w:t>text_blocks</w:t>
+      </w:r>
+      <w:proofErr w:type="spellEnd"/>
+      <w:r>
+        <w:rPr>
+          <w:rFonts w:ascii="Times New Roman" w:hAnsi="Times New Roman" w:cs="Times New Roman"/>
+          <w:sz w:val="28"/>
+          <w:szCs w:val="28"/>
+        </w:rPr>
+        <w:t>,</w:t>
       </w:r>
     </w:p>
     <w:p>
@@ -15569,7 +16631,7 @@
           <w:sz w:val="28"/>
           <w:szCs w:val="28"/>
         </w:rPr>
-        <w:t>stamp_bbox</w:t>
+        <w:t>full_text</w:t>
       </w:r>
       <w:proofErr w:type="spellEnd"/>
       <w:r>
@@ -15578,161 +16640,30 @@
           <w:sz w:val="28"/>
           <w:szCs w:val="28"/>
         </w:rPr>
-        <w:t>=</w:t>
-      </w:r>
-      <w:proofErr w:type="spellStart"/>
-      <w:r>
-        <w:rPr>
-          <w:rFonts w:ascii="Times New Roman" w:hAnsi="Times New Roman" w:cs="Times New Roman"/>
-          <w:sz w:val="28"/>
-          <w:szCs w:val="28"/>
-        </w:rPr>
-        <w:t>stamp_bbox</w:t>
-      </w:r>
-      <w:proofErr w:type="spellEnd"/>
-      <w:r>
-        <w:rPr>
-          <w:rFonts w:ascii="Times New Roman" w:hAnsi="Times New Roman" w:cs="Times New Roman"/>
-          <w:sz w:val="28"/>
-          <w:szCs w:val="28"/>
-        </w:rPr>
-        <w:t>,</w:t>
-      </w:r>
-    </w:p>
-    <w:p>
-      <w:pPr>
-        <w:spacing w:after="0" w:line="276" w:lineRule="auto"/>
-        <w:rPr>
-          <w:rFonts w:ascii="Times New Roman" w:hAnsi="Times New Roman" w:cs="Times New Roman"/>
-          <w:sz w:val="28"/>
-          <w:szCs w:val="28"/>
-        </w:rPr>
-      </w:pPr>
-      <w:r>
-        <w:rPr>
-          <w:rFonts w:ascii="Times New Roman" w:hAnsi="Times New Roman" w:cs="Times New Roman"/>
-          <w:sz w:val="28"/>
-          <w:szCs w:val="28"/>
-        </w:rPr>
-        <w:t xml:space="preserve">        </w:t>
-      </w:r>
-      <w:proofErr w:type="spellStart"/>
-      <w:r>
-        <w:rPr>
-          <w:rFonts w:ascii="Times New Roman" w:hAnsi="Times New Roman" w:cs="Times New Roman"/>
-          <w:sz w:val="28"/>
-          <w:szCs w:val="28"/>
-        </w:rPr>
-        <w:t>text_blocks</w:t>
-      </w:r>
-      <w:proofErr w:type="spellEnd"/>
-      <w:r>
-        <w:rPr>
-          <w:rFonts w:ascii="Times New Roman" w:hAnsi="Times New Roman" w:cs="Times New Roman"/>
-          <w:sz w:val="28"/>
-          <w:szCs w:val="28"/>
-        </w:rPr>
-        <w:t>=</w:t>
-      </w:r>
-      <w:proofErr w:type="spellStart"/>
-      <w:r>
-        <w:rPr>
-          <w:rFonts w:ascii="Times New Roman" w:hAnsi="Times New Roman" w:cs="Times New Roman"/>
-          <w:sz w:val="28"/>
-          <w:szCs w:val="28"/>
-        </w:rPr>
-        <w:t>text_blocks</w:t>
-      </w:r>
-      <w:proofErr w:type="spellEnd"/>
-      <w:r>
-        <w:rPr>
-          <w:rFonts w:ascii="Times New Roman" w:hAnsi="Times New Roman" w:cs="Times New Roman"/>
-          <w:sz w:val="28"/>
-          <w:szCs w:val="28"/>
-        </w:rPr>
-        <w:t>,</w:t>
-      </w:r>
-    </w:p>
-    <w:p>
-      <w:pPr>
-        <w:spacing w:after="0" w:line="276" w:lineRule="auto"/>
-        <w:rPr>
-          <w:rFonts w:ascii="Times New Roman" w:hAnsi="Times New Roman" w:cs="Times New Roman"/>
-          <w:sz w:val="28"/>
-          <w:szCs w:val="28"/>
-        </w:rPr>
-      </w:pPr>
-      <w:r>
-        <w:rPr>
-          <w:rFonts w:ascii="Times New Roman" w:hAnsi="Times New Roman" w:cs="Times New Roman"/>
-          <w:sz w:val="28"/>
-          <w:szCs w:val="28"/>
-        </w:rPr>
-        <w:t xml:space="preserve">        </w:t>
-      </w:r>
-      <w:proofErr w:type="spellStart"/>
-      <w:r>
-        <w:rPr>
-          <w:rFonts w:ascii="Times New Roman" w:hAnsi="Times New Roman" w:cs="Times New Roman"/>
-          <w:sz w:val="28"/>
-          <w:szCs w:val="28"/>
-        </w:rPr>
-        <w:t>full_text</w:t>
-      </w:r>
-      <w:proofErr w:type="spellEnd"/>
-      <w:r>
-        <w:rPr>
-          <w:rFonts w:ascii="Times New Roman" w:hAnsi="Times New Roman" w:cs="Times New Roman"/>
-          <w:sz w:val="28"/>
-          <w:szCs w:val="28"/>
-        </w:rPr>
-        <w:t>="\\n".join(full_text_lines),</w:t>
+        <w:t>="\\n</w:t>
+      </w:r>
+      <w:proofErr w:type="gramStart"/>
+      <w:r>
+        <w:rPr>
+          <w:rFonts w:ascii="Times New Roman" w:hAnsi="Times New Roman" w:cs="Times New Roman"/>
+          <w:sz w:val="28"/>
+          <w:szCs w:val="28"/>
+        </w:rPr>
+        <w:t>".join</w:t>
+      </w:r>
+      <w:proofErr w:type="gramEnd"/>
+      <w:r>
+        <w:rPr>
+          <w:rFonts w:ascii="Times New Roman" w:hAnsi="Times New Roman" w:cs="Times New Roman"/>
+          <w:sz w:val="28"/>
+          <w:szCs w:val="28"/>
+        </w:rPr>
+        <w:t>(full_text_lines),</w:t>
       </w:r>
     </w:p>
     <w:p>
       <w:pPr>
         <w:spacing w:after="0" w:line="360" w:lineRule="auto"/>
-        <w:ind w:firstLine="709"/>
-        <w:rPr>
-          <w:rFonts w:ascii="Times New Roman" w:hAnsi="Times New Roman" w:cs="Times New Roman"/>
-          <w:sz w:val="28"/>
-          <w:szCs w:val="28"/>
-          <w:lang w:val="ru-RU"/>
-        </w:rPr>
-      </w:pPr>
-      <w:r>
-        <w:rPr>
-          <w:rFonts w:ascii="Times New Roman" w:hAnsi="Times New Roman" w:cs="Times New Roman"/>
-          <w:sz w:val="28"/>
-          <w:szCs w:val="28"/>
-        </w:rPr>
-        <w:t xml:space="preserve">    </w:t>
-      </w:r>
-      <w:r>
-        <w:rPr>
-          <w:rFonts w:ascii="Times New Roman" w:hAnsi="Times New Roman" w:cs="Times New Roman"/>
-          <w:sz w:val="28"/>
-          <w:szCs w:val="28"/>
-          <w:lang w:val="ru-RU"/>
-        </w:rPr>
-        <w:t>)</w:t>
-      </w:r>
-    </w:p>
-    <w:p>
-      <w:pPr>
-        <w:spacing w:after="0" w:line="360" w:lineRule="auto"/>
-        <w:ind w:firstLine="709"/>
-        <w:rPr>
-          <w:rFonts w:ascii="Times New Roman" w:hAnsi="Times New Roman" w:cs="Times New Roman"/>
-          <w:sz w:val="28"/>
-          <w:szCs w:val="28"/>
-          <w:lang w:val="ru-RU"/>
-        </w:rPr>
-      </w:pPr>
-    </w:p>
-    <w:p>
-      <w:pPr>
-        <w:spacing w:line="360" w:lineRule="auto"/>
         <w:ind w:firstLine="709"/>
         <w:rPr>
           <w:rFonts w:ascii="Times New Roman" w:eastAsiaTheme="majorEastAsia" w:hAnsi="Times New Roman" w:cs="Times New Roman"/>
@@ -15743,6 +16674,23 @@
           <w:lang w:val="ru-RU"/>
         </w:rPr>
       </w:pPr>
+      <w:r>
+        <w:rPr>
+          <w:rFonts w:ascii="Times New Roman" w:hAnsi="Times New Roman" w:cs="Times New Roman"/>
+          <w:sz w:val="28"/>
+          <w:szCs w:val="28"/>
+        </w:rPr>
+        <w:t xml:space="preserve">    </w:t>
+      </w:r>
+      <w:r>
+        <w:rPr>
+          <w:rFonts w:ascii="Times New Roman" w:hAnsi="Times New Roman" w:cs="Times New Roman"/>
+          <w:sz w:val="28"/>
+          <w:szCs w:val="28"/>
+          <w:lang w:val="ru-RU"/>
+        </w:rPr>
+        <w:t>)</w:t>
+      </w:r>
       <w:bookmarkStart w:id="14" w:name="_Toc222767897"/>
       <w:r>
         <w:rPr>
@@ -15759,7 +16707,7 @@
     <w:p>
       <w:pPr>
         <w:pStyle w:val="1"/>
-        <w:spacing w:line="360" w:lineRule="auto"/>
+        <w:spacing w:before="0" w:after="0" w:line="360" w:lineRule="auto"/>
         <w:jc w:val="center"/>
         <w:rPr>
           <w:rFonts w:ascii="Times New Roman" w:hAnsi="Times New Roman" w:cs="Times New Roman"/>
@@ -15788,7 +16736,7 @@
     </w:p>
     <w:p>
       <w:pPr>
-        <w:spacing w:line="360" w:lineRule="auto"/>
+        <w:spacing w:after="0" w:line="360" w:lineRule="auto"/>
         <w:ind w:firstLine="709"/>
         <w:rPr>
           <w:rFonts w:ascii="Times New Roman" w:hAnsi="Times New Roman" w:cs="Times New Roman"/>
@@ -15817,7 +16765,7 @@
     </w:p>
     <w:p>
       <w:pPr>
-        <w:spacing w:line="360" w:lineRule="auto"/>
+        <w:spacing w:after="0" w:line="360" w:lineRule="auto"/>
         <w:ind w:firstLine="709"/>
         <w:jc w:val="both"/>
         <w:rPr>
@@ -15873,7 +16821,7 @@
     </w:p>
     <w:p>
       <w:pPr>
-        <w:spacing w:line="360" w:lineRule="auto"/>
+        <w:spacing w:after="0" w:line="360" w:lineRule="auto"/>
         <w:ind w:firstLine="709"/>
         <w:jc w:val="both"/>
         <w:rPr>
@@ -15895,7 +16843,7 @@
     </w:p>
     <w:p>
       <w:pPr>
-        <w:spacing w:line="360" w:lineRule="auto"/>
+        <w:spacing w:after="0" w:line="360" w:lineRule="auto"/>
         <w:ind w:firstLine="709"/>
         <w:jc w:val="both"/>
         <w:rPr>
@@ -15917,7 +16865,7 @@
     </w:p>
     <w:p>
       <w:pPr>
-        <w:spacing w:line="360" w:lineRule="auto"/>
+        <w:spacing w:after="0" w:line="360" w:lineRule="auto"/>
         <w:ind w:firstLine="709"/>
         <w:rPr>
           <w:rFonts w:ascii="Times New Roman" w:hAnsi="Times New Roman" w:cs="Times New Roman"/>
@@ -15926,18 +16874,6 @@
           <w:lang w:val="ru-RU"/>
         </w:rPr>
       </w:pPr>
-    </w:p>
-    <w:p>
-      <w:pPr>
-        <w:spacing w:line="360" w:lineRule="auto"/>
-        <w:ind w:firstLine="709"/>
-        <w:rPr>
-          <w:rFonts w:ascii="Times New Roman" w:hAnsi="Times New Roman" w:cs="Times New Roman"/>
-          <w:sz w:val="28"/>
-          <w:szCs w:val="28"/>
-          <w:lang w:val="ru-RU"/>
-        </w:rPr>
-      </w:pPr>
       <w:r>
         <w:rPr>
           <w:rFonts w:ascii="Times New Roman" w:hAnsi="Times New Roman" w:cs="Times New Roman"/>
@@ -15958,7 +16894,7 @@
     </w:p>
     <w:p>
       <w:pPr>
-        <w:spacing w:line="360" w:lineRule="auto"/>
+        <w:spacing w:after="0" w:line="360" w:lineRule="auto"/>
         <w:ind w:firstLine="709"/>
         <w:jc w:val="both"/>
         <w:rPr>
@@ -15997,7 +16933,7 @@
         <w:tabs>
           <w:tab w:val="left" w:pos="993"/>
         </w:tabs>
-        <w:spacing w:line="360" w:lineRule="auto"/>
+        <w:spacing w:after="0" w:line="360" w:lineRule="auto"/>
         <w:ind w:left="0" w:firstLine="709"/>
         <w:jc w:val="both"/>
         <w:rPr>
@@ -16063,7 +16999,7 @@
         <w:tabs>
           <w:tab w:val="left" w:pos="993"/>
         </w:tabs>
-        <w:spacing w:line="360" w:lineRule="auto"/>
+        <w:spacing w:after="0" w:line="360" w:lineRule="auto"/>
         <w:ind w:left="0" w:firstLine="709"/>
         <w:jc w:val="both"/>
         <w:rPr>
@@ -16093,7 +17029,7 @@
         <w:tabs>
           <w:tab w:val="left" w:pos="993"/>
         </w:tabs>
-        <w:spacing w:line="360" w:lineRule="auto"/>
+        <w:spacing w:after="0" w:line="360" w:lineRule="auto"/>
         <w:ind w:left="0" w:firstLine="709"/>
         <w:jc w:val="both"/>
         <w:rPr>
@@ -16123,7 +17059,7 @@
         <w:tabs>
           <w:tab w:val="left" w:pos="993"/>
         </w:tabs>
-        <w:spacing w:line="360" w:lineRule="auto"/>
+        <w:spacing w:after="0" w:line="360" w:lineRule="auto"/>
         <w:ind w:left="0" w:firstLine="709"/>
         <w:jc w:val="both"/>
         <w:rPr>
@@ -16170,7 +17106,7 @@
         <w:tabs>
           <w:tab w:val="left" w:pos="993"/>
         </w:tabs>
-        <w:spacing w:line="360" w:lineRule="auto"/>
+        <w:spacing w:after="0" w:line="360" w:lineRule="auto"/>
         <w:ind w:left="0" w:firstLine="709"/>
         <w:jc w:val="both"/>
         <w:rPr>
@@ -16212,7 +17148,7 @@
         <w:tabs>
           <w:tab w:val="left" w:pos="993"/>
         </w:tabs>
-        <w:spacing w:line="360" w:lineRule="auto"/>
+        <w:spacing w:after="0" w:line="360" w:lineRule="auto"/>
         <w:ind w:firstLine="709"/>
         <w:rPr>
           <w:rFonts w:ascii="Times New Roman" w:hAnsi="Times New Roman" w:cs="Times New Roman"/>
@@ -16241,7 +17177,7 @@
         <w:tabs>
           <w:tab w:val="left" w:pos="993"/>
         </w:tabs>
-        <w:spacing w:line="360" w:lineRule="auto"/>
+        <w:spacing w:after="0" w:line="360" w:lineRule="auto"/>
         <w:ind w:left="0" w:firstLine="709"/>
         <w:jc w:val="both"/>
         <w:rPr>
@@ -16271,7 +17207,7 @@
         <w:tabs>
           <w:tab w:val="left" w:pos="993"/>
         </w:tabs>
-        <w:spacing w:line="360" w:lineRule="auto"/>
+        <w:spacing w:after="0" w:line="360" w:lineRule="auto"/>
         <w:ind w:left="0" w:firstLine="709"/>
         <w:jc w:val="both"/>
         <w:rPr>
@@ -16288,7 +17224,6 @@
           <w:szCs w:val="28"/>
           <w:lang w:val="ru-RU"/>
         </w:rPr>
-        <w:lastRenderedPageBreak/>
         <w:t>Предусмотреть логирование ошибок в случае невозможности обработки файла.</w:t>
       </w:r>
     </w:p>
@@ -16297,7 +17232,7 @@
         <w:tabs>
           <w:tab w:val="left" w:pos="993"/>
         </w:tabs>
-        <w:spacing w:line="360" w:lineRule="auto"/>
+        <w:spacing w:after="0" w:line="360" w:lineRule="auto"/>
         <w:ind w:firstLine="709"/>
         <w:rPr>
           <w:rFonts w:ascii="Times New Roman" w:hAnsi="Times New Roman" w:cs="Times New Roman"/>
@@ -16343,7 +17278,7 @@
         <w:tabs>
           <w:tab w:val="left" w:pos="993"/>
         </w:tabs>
-        <w:spacing w:line="360" w:lineRule="auto"/>
+        <w:spacing w:after="0" w:line="360" w:lineRule="auto"/>
         <w:ind w:left="0" w:firstLine="709"/>
         <w:rPr>
           <w:rFonts w:ascii="Times New Roman" w:hAnsi="Times New Roman" w:cs="Times New Roman"/>
@@ -16425,7 +17360,7 @@
         <w:tabs>
           <w:tab w:val="left" w:pos="993"/>
         </w:tabs>
-        <w:spacing w:line="360" w:lineRule="auto"/>
+        <w:spacing w:after="0" w:line="360" w:lineRule="auto"/>
         <w:ind w:left="0" w:firstLine="709"/>
         <w:rPr>
           <w:rFonts w:ascii="Times New Roman" w:hAnsi="Times New Roman" w:cs="Times New Roman"/>
@@ -16449,12 +17384,13 @@
         <w:tabs>
           <w:tab w:val="left" w:pos="993"/>
         </w:tabs>
-        <w:spacing w:line="360" w:lineRule="auto"/>
+        <w:spacing w:after="0" w:line="360" w:lineRule="auto"/>
         <w:ind w:firstLine="709"/>
         <w:rPr>
           <w:rFonts w:ascii="Times New Roman" w:hAnsi="Times New Roman" w:cs="Times New Roman"/>
           <w:sz w:val="28"/>
           <w:szCs w:val="28"/>
+          <w:lang w:val="ru-RU"/>
         </w:rPr>
       </w:pPr>
     </w:p>
@@ -16463,7 +17399,7 @@
         <w:tabs>
           <w:tab w:val="left" w:pos="993"/>
         </w:tabs>
-        <w:spacing w:line="360" w:lineRule="auto"/>
+        <w:spacing w:after="0" w:line="360" w:lineRule="auto"/>
         <w:ind w:firstLine="709"/>
         <w:rPr>
           <w:rFonts w:ascii="Times New Roman" w:hAnsi="Times New Roman" w:cs="Times New Roman"/>
@@ -16495,7 +17431,7 @@
         <w:tabs>
           <w:tab w:val="left" w:pos="993"/>
         </w:tabs>
-        <w:spacing w:line="360" w:lineRule="auto"/>
+        <w:spacing w:after="0" w:line="360" w:lineRule="auto"/>
         <w:ind w:firstLine="709"/>
         <w:rPr>
           <w:rFonts w:ascii="Times New Roman" w:hAnsi="Times New Roman" w:cs="Times New Roman"/>
@@ -16528,7 +17464,7 @@
         <w:tabs>
           <w:tab w:val="left" w:pos="993"/>
         </w:tabs>
-        <w:spacing w:line="360" w:lineRule="auto"/>
+        <w:spacing w:after="0" w:line="360" w:lineRule="auto"/>
         <w:ind w:firstLine="709"/>
         <w:rPr>
           <w:rFonts w:ascii="Times New Roman" w:hAnsi="Times New Roman" w:cs="Times New Roman"/>
@@ -16561,7 +17497,7 @@
         <w:tabs>
           <w:tab w:val="left" w:pos="993"/>
         </w:tabs>
-        <w:spacing w:line="360" w:lineRule="auto"/>
+        <w:spacing w:after="0" w:line="360" w:lineRule="auto"/>
         <w:ind w:firstLine="709"/>
         <w:rPr>
           <w:rFonts w:ascii="Times New Roman" w:hAnsi="Times New Roman" w:cs="Times New Roman"/>
@@ -16585,7 +17521,7 @@
         <w:tabs>
           <w:tab w:val="left" w:pos="993"/>
         </w:tabs>
-        <w:spacing w:line="360" w:lineRule="auto"/>
+        <w:spacing w:after="0" w:line="360" w:lineRule="auto"/>
         <w:ind w:firstLine="709"/>
         <w:rPr>
           <w:rFonts w:ascii="Times New Roman" w:hAnsi="Times New Roman" w:cs="Times New Roman"/>
@@ -16626,7 +17562,7 @@
         <w:tabs>
           <w:tab w:val="left" w:pos="993"/>
         </w:tabs>
-        <w:spacing w:line="360" w:lineRule="auto"/>
+        <w:spacing w:after="0" w:line="360" w:lineRule="auto"/>
         <w:ind w:firstLine="709"/>
         <w:rPr>
           <w:rFonts w:ascii="Times New Roman" w:hAnsi="Times New Roman" w:cs="Times New Roman"/>
@@ -16646,8 +17582,10 @@
       </w:r>
     </w:p>
     <w:sectPr>
-      <w:pgSz w:w="12240" w:h="15840"/>
+      <w:footerReference w:type="default" r:id="rId14"/>
+      <w:pgSz w:w="11907" w:h="16840" w:code="9"/>
       <w:pgMar w:top="1134" w:right="567" w:bottom="1134" w:left="1701" w:header="720" w:footer="720" w:gutter="0"/>
+      <w:pgNumType w:start="6"/>
       <w:cols w:space="720"/>
       <w:docGrid w:linePitch="360"/>
     </w:sectPr>
@@ -16678,6 +17616,85 @@
     </w:p>
   </w:endnote>
 </w:endnotes>
+</file>
+
+<file path=word/footer1.xml><?xml version="1.0" encoding="utf-8"?>
+<w:ftr xmlns:wpc="http://schemas.microsoft.com/office/word/2010/wordprocessingCanvas" xmlns:cx="http://schemas.microsoft.com/office/drawing/2014/chartex" xmlns:cx1="http://schemas.microsoft.com/office/drawing/2015/9/8/chartex" xmlns:cx2="http://schemas.microsoft.com/office/drawing/2015/10/21/chartex" xmlns:cx3="http://schemas.microsoft.com/office/drawing/2016/5/9/chartex" xmlns:cx4="http://schemas.microsoft.com/office/drawing/2016/5/10/chartex" xmlns:cx5="http://schemas.microsoft.com/office/drawing/2016/5/11/chartex" xmlns:cx6="http://schemas.microsoft.com/office/drawing/2016/5/12/chartex" xmlns:cx7="http://schemas.microsoft.com/office/drawing/2016/5/13/chartex" xmlns:cx8="http://schemas.microsoft.com/office/drawing/2016/5/14/chartex" xmlns:mc="http://schemas.openxmlformats.org/markup-compatibility/2006" xmlns:aink="http://schemas.microsoft.com/office/drawing/2016/ink" xmlns:am3d="http://schemas.microsoft.com/office/drawing/2017/model3d" xmlns:o="urn:schemas-microsoft-com:office:office" xmlns:oel="http://schemas.microsoft.com/office/2019/extlst" xmlns:r="http://schemas.openxmlformats.org/officeDocument/2006/relationships" xmlns:m="http://schemas.openxmlformats.org/officeDocument/2006/math" xmlns:v="urn:schemas-microsoft-com:vml" xmlns:wp14="http://schemas.microsoft.com/office/word/2010/wordprocessingDrawing" xmlns:wp="http://schemas.openxmlformats.org/drawingml/2006/wordprocessingDrawing" xmlns:w10="urn:schemas-microsoft-com:office:word" xmlns:w="http://schemas.openxmlformats.org/wordprocessingml/2006/main" xmlns:w14="http://schemas.microsoft.com/office/word/2010/wordml" xmlns:w15="http://schemas.microsoft.com/office/word/2012/wordml" xmlns:w16cex="http://schemas.microsoft.com/office/word/2018/wordml/cex" xmlns:w16cid="http://schemas.microsoft.com/office/word/2016/wordml/cid" xmlns:w16="http://schemas.microsoft.com/office/word/2018/wordml" xmlns:w16sdtdh="http://schemas.microsoft.com/office/word/2020/wordml/sdtdatahash" xmlns:w16se="http://schemas.microsoft.com/office/word/2015/wordml/symex" xmlns:wpg="http://schemas.microsoft.com/office/word/2010/wordprocessingGroup" xmlns:wpi="http://schemas.microsoft.com/office/word/2010/wordprocessingInk" xmlns:wne="http://schemas.microsoft.com/office/word/2006/wordml" xmlns:wps="http://schemas.microsoft.com/office/word/2010/wordprocessingShape" mc:Ignorable="w14 w15 w16se w16cid w16 w16cex w16sdtdh wp14">
+  <w:sdt>
+    <w:sdtPr>
+      <w:rPr>
+        <w:rFonts w:ascii="Times New Roman" w:hAnsi="Times New Roman" w:cs="Times New Roman"/>
+        <w:sz w:val="28"/>
+        <w:szCs w:val="28"/>
+      </w:rPr>
+      <w:id w:val="1043176932"/>
+      <w:docPartObj>
+        <w:docPartGallery w:val="Page Numbers (Bottom of Page)"/>
+        <w:docPartUnique/>
+      </w:docPartObj>
+    </w:sdtPr>
+    <w:sdtEndPr/>
+    <w:sdtContent>
+      <w:p>
+        <w:pPr>
+          <w:pStyle w:val="af1"/>
+          <w:jc w:val="right"/>
+          <w:rPr>
+            <w:rFonts w:ascii="Times New Roman" w:hAnsi="Times New Roman" w:cs="Times New Roman"/>
+            <w:sz w:val="28"/>
+            <w:szCs w:val="28"/>
+          </w:rPr>
+        </w:pPr>
+        <w:r>
+          <w:rPr>
+            <w:rFonts w:ascii="Times New Roman" w:hAnsi="Times New Roman" w:cs="Times New Roman"/>
+            <w:sz w:val="28"/>
+            <w:szCs w:val="28"/>
+          </w:rPr>
+          <w:fldChar w:fldCharType="begin"/>
+        </w:r>
+        <w:r>
+          <w:rPr>
+            <w:rFonts w:ascii="Times New Roman" w:hAnsi="Times New Roman" w:cs="Times New Roman"/>
+            <w:sz w:val="28"/>
+            <w:szCs w:val="28"/>
+          </w:rPr>
+          <w:instrText>PAGE   \* MERGEFORMAT</w:instrText>
+        </w:r>
+        <w:r>
+          <w:rPr>
+            <w:rFonts w:ascii="Times New Roman" w:hAnsi="Times New Roman" w:cs="Times New Roman"/>
+            <w:sz w:val="28"/>
+            <w:szCs w:val="28"/>
+          </w:rPr>
+          <w:fldChar w:fldCharType="separate"/>
+        </w:r>
+        <w:r>
+          <w:rPr>
+            <w:rFonts w:ascii="Times New Roman" w:hAnsi="Times New Roman" w:cs="Times New Roman"/>
+            <w:sz w:val="28"/>
+            <w:szCs w:val="28"/>
+            <w:lang w:val="ru-RU"/>
+          </w:rPr>
+          <w:t>2</w:t>
+        </w:r>
+        <w:r>
+          <w:rPr>
+            <w:rFonts w:ascii="Times New Roman" w:hAnsi="Times New Roman" w:cs="Times New Roman"/>
+            <w:sz w:val="28"/>
+            <w:szCs w:val="28"/>
+          </w:rPr>
+          <w:fldChar w:fldCharType="end"/>
+        </w:r>
+      </w:p>
+    </w:sdtContent>
+  </w:sdt>
+  <w:p>
+    <w:pPr>
+      <w:pStyle w:val="af1"/>
+    </w:pPr>
+  </w:p>
+</w:ftr>
 </file>
 
 <file path=word/footnotes.xml><?xml version="1.0" encoding="utf-8"?>

</xml_diff>